<commit_message>
2026-07-31 16:31:18: Actualización de presentación y guion con diapositivas de metodología
</commit_message>
<xml_diff>
--- a/guion-examen-candidatura.docx
+++ b/guion-examen-candidatura.docx
@@ -2610,7 +2610,7 @@
     </w:p>
     <w:bookmarkEnd w:id="40"/>
     <w:bookmarkEnd w:id="41"/>
-    <w:bookmarkStart w:id="44" w:name="sección-5-métodos"/>
+    <w:bookmarkStart w:id="52" w:name="sección-5-métodos"/>
     <w:p>
       <w:pPr>
         <w:pStyle w:val="Heading1"/>
@@ -2937,6 +2937,27 @@
         <w:pStyle w:val="BlockText"/>
       </w:pPr>
       <w:r>
+        <w:t xml:space="preserve">Es importante destacar que llegar al pipeline final</w:t>
+      </w:r>
+      <w:r>
+        <w:t xml:space="preserve"> </w:t>
+      </w:r>
+      <w:r>
+        <w:rPr>
+          <w:b/>
+          <w:bCs/>
+        </w:rPr>
+        <w:t xml:space="preserve">no fue un logro de la noche a la mañana</w:t>
+      </w:r>
+      <w:r>
+        <w:t xml:space="preserve">. Existió una curva de aprendizaje importante y un proceso iterativo de prueba y error.</w:t>
+      </w:r>
+    </w:p>
+    <w:p>
+      <w:pPr>
+        <w:pStyle w:val="BlockText"/>
+      </w:pPr>
+      <w:r>
         <w:t xml:space="preserve">En el</w:t>
       </w:r>
       <w:r>
@@ -2950,10 +2971,7 @@
         <w:t xml:space="preserve">Semestre 1</w:t>
       </w:r>
       <w:r>
-        <w:t xml:space="preserve"> </w:t>
-      </w:r>
-      <w:r>
-        <w:t xml:space="preserve">— que ya se completó — trabajamos con el chip GSAv2 no imputado, solo el cromosoma 22, y tres rasgos piloto: estatura, IMC y logro educativo. Esto sirvió para validar el pipeline con datos de pares de hermanos y tríos.</w:t>
+        <w:t xml:space="preserve">, los intentos iniciales y errores procesando el cromosoma 22 y 3 rasgos fueron fundamentales para ajustar las tuercas de los modelos.</w:t>
       </w:r>
     </w:p>
     <w:p>
@@ -2977,7 +2995,7 @@
         <w:t xml:space="preserve"> </w:t>
       </w:r>
       <w:r>
-        <w:t xml:space="preserve">— también completado — escalamos a datos imputados con TOPMed, los 22 autosomas, y 13 rasgos. Aquí es donde establecimos la inferencia de IBD y la imputación mendeliana a escala genómica.</w:t>
+        <w:t xml:space="preserve">escalamos a datos imputados con TOPMed y establecimos la imputación mendeliana a escala genómica.</w:t>
       </w:r>
     </w:p>
     <w:p>
@@ -3001,7 +3019,7 @@
         <w:t xml:space="preserve"> </w:t>
       </w:r>
       <w:r>
-        <w:t xml:space="preserve">— actualmente en curso — incorporamos el GWAS poblacional con REGENIE, 17 rasgos, e implementamos el estimador robusto.</w:t>
+        <w:t xml:space="preserve">incorporamos el GWAS poblacional e implementamos el estimador robusto.</w:t>
       </w:r>
     </w:p>
     <w:p>
@@ -3025,7 +3043,21 @@
         <w:t xml:space="preserve"> </w:t>
       </w:r>
       <w:r>
-        <w:t xml:space="preserve">completaremos el atlas con 28 rasgos,</w:t>
+        <w:t xml:space="preserve">completaremos el atlas con 28 rasgos y el análisis completo.</w:t>
+      </w:r>
+      <w:r>
+        <w:t xml:space="preserve"> </w:t>
+      </w:r>
+      <w:r>
+        <w:t xml:space="preserve">Esta progresión nos permitió validar cada etapa antes de escalar a genoma completo.</w:t>
+      </w:r>
+    </w:p>
+    <w:p>
+      <w:pPr>
+        <w:pStyle w:val="FirstParagraph"/>
+      </w:pPr>
+      <w:r>
+        <w:t xml:space="preserve">⏱️</w:t>
       </w:r>
       <w:r>
         <w:t xml:space="preserve"> </w:t>
@@ -3035,39 +3067,7 @@
           <w:i/>
           <w:iCs/>
         </w:rPr>
-        <w:t xml:space="preserve">fine-mapping</w:t>
-      </w:r>
-      <w:r>
-        <w:t xml:space="preserve"> </w:t>
-      </w:r>
-      <w:r>
-        <w:t xml:space="preserve">funcional, y el análisis completo de correlaciones genéticas y heredabilidad.</w:t>
-      </w:r>
-    </w:p>
-    <w:p>
-      <w:pPr>
-        <w:pStyle w:val="BlockText"/>
-      </w:pPr>
-      <w:r>
-        <w:t xml:space="preserve">Cada semestre construye sobre el anterior, permitiendo validación progresiva antes de escalar.</w:t>
-      </w:r>
-    </w:p>
-    <w:p>
-      <w:pPr>
-        <w:pStyle w:val="FirstParagraph"/>
-      </w:pPr>
-      <w:r>
-        <w:t xml:space="preserve">⏱️</w:t>
-      </w:r>
-      <w:r>
-        <w:t xml:space="preserve"> </w:t>
-      </w:r>
-      <w:r>
-        <w:rPr>
-          <w:i/>
-          <w:iCs/>
-        </w:rPr>
-        <w:t xml:space="preserve">~1 minuto 15 segundos</w:t>
+        <w:t xml:space="preserve">~1 minuto 20 segundos</w:t>
       </w:r>
     </w:p>
     <w:p>
@@ -3078,14 +3078,19 @@
       </w:r>
     </w:p>
     <w:bookmarkEnd w:id="43"/>
-    <w:bookmarkEnd w:id="44"/>
-    <w:bookmarkStart w:id="49" w:name="sección-6-resultados"/>
-    <w:p>
-      <w:pPr>
-        <w:pStyle w:val="Heading1"/>
-      </w:pPr>
-      <w:r>
-        <w:t xml:space="preserve">SECCIÓN 6 — RESULTADOS</w:t>
+    <w:bookmarkStart w:id="44" w:name="slide-19-datos-de-entrada-fenotipos"/>
+    <w:p>
+      <w:pPr>
+        <w:pStyle w:val="Heading2"/>
+      </w:pPr>
+      <w:r>
+        <w:t xml:space="preserve">SLIDE 19 —</w:t>
+      </w:r>
+      <w:r>
+        <w:t xml:space="preserve"> </w:t>
+      </w:r>
+      <w:r>
+        <w:t xml:space="preserve">“Datos de entrada: Fenotipos”</w:t>
       </w:r>
     </w:p>
     <w:p>
@@ -3097,28 +3102,39 @@
           <w:b/>
           <w:bCs/>
         </w:rPr>
-        <w:t xml:space="preserve">[Estado]:</w:t>
-      </w:r>
-      <w:r>
-        <w:t xml:space="preserve"> </w:t>
-      </w:r>
-      <w:r>
-        <w:t xml:space="preserve">No hay slides activas de resultados en la presentación actual. A continuación se propone el contenido basado en los reportes de resultados 2027-01.</w:t>
-      </w:r>
-    </w:p>
-    <w:bookmarkStart w:id="45" w:name="X67302c64f459df13203e02a50a52be74b7e2220"/>
-    <w:p>
-      <w:pPr>
-        <w:pStyle w:val="Heading2"/>
-      </w:pPr>
-      <w:r>
-        <w:t xml:space="preserve">SLIDE 19 —</w:t>
-      </w:r>
-      <w:r>
-        <w:t xml:space="preserve"> </w:t>
-      </w:r>
-      <w:r>
-        <w:t xml:space="preserve">“El estimador robusto aumenta el poder estadístico en un 37%”</w:t>
+        <w:t xml:space="preserve">[Contenido visual]:</w:t>
+      </w:r>
+      <w:r>
+        <w:t xml:space="preserve"> </w:t>
+      </w:r>
+      <w:r>
+        <w:t xml:space="preserve">Listas de rasgos conductuales y biomédicos procesados, con diagrama de flujo de scripts.</w:t>
+      </w:r>
+    </w:p>
+    <w:p>
+      <w:pPr>
+        <w:pStyle w:val="BodyText"/>
+      </w:pPr>
+      <w:r>
+        <w:rPr>
+          <w:b/>
+          <w:bCs/>
+        </w:rPr>
+        <w:t xml:space="preserve">Guion:</w:t>
+      </w:r>
+    </w:p>
+    <w:p>
+      <w:pPr>
+        <w:pStyle w:val="BlockText"/>
+      </w:pPr>
+      <w:r>
+        <w:t xml:space="preserve">Pasando al flujo de los datos, comenzamos con nuestra materia prima: los fenotipos. Estandarizamos y pre-procesamos múltiples rasgos categorizados en conductuales y biomédicos, incluyendo logro educativo, índice de masa corporal, lípidos y diabetes.</w:t>
+      </w:r>
+      <w:r>
+        <w:t xml:space="preserve"> </w:t>
+      </w:r>
+      <w:r>
+        <w:t xml:space="preserve">Esta curación asegura que nuestros rasgos y covariables estén homogeneizados para comparaciones justas.</w:t>
       </w:r>
     </w:p>
     <w:p>
@@ -3126,117 +3142,17 @@
         <w:pStyle w:val="FirstParagraph"/>
       </w:pPr>
       <w:r>
-        <w:rPr>
-          <w:b/>
-          <w:bCs/>
-        </w:rPr>
-        <w:t xml:space="preserve">[Contenido visual sugerido]:</w:t>
-      </w:r>
-      <w:r>
-        <w:t xml:space="preserve"> </w:t>
-      </w:r>
-      <w:r>
-        <w:t xml:space="preserve">Boxplot de N</w:t>
-      </w:r>
-      <w:r>
-        <w:rPr>
-          <w:vertAlign w:val="subscript"/>
-        </w:rPr>
-        <w:t xml:space="preserve">eff</w:t>
-      </w:r>
-      <w:r>
-        <w:t xml:space="preserve"> </w:t>
-      </w:r>
-      <w:r>
-        <w:t xml:space="preserve">comparando estimador robusto vs sib-pair/trios (ya generados en semestre 2026-02).</w:t>
-      </w:r>
-    </w:p>
-    <w:p>
-      <w:pPr>
-        <w:pStyle w:val="BodyText"/>
-      </w:pPr>
-      <w:r>
-        <w:rPr>
-          <w:b/>
-          <w:bCs/>
-        </w:rPr>
-        <w:t xml:space="preserve">Guion:</w:t>
-      </w:r>
-    </w:p>
-    <w:p>
-      <w:pPr>
-        <w:pStyle w:val="BlockText"/>
-      </w:pPr>
-      <w:r>
-        <w:t xml:space="preserve">Nuestro primer resultado clave: el estimador robusto de SNIPAR logra un aumento promedio del</w:t>
-      </w:r>
-      <w:r>
-        <w:t xml:space="preserve"> </w:t>
-      </w:r>
-      <w:r>
-        <w:rPr>
-          <w:b/>
-          <w:bCs/>
-        </w:rPr>
-        <w:t xml:space="preserve">36.85% ± 6.78%</w:t>
-      </w:r>
-      <w:r>
-        <w:t xml:space="preserve"> </w:t>
-      </w:r>
-      <w:r>
-        <w:t xml:space="preserve">en el tamaño efectivo de muestra (</w:t>
+        <w:t xml:space="preserve">⏱️</w:t>
+      </w:r>
+      <w:r>
+        <w:t xml:space="preserve"> </w:t>
       </w:r>
       <w:r>
         <w:rPr>
           <w:i/>
           <w:iCs/>
         </w:rPr>
-        <w:t xml:space="preserve">N</w:t>
-      </w:r>
-      <w:r>
-        <w:rPr>
-          <w:i/>
-          <w:iCs/>
-          <w:vertAlign w:val="subscript"/>
-        </w:rPr>
-        <w:t xml:space="preserve">eff</w:t>
-      </w:r>
-      <w:r>
-        <w:t xml:space="preserve">) comparado con el meta-análisis clásico de pares de hermanos y tríos.</w:t>
-      </w:r>
-    </w:p>
-    <w:p>
-      <w:pPr>
-        <w:pStyle w:val="BlockText"/>
-      </w:pPr>
-      <w:r>
-        <w:t xml:space="preserve">Este aumento oscila entre un 21.6% y un 47.8% dependiendo del rasgo. Para contexto, en biobancos europeos el aumento reportado fue de 10–21%.</w:t>
-      </w:r>
-    </w:p>
-    <w:p>
-      <w:pPr>
-        <w:pStyle w:val="BlockText"/>
-      </w:pPr>
-      <w:r>
-        <w:t xml:space="preserve">¿Por qué es mayor en MCPS que en biobancos europeos? Por el diseño de reclutamiento. La cohorte se reclutó barrio por barrio en la Ciudad de México, lo que capturó familias extensas de forma natural. El 71% de los participantes tiene al menos un pariente de tercer grado en la cohorte — el estimador robusto tiene mucha más estructura familiar que explotar.</w:t>
-      </w:r>
-    </w:p>
-    <w:p>
-      <w:pPr>
-        <w:pStyle w:val="FirstParagraph"/>
-      </w:pPr>
-      <w:r>
-        <w:t xml:space="preserve">⏱️</w:t>
-      </w:r>
-      <w:r>
-        <w:t xml:space="preserve"> </w:t>
-      </w:r>
-      <w:r>
-        <w:rPr>
-          <w:i/>
-          <w:iCs/>
-        </w:rPr>
-        <w:t xml:space="preserve">~1 minuto</w:t>
+        <w:t xml:space="preserve">~45 segundos</w:t>
       </w:r>
     </w:p>
     <w:p>
@@ -3246,8 +3162,8 @@
         </w:pict>
       </w:r>
     </w:p>
-    <w:bookmarkEnd w:id="45"/>
-    <w:bookmarkStart w:id="46" w:name="Xb863bb926aba0f7dce4c1df37ea31b187fcbdd9"/>
+    <w:bookmarkEnd w:id="44"/>
+    <w:bookmarkStart w:id="45" w:name="slide-20-datos-de-entrada-genotipos"/>
     <w:p>
       <w:pPr>
         <w:pStyle w:val="Heading2"/>
@@ -3259,7 +3175,7 @@
         <w:t xml:space="preserve"> </w:t>
       </w:r>
       <w:r>
-        <w:t xml:space="preserve">“Espectro de heredabilidad: directa vs poblacional en 15 rasgos”</w:t>
+        <w:t xml:space="preserve">“Datos de entrada: Genotipos”</w:t>
       </w:r>
     </w:p>
     <w:p>
@@ -3271,7 +3187,47 @@
           <w:b/>
           <w:bCs/>
         </w:rPr>
-        <w:t xml:space="preserve">[Contenido visual sugerido]:</w:t>
+        <w:t xml:space="preserve">[Contenido visual]:</w:t>
+      </w:r>
+      <w:r>
+        <w:t xml:space="preserve"> </w:t>
+      </w:r>
+      <w:r>
+        <w:t xml:space="preserve">Detalles del control de calidad de genotipos, filtros y proceso de Phased a BGEN.</w:t>
+      </w:r>
+    </w:p>
+    <w:p>
+      <w:pPr>
+        <w:pStyle w:val="BodyText"/>
+      </w:pPr>
+      <w:r>
+        <w:rPr>
+          <w:b/>
+          <w:bCs/>
+        </w:rPr>
+        <w:t xml:space="preserve">Guion:</w:t>
+      </w:r>
+    </w:p>
+    <w:p>
+      <w:pPr>
+        <w:pStyle w:val="BlockText"/>
+      </w:pPr>
+      <w:r>
+        <w:t xml:space="preserve">Para completar las entradas del sistema, procesamos los genotipos. Partimos de datos previamente faseados para el chip GSAv2 y la imputación con TOPMed.</w:t>
+      </w:r>
+      <w:r>
+        <w:t xml:space="preserve"> </w:t>
+      </w:r>
+      <w:r>
+        <w:t xml:space="preserve">Aplicamos estrictos controles de calidad, como requerir un puntaje INFO mayor a 0.99, porque los modelos familiares son sumamente sensibles a errores de genotipado.</w:t>
+      </w:r>
+    </w:p>
+    <w:p>
+      <w:pPr>
+        <w:pStyle w:val="FirstParagraph"/>
+      </w:pPr>
+      <w:r>
+        <w:t xml:space="preserve">⏱️</w:t>
       </w:r>
       <w:r>
         <w:t xml:space="preserve"> </w:t>
@@ -3281,228 +3237,7 @@
           <w:i/>
           <w:iCs/>
         </w:rPr>
-        <w:t xml:space="preserve">Dumbbell plot</w:t>
-      </w:r>
-      <w:r>
-        <w:t xml:space="preserve"> </w:t>
-      </w:r>
-      <w:r>
-        <w:t xml:space="preserve">+</w:t>
-      </w:r>
-      <w:r>
-        <w:t xml:space="preserve"> </w:t>
-      </w:r>
-      <w:r>
-        <w:rPr>
-          <w:i/>
-          <w:iCs/>
-        </w:rPr>
-        <w:t xml:space="preserve">forest plot</w:t>
-      </w:r>
-      <w:r>
-        <w:t xml:space="preserve"> </w:t>
-      </w:r>
-      <w:r>
-        <w:t xml:space="preserve">mostrando h²</w:t>
-      </w:r>
-      <w:r>
-        <w:rPr>
-          <w:vertAlign w:val="subscript"/>
-        </w:rPr>
-        <w:t xml:space="preserve">direct</w:t>
-      </w:r>
-      <w:r>
-        <w:t xml:space="preserve"> </w:t>
-      </w:r>
-      <w:r>
-        <w:t xml:space="preserve">vs h²</w:t>
-      </w:r>
-      <w:r>
-        <w:rPr>
-          <w:vertAlign w:val="subscript"/>
-        </w:rPr>
-        <w:t xml:space="preserve">pop</w:t>
-      </w:r>
-      <w:r>
-        <w:t xml:space="preserve"> </w:t>
-      </w:r>
-      <w:r>
-        <w:t xml:space="preserve">para los 15 rasgos.</w:t>
-      </w:r>
-    </w:p>
-    <w:p>
-      <w:pPr>
-        <w:pStyle w:val="BodyText"/>
-      </w:pPr>
-      <w:r>
-        <w:rPr>
-          <w:b/>
-          <w:bCs/>
-        </w:rPr>
-        <w:t xml:space="preserve">Guion:</w:t>
-      </w:r>
-    </w:p>
-    <w:p>
-      <w:pPr>
-        <w:pStyle w:val="BlockText"/>
-      </w:pPr>
-      <w:r>
-        <w:t xml:space="preserve">Aquí está el resultado central del proyecto hasta ahora: la comparación de heredabilidad directa — estimada por diseño familiar — contra heredabilidad poblacional — estimada por análisis estándar — para 15 rasgos complejos.</w:t>
-      </w:r>
-    </w:p>
-    <w:p>
-      <w:pPr>
-        <w:pStyle w:val="BlockText"/>
-      </w:pPr>
-      <w:r>
-        <w:t xml:space="preserve">Los resultados se organizan en cuatro categorías:</w:t>
-      </w:r>
-    </w:p>
-    <w:p>
-      <w:pPr>
-        <w:pStyle w:val="BlockText"/>
-      </w:pPr>
-      <w:r>
-        <w:rPr>
-          <w:b/>
-          <w:bCs/>
-        </w:rPr>
-        <w:t xml:space="preserve">Primero, rasgos socialmente mediados con atenuación fuerte.</w:t>
-      </w:r>
-      <w:r>
-        <w:t xml:space="preserve"> </w:t>
-      </w:r>
-      <w:r>
-        <w:t xml:space="preserve">El logro educativo muestra una atenuación del</w:t>
-      </w:r>
-      <w:r>
-        <w:t xml:space="preserve"> </w:t>
-      </w:r>
-      <w:r>
-        <w:rPr>
-          <w:b/>
-          <w:bCs/>
-        </w:rPr>
-        <w:t xml:space="preserve">85%</w:t>
-      </w:r>
-      <w:r>
-        <w:t xml:space="preserve"> </w:t>
-      </w:r>
-      <w:r>
-        <w:t xml:space="preserve">— su heredabilidad directa es apenas el 15% de la poblacional. Esto significa que la mayor parte de lo que un GWAS estándar atribuye a</w:t>
-      </w:r>
-      <w:r>
-        <w:t xml:space="preserve"> </w:t>
-      </w:r>
-      <w:r>
-        <w:t xml:space="preserve">“genética de la educación”</w:t>
-      </w:r>
-      <w:r>
-        <w:t xml:space="preserve"> </w:t>
-      </w:r>
-      <w:r>
-        <w:t xml:space="preserve">en realidad refleja el ambiente familiar y el apareamiento selectivo — no biología directa. La estatura muestra un 32% de atenuación, consistente con el apareamiento selectivo bien documentado para este rasgo.</w:t>
-      </w:r>
-    </w:p>
-    <w:p>
-      <w:pPr>
-        <w:pStyle w:val="BlockText"/>
-      </w:pPr>
-      <w:r>
-        <w:rPr>
-          <w:b/>
-          <w:bCs/>
-        </w:rPr>
-        <w:t xml:space="preserve">Segundo, rasgos biológicos con atenuación mínima.</w:t>
-      </w:r>
-      <w:r>
-        <w:t xml:space="preserve"> </w:t>
-      </w:r>
-      <w:r>
-        <w:t xml:space="preserve">IMC, presión arterial, y los biomarcadores lipídicos muestran ratios cercanos a 1.0. Esto es una</w:t>
-      </w:r>
-      <w:r>
-        <w:t xml:space="preserve"> </w:t>
-      </w:r>
-      <w:r>
-        <w:rPr>
-          <w:b/>
-          <w:bCs/>
-        </w:rPr>
-        <w:t xml:space="preserve">buena noticia</w:t>
-      </w:r>
-      <w:r>
-        <w:t xml:space="preserve">: significa que los estudios estándar para estos rasgos capturan efectos genuinamente directos, y que los instrumentos de aleatorización mendeliana para estas exposiciones son probablemente válidos.</w:t>
-      </w:r>
-    </w:p>
-    <w:p>
-      <w:pPr>
-        <w:pStyle w:val="BlockText"/>
-      </w:pPr>
-      <w:r>
-        <w:rPr>
-          <w:b/>
-          <w:bCs/>
-        </w:rPr>
-        <w:t xml:space="preserve">Tercero, y lo más interesante: las reversiones.</w:t>
-      </w:r>
-      <w:r>
-        <w:t xml:space="preserve"> </w:t>
-      </w:r>
-      <w:r>
-        <w:t xml:space="preserve">La diabetes tipo 2 y el colesterol HDL muestran heredabilidad directa</w:t>
-      </w:r>
-      <w:r>
-        <w:t xml:space="preserve"> </w:t>
-      </w:r>
-      <w:r>
-        <w:rPr>
-          <w:b/>
-          <w:bCs/>
-        </w:rPr>
-        <w:t xml:space="preserve">mayor</w:t>
-      </w:r>
-      <w:r>
-        <w:t xml:space="preserve"> </w:t>
-      </w:r>
-      <w:r>
-        <w:t xml:space="preserve">que la poblacional — un +38% y +63% respectivamente.</w:t>
-      </w:r>
-    </w:p>
-    <w:p>
-      <w:pPr>
-        <w:pStyle w:val="BlockText"/>
-      </w:pPr>
-      <w:r>
-        <w:rPr>
-          <w:b/>
-          <w:bCs/>
-        </w:rPr>
-        <w:t xml:space="preserve">Y cuarto,</w:t>
-      </w:r>
-      <w:r>
-        <w:t xml:space="preserve"> </w:t>
-      </w:r>
-      <w:r>
-        <w:t xml:space="preserve">los rasgos conductuales — tabaquismo y alcohol — que tienen heredabilidad cercana a cero con errores estándar grandes, reflejando limitaciones de medición.</w:t>
-      </w:r>
-    </w:p>
-    <w:p>
-      <w:pPr>
-        <w:pStyle w:val="FirstParagraph"/>
-      </w:pPr>
-      <w:r>
-        <w:t xml:space="preserve">⏱️</w:t>
-      </w:r>
-      <w:r>
-        <w:t xml:space="preserve"> </w:t>
-      </w:r>
-      <w:r>
-        <w:rPr>
-          <w:i/>
-          <w:iCs/>
-        </w:rPr>
-        <w:t xml:space="preserve">~2 minutos</w:t>
+        <w:t xml:space="preserve">~45 segundos</w:t>
       </w:r>
     </w:p>
     <w:p>
@@ -3512,8 +3247,8 @@
         </w:pict>
       </w:r>
     </w:p>
-    <w:bookmarkEnd w:id="46"/>
-    <w:bookmarkStart w:id="47" w:name="Xd6f97a6b6517ccc9c903696e2af66aab3144d39"/>
+    <w:bookmarkEnd w:id="45"/>
+    <w:bookmarkStart w:id="46" w:name="slide-21-selección-de-cohortes"/>
     <w:p>
       <w:pPr>
         <w:pStyle w:val="Heading2"/>
@@ -3525,28 +3260,7 @@
         <w:t xml:space="preserve"> </w:t>
       </w:r>
       <w:r>
-        <w:t xml:space="preserve">“La reversión de la diabetes: ¿por qué h²</w:t>
-      </w:r>
-      <w:r>
-        <w:rPr>
-          <w:vertAlign w:val="subscript"/>
-        </w:rPr>
-        <w:t xml:space="preserve">direct</w:t>
-      </w:r>
-      <w:r>
-        <w:t xml:space="preserve"> </w:t>
-      </w:r>
-      <w:r>
-        <w:t xml:space="preserve">&gt; h²</w:t>
-      </w:r>
-      <w:r>
-        <w:rPr>
-          <w:vertAlign w:val="subscript"/>
-        </w:rPr>
-        <w:t xml:space="preserve">pop</w:t>
-      </w:r>
-      <w:r>
-        <w:t xml:space="preserve">?”</w:t>
+        <w:t xml:space="preserve">“Selección de cohortes”</w:t>
       </w:r>
     </w:p>
     <w:p>
@@ -3558,13 +3272,13 @@
           <w:b/>
           <w:bCs/>
         </w:rPr>
-        <w:t xml:space="preserve">[Contenido visual sugerido]:</w:t>
-      </w:r>
-      <w:r>
-        <w:t xml:space="preserve"> </w:t>
-      </w:r>
-      <w:r>
-        <w:t xml:space="preserve">Diagrama explicativo con los 3 mecanismos (estratificación, sesgo de supervivencia, correlación ancestría-fenotipo).</w:t>
+        <w:t xml:space="preserve">[Contenido visual]:</w:t>
+      </w:r>
+      <w:r>
+        <w:t xml:space="preserve"> </w:t>
+      </w:r>
+      <w:r>
+        <w:t xml:space="preserve">Diagrama de flujo mostrando la partición de la cohorte completa en individuos emparentados y no emparentados usando KING.</w:t>
       </w:r>
     </w:p>
     <w:p>
@@ -3584,59 +3298,67 @@
         <w:pStyle w:val="BlockText"/>
       </w:pPr>
       <w:r>
-        <w:t xml:space="preserve">La observación de que la heredabilidad directa de la diabetes sea mayor que la poblacional es inusual y requiere interpretación cuidadosa. Identificamos tres mecanismos que contribuyen:</w:t>
-      </w:r>
-    </w:p>
-    <w:p>
-      <w:pPr>
-        <w:pStyle w:val="BlockText"/>
-      </w:pPr>
-      <w:r>
-        <w:rPr>
-          <w:b/>
-          <w:bCs/>
-        </w:rPr>
-        <w:t xml:space="preserve">Primero, sobrecorrección por estratificación.</w:t>
-      </w:r>
-      <w:r>
-        <w:t xml:space="preserve"> </w:t>
-      </w:r>
-      <w:r>
-        <w:t xml:space="preserve">Sabemos que la arquitectura genética de la diabetes en México tiene un componente fuertemente enriquecido en segmentos de ancestría indígena americana — 12 de 15 variantes de riesgo novedosas están en estos fondos ancestrales. Cuando ajustamos por componentes principales,</w:t>
-      </w:r>
-      <w:r>
-        <w:t xml:space="preserve"> </w:t>
-      </w:r>
-      <w:r>
-        <w:rPr>
-          <w:b/>
-          <w:bCs/>
-        </w:rPr>
-        <w:t xml:space="preserve">corregimos la estratificación, pero también removemos parte de la señal biológica</w:t>
-      </w:r>
-      <w:r>
-        <w:t xml:space="preserve"> </w:t>
-      </w:r>
-      <w:r>
-        <w:t xml:space="preserve">que correlaciona con ancestría indígena. Esto deflacta la heredabilidad poblacional.</w:t>
-      </w:r>
-    </w:p>
-    <w:p>
-      <w:pPr>
-        <w:pStyle w:val="BlockText"/>
-      </w:pPr>
-      <w:r>
-        <w:rPr>
-          <w:b/>
-          <w:bCs/>
-        </w:rPr>
-        <w:t xml:space="preserve">Segundo, un sesgo de supervivencia.</w:t>
-      </w:r>
-      <w:r>
-        <w:t xml:space="preserve"> </w:t>
-      </w:r>
-      <w:r>
-        <w:t xml:space="preserve">La muestra familiar es 1.7 años mayor en promedio. Como la diabetes duplica la mortalidad antes de los 60 años en México, los participantes mayores son</w:t>
+        <w:t xml:space="preserve">Una vez que tenemos los datos limpios, procedemos a dividirlos.</w:t>
+      </w:r>
+      <w:r>
+        <w:t xml:space="preserve"> </w:t>
+      </w:r>
+      <w:r>
+        <w:t xml:space="preserve">Usando KING para inferencia de parentesco, separamos la muestra en un grupo puramente</w:t>
+      </w:r>
+      <w:r>
+        <w:t xml:space="preserve"> </w:t>
+      </w:r>
+      <w:r>
+        <w:t xml:space="preserve">“no emparentado”</w:t>
+      </w:r>
+      <w:r>
+        <w:t xml:space="preserve"> </w:t>
+      </w:r>
+      <w:r>
+        <w:t xml:space="preserve">para el GWAS poblacional, y otro grupo con</w:t>
+      </w:r>
+      <w:r>
+        <w:t xml:space="preserve"> </w:t>
+      </w:r>
+      <w:r>
+        <w:t xml:space="preserve">“redes familiares”</w:t>
+      </w:r>
+      <w:r>
+        <w:t xml:space="preserve"> </w:t>
+      </w:r>
+      <w:r>
+        <w:t xml:space="preserve">para el análisis familiar (FGWAS).</w:t>
+      </w:r>
+      <w:r>
+        <w:t xml:space="preserve"> </w:t>
+      </w:r>
+      <w:r>
+        <w:t xml:space="preserve">Es fundamental que ambos grupos sean</w:t>
+      </w:r>
+      <w:r>
+        <w:t xml:space="preserve"> </w:t>
+      </w:r>
+      <w:r>
+        <w:rPr>
+          <w:b/>
+          <w:bCs/>
+        </w:rPr>
+        <w:t xml:space="preserve">estadísticamente independientes</w:t>
+      </w:r>
+      <w:r>
+        <w:t xml:space="preserve"> </w:t>
+      </w:r>
+      <w:r>
+        <w:t xml:space="preserve">para poder comparar posteriormente los estimadores de forma justa.</w:t>
+      </w:r>
+    </w:p>
+    <w:p>
+      <w:pPr>
+        <w:pStyle w:val="FirstParagraph"/>
+      </w:pPr>
+      <w:r>
+        <w:t xml:space="preserve">⏱️</w:t>
       </w:r>
       <w:r>
         <w:t xml:space="preserve"> </w:t>
@@ -3646,89 +3368,7 @@
           <w:i/>
           <w:iCs/>
         </w:rPr>
-        <w:t xml:space="preserve">sobrevivientes</w:t>
-      </w:r>
-      <w:r>
-        <w:t xml:space="preserve"> </w:t>
-      </w:r>
-      <w:r>
-        <w:t xml:space="preserve">— empobrecidos en variantes de alto riesgo. Y aun así, la heredabilidad directa es mayor, lo cual</w:t>
-      </w:r>
-      <w:r>
-        <w:t xml:space="preserve"> </w:t>
-      </w:r>
-      <w:r>
-        <w:rPr>
-          <w:b/>
-          <w:bCs/>
-        </w:rPr>
-        <w:t xml:space="preserve">refuerza</w:t>
-      </w:r>
-      <w:r>
-        <w:t xml:space="preserve"> </w:t>
-      </w:r>
-      <w:r>
-        <w:t xml:space="preserve">la conclusión de que la deflación poblacional es el factor dominante.</w:t>
-      </w:r>
-    </w:p>
-    <w:p>
-      <w:pPr>
-        <w:pStyle w:val="BlockText"/>
-      </w:pPr>
-      <w:r>
-        <w:rPr>
-          <w:b/>
-          <w:bCs/>
-        </w:rPr>
-        <w:t xml:space="preserve">Tercero, la correlación ancestría-fenotipo.</w:t>
-      </w:r>
-      <w:r>
-        <w:t xml:space="preserve"> </w:t>
-      </w:r>
-      <w:r>
-        <w:t xml:space="preserve">La ancestría indígena americana correlaciona con riesgo de diabetes a través de vías genéticas</w:t>
-      </w:r>
-      <w:r>
-        <w:t xml:space="preserve"> </w:t>
-      </w:r>
-      <w:r>
-        <w:rPr>
-          <w:i/>
-          <w:iCs/>
-        </w:rPr>
-        <w:t xml:space="preserve">y</w:t>
-      </w:r>
-      <w:r>
-        <w:t xml:space="preserve"> </w:t>
-      </w:r>
-      <w:r>
-        <w:t xml:space="preserve">no genéticas — la transición nutricional, el nivel socioeconómico, el acceso a salud.</w:t>
-      </w:r>
-    </w:p>
-    <w:p>
-      <w:pPr>
-        <w:pStyle w:val="BlockText"/>
-      </w:pPr>
-      <w:r>
-        <w:t xml:space="preserve">En conjunto, esto demuestra por qué necesitamos diseños familiares en poblaciones admixtas: los métodos estándar distorsionan los resultados en ambas direcciones.</w:t>
-      </w:r>
-    </w:p>
-    <w:p>
-      <w:pPr>
-        <w:pStyle w:val="FirstParagraph"/>
-      </w:pPr>
-      <w:r>
-        <w:t xml:space="preserve">⏱️</w:t>
-      </w:r>
-      <w:r>
-        <w:t xml:space="preserve"> </w:t>
-      </w:r>
-      <w:r>
-        <w:rPr>
-          <w:i/>
-          <w:iCs/>
-        </w:rPr>
-        <w:t xml:space="preserve">~1 minuto 30 segundos</w:t>
+        <w:t xml:space="preserve">~45 segundos</w:t>
       </w:r>
     </w:p>
     <w:p>
@@ -3738,20 +3378,20 @@
         </w:pict>
       </w:r>
     </w:p>
-    <w:bookmarkEnd w:id="47"/>
-    <w:bookmarkStart w:id="48" w:name="X543484c6c7c31efa875a7a92ba3029e5ddca6da"/>
+    <w:bookmarkEnd w:id="46"/>
+    <w:bookmarkStart w:id="47" w:name="X29f13536a833c7e608bd75aa96dba7805187859"/>
     <w:p>
       <w:pPr>
         <w:pStyle w:val="Heading2"/>
       </w:pPr>
       <w:r>
-        <w:t xml:space="preserve">SLIDE 22 —</w:t>
-      </w:r>
-      <w:r>
-        <w:t xml:space="preserve"> </w:t>
-      </w:r>
-      <w:r>
-        <w:t xml:space="preserve">“Evaluación de sesgos: muestra familiar vs. no emparentados”</w:t>
+        <w:t xml:space="preserve">SLIDE 23 —</w:t>
+      </w:r>
+      <w:r>
+        <w:t xml:space="preserve"> </w:t>
+      </w:r>
+      <w:r>
+        <w:t xml:space="preserve">“Flujo de trabajo de SNIPAR (Estimador Robusto)”</w:t>
       </w:r>
     </w:p>
     <w:p>
@@ -3763,13 +3403,13 @@
           <w:b/>
           <w:bCs/>
         </w:rPr>
-        <w:t xml:space="preserve">[Contenido visual sugerido]:</w:t>
-      </w:r>
-      <w:r>
-        <w:t xml:space="preserve"> </w:t>
-      </w:r>
-      <w:r>
-        <w:t xml:space="preserve">Tabla de SMDs con variables flaggeadas.</w:t>
+        <w:t xml:space="preserve">[Contenido visual]:</w:t>
+      </w:r>
+      <w:r>
+        <w:t xml:space="preserve"> </w:t>
+      </w:r>
+      <w:r>
+        <w:t xml:space="preserve">Diagrama de bloques del módulo SNIPAR en color rojo (IBD, Imputación, Estimador).</w:t>
       </w:r>
     </w:p>
     <w:p>
@@ -3789,52 +3429,19 @@
         <w:pStyle w:val="BlockText"/>
       </w:pPr>
       <w:r>
-        <w:t xml:space="preserve">Para respaldar estas interpretaciones, realizamos un análisis exhaustivo de</w:t>
-      </w:r>
-      <w:r>
-        <w:t xml:space="preserve"> </w:t>
-      </w:r>
-      <w:r>
-        <w:rPr>
-          <w:b/>
-          <w:bCs/>
-        </w:rPr>
-        <w:t xml:space="preserve">diferencias de medias estandarizadas</w:t>
-      </w:r>
-      <w:r>
-        <w:t xml:space="preserve"> </w:t>
-      </w:r>
-      <w:r>
-        <w:t xml:space="preserve">(SMD) entre las dos submuestras: los ~100,000 individuos en redes familiares y los ~29,000 no emparentados.</w:t>
-      </w:r>
-    </w:p>
-    <w:p>
-      <w:pPr>
-        <w:pStyle w:val="BlockText"/>
-      </w:pPr>
-      <w:r>
-        <w:t xml:space="preserve">Las variables flaggeadas son edad (+0.13), ingreso (−0.11), y ciertos PCs de ancestría. Notablemente, la demencia está ampliamente enriquecida en familias con un SMD de 0.69.</w:t>
-      </w:r>
-    </w:p>
-    <w:p>
-      <w:pPr>
-        <w:pStyle w:val="BlockText"/>
-      </w:pPr>
-      <w:r>
-        <w:t xml:space="preserve">Pero — y esto es clave — los rasgos que sustentan nuestros hallazgos principales: estatura, IMC, presión arterial, y lípidos, tienen</w:t>
-      </w:r>
-      <w:r>
-        <w:t xml:space="preserve"> </w:t>
-      </w:r>
-      <w:r>
-        <w:rPr>
-          <w:b/>
-          <w:bCs/>
-        </w:rPr>
-        <w:t xml:space="preserve">SMDs despreciables</w:t>
-      </w:r>
-      <w:r>
-        <w:t xml:space="preserve">, por debajo de 0.04. Esto nos da confianza en que las comparaciones de heredabilidad para rasgos cardiometabólicos son internamente válidas.</w:t>
+        <w:t xml:space="preserve">Finalmente, ¿qué le hacemos a la cohorte de individuos emparentados? Aquí utilizamos el módulo de SNIPAR.</w:t>
+      </w:r>
+      <w:r>
+        <w:t xml:space="preserve"> </w:t>
+      </w:r>
+      <w:r>
+        <w:t xml:space="preserve">Primero, inferimos los segmentos idénticos por descendencia (IBD) entre hermanos. Luego, usamos esa información para imputar los genotipos parentales faltantes.</w:t>
+      </w:r>
+      <w:r>
+        <w:t xml:space="preserve"> </w:t>
+      </w:r>
+      <w:r>
+        <w:t xml:space="preserve">Esta imputación Mendeliana es la clave que permite a nuestro estimador robusto aislar el efecto genético directo, eliminando por completo cualquier estratificación poblacional residual.</w:t>
       </w:r>
     </w:p>
     <w:p>
@@ -3862,18 +3469,8 @@
         </w:pict>
       </w:r>
     </w:p>
-    <w:bookmarkEnd w:id="48"/>
-    <w:bookmarkEnd w:id="49"/>
-    <w:bookmarkStart w:id="53" w:name="sección-7-conclusiones-y-próximos-pasos"/>
-    <w:p>
-      <w:pPr>
-        <w:pStyle w:val="Heading1"/>
-      </w:pPr>
-      <w:r>
-        <w:t xml:space="preserve">SECCIÓN 7 — CONCLUSIONES Y PRÓXIMOS PASOS</w:t>
-      </w:r>
-    </w:p>
-    <w:bookmarkStart w:id="50" w:name="slide-23-qué-aprendimos"/>
+    <w:bookmarkEnd w:id="47"/>
+    <w:bookmarkStart w:id="48" w:name="slide-23-tamaños-efectivos-de-muestra"/>
     <w:p>
       <w:pPr>
         <w:pStyle w:val="Heading2"/>
@@ -3885,7 +3482,7 @@
         <w:t xml:space="preserve"> </w:t>
       </w:r>
       <w:r>
-        <w:t xml:space="preserve">“¿Qué aprendimos?”</w:t>
+        <w:t xml:space="preserve">“Tamaños Efectivos de Muestra”</w:t>
       </w:r>
     </w:p>
     <w:p>
@@ -3897,6 +3494,24 @@
           <w:b/>
           <w:bCs/>
         </w:rPr>
+        <w:t xml:space="preserve">[Contenido visual]:</w:t>
+      </w:r>
+      <w:r>
+        <w:t xml:space="preserve"> </w:t>
+      </w:r>
+      <w:r>
+        <w:t xml:space="preserve">Gráfica comparando tamaños efectivos de muestra entre estimador robusto vs. pares de hermanos y tríos parentales.</w:t>
+      </w:r>
+    </w:p>
+    <w:p>
+      <w:pPr>
+        <w:pStyle w:val="BodyText"/>
+      </w:pPr>
+      <w:r>
+        <w:rPr>
+          <w:b/>
+          <w:bCs/>
+        </w:rPr>
         <w:t xml:space="preserve">Guion:</w:t>
       </w:r>
     </w:p>
@@ -3905,61 +3520,7 @@
         <w:pStyle w:val="BlockText"/>
       </w:pPr>
       <w:r>
-        <w:t xml:space="preserve">En resumen, nuestros hallazgos hasta ahora nos dicen tres cosas:</w:t>
-      </w:r>
-    </w:p>
-    <w:p>
-      <w:pPr>
-        <w:pStyle w:val="BlockText"/>
-      </w:pPr>
-      <w:r>
-        <w:rPr>
-          <w:b/>
-          <w:bCs/>
-        </w:rPr>
-        <w:t xml:space="preserve">Uno.</w:t>
-      </w:r>
-      <w:r>
-        <w:t xml:space="preserve"> </w:t>
-      </w:r>
-      <w:r>
-        <w:t xml:space="preserve">En la población mexicana, los estudios estándar capturan efectos genuinamente directos para rasgos biológicos como IMC, presión arterial y lípidos — validando instrumentos de aleatorización mendeliana para estas exposiciones.</w:t>
-      </w:r>
-    </w:p>
-    <w:p>
-      <w:pPr>
-        <w:pStyle w:val="BlockText"/>
-      </w:pPr>
-      <w:r>
-        <w:rPr>
-          <w:b/>
-          <w:bCs/>
-        </w:rPr>
-        <w:t xml:space="preserve">Dos.</w:t>
-      </w:r>
-      <w:r>
-        <w:t xml:space="preserve"> </w:t>
-      </w:r>
-      <w:r>
-        <w:t xml:space="preserve">Para rasgos socialmente mediados como la educación, la señal está ampliamente inflada por efectos indirectos. El logro educativo en un estudio estándar es más ambiental que genómico.</w:t>
-      </w:r>
-    </w:p>
-    <w:p>
-      <w:pPr>
-        <w:pStyle w:val="BlockText"/>
-      </w:pPr>
-      <w:r>
-        <w:rPr>
-          <w:b/>
-          <w:bCs/>
-        </w:rPr>
-        <w:t xml:space="preserve">Tres.</w:t>
-      </w:r>
-      <w:r>
-        <w:t xml:space="preserve"> </w:t>
-      </w:r>
-      <w:r>
-        <w:t xml:space="preserve">Para la diabetes, la admixtura genera una distorsión bidireccional que solo los diseños familiares pueden resolver. Esto tiene implicaciones directas para la implementación de puntajes de riesgo poligénico en el sistema de salud mexicano.</w:t>
+        <w:t xml:space="preserve">El primer resultado es la evaluación del poder estadístico. El estimador robusto incrementa el tamaño efectivo de muestra en aproximadamente 36.58% frente a los métodos de pares de hermanos y tríos parentales, debido a que aprovecha estructuras familiares más complejas que solo los genotipos observados de los padres.</w:t>
       </w:r>
     </w:p>
     <w:p>
@@ -3977,7 +3538,7 @@
           <w:i/>
           <w:iCs/>
         </w:rPr>
-        <w:t xml:space="preserve">~50 segundos</w:t>
+        <w:t xml:space="preserve">~1 minuto</w:t>
       </w:r>
     </w:p>
     <w:p>
@@ -3987,14 +3548,402 @@
         </w:pict>
       </w:r>
     </w:p>
+    <w:bookmarkEnd w:id="48"/>
+    <w:bookmarkStart w:id="49" w:name="X50ef13cf8eb7cfce47bcb0f982d737d3b989891"/>
+    <w:p>
+      <w:pPr>
+        <w:pStyle w:val="Heading2"/>
+      </w:pPr>
+      <w:r>
+        <w:t xml:space="preserve">SLIDE 24 —</w:t>
+      </w:r>
+      <w:r>
+        <w:t xml:space="preserve"> </w:t>
+      </w:r>
+      <w:r>
+        <w:t xml:space="preserve">“Estimaciones de heredabilidad (PopGWAS vs FGWAS)”</w:t>
+      </w:r>
+    </w:p>
+    <w:p>
+      <w:pPr>
+        <w:pStyle w:val="FirstParagraph"/>
+      </w:pPr>
+      <w:r>
+        <w:rPr>
+          <w:b/>
+          <w:bCs/>
+        </w:rPr>
+        <w:t xml:space="preserve">[Contenido visual]:</w:t>
+      </w:r>
+      <w:r>
+        <w:t xml:space="preserve"> </w:t>
+      </w:r>
+      <w:r>
+        <w:t xml:space="preserve">Gráfica de dispersión comparando estimaciones de heredabilidad (popGWAS vs FGWAS) y tabla de valores.</w:t>
+      </w:r>
+    </w:p>
+    <w:p>
+      <w:pPr>
+        <w:pStyle w:val="BodyText"/>
+      </w:pPr>
+      <w:r>
+        <w:rPr>
+          <w:b/>
+          <w:bCs/>
+        </w:rPr>
+        <w:t xml:space="preserve">Guion:</w:t>
+      </w:r>
+    </w:p>
+    <w:p>
+      <w:pPr>
+        <w:pStyle w:val="BlockText"/>
+      </w:pPr>
+      <w:r>
+        <w:t xml:space="preserve">Aquí comparamos las estimaciones de heredabilidad. Notamos que para rasgos como el nivel educativo, la heredabilidad poblacional disminuye significativamente cuando estimamos efectos directos. Esto sugiere un fuerte impacto del ambiente familiar y el emparejamiento selectivo. Sin embargo, para rasgos metabólicos como el IMC o la presión arterial, las estimaciones se mantienen bastante estables.</w:t>
+      </w:r>
+    </w:p>
+    <w:p>
+      <w:pPr>
+        <w:pStyle w:val="FirstParagraph"/>
+      </w:pPr>
+      <w:r>
+        <w:t xml:space="preserve">⏱️</w:t>
+      </w:r>
+      <w:r>
+        <w:t xml:space="preserve"> </w:t>
+      </w:r>
+      <w:r>
+        <w:rPr>
+          <w:i/>
+          <w:iCs/>
+        </w:rPr>
+        <w:t xml:space="preserve">~1 minuto 10 segundos</w:t>
+      </w:r>
+    </w:p>
+    <w:p>
+      <w:r>
+        <w:pict>
+          <v:rect style="width:0;height:1.5pt" o:hralign="center" o:hrstd="t" o:hr="t"/>
+        </w:pict>
+      </w:r>
+    </w:p>
+    <w:bookmarkEnd w:id="49"/>
+    <w:bookmarkStart w:id="50" w:name="X4dae9dfbaecee2cc6f29b614439f7a7757f71e5"/>
+    <w:p>
+      <w:pPr>
+        <w:pStyle w:val="Heading2"/>
+      </w:pPr>
+      <w:r>
+        <w:t xml:space="preserve">SLIDE 25 —</w:t>
+      </w:r>
+      <w:r>
+        <w:t xml:space="preserve"> </w:t>
+      </w:r>
+      <w:r>
+        <w:t xml:space="preserve">“Estimaciones de heredabilidad (Diferencias normalizadas)”</w:t>
+      </w:r>
+    </w:p>
+    <w:p>
+      <w:pPr>
+        <w:pStyle w:val="FirstParagraph"/>
+      </w:pPr>
+      <w:r>
+        <w:rPr>
+          <w:b/>
+          <w:bCs/>
+        </w:rPr>
+        <w:t xml:space="preserve">[Contenido visual]:</w:t>
+      </w:r>
+      <w:r>
+        <w:t xml:space="preserve"> </w:t>
+      </w:r>
+      <w:r>
+        <w:t xml:space="preserve">Gráfica mostrando las diferencias normalizadas (</w:t>
+      </w:r>
+      <m:oMath>
+        <m:sSub>
+          <m:e>
+            <m:r>
+              <m:t>Z</m:t>
+            </m:r>
+          </m:e>
+          <m:sub>
+            <m:r>
+              <m:t>d</m:t>
+            </m:r>
+            <m:r>
+              <m:t>i</m:t>
+            </m:r>
+            <m:r>
+              <m:t>f</m:t>
+            </m:r>
+            <m:r>
+              <m:t>f</m:t>
+            </m:r>
+          </m:sub>
+        </m:sSub>
+      </m:oMath>
+      <w:r>
+        <w:t xml:space="preserve">) entre estimaciones de heredabilidad.</w:t>
+      </w:r>
+    </w:p>
+    <w:p>
+      <w:pPr>
+        <w:pStyle w:val="BodyText"/>
+      </w:pPr>
+      <w:r>
+        <w:rPr>
+          <w:b/>
+          <w:bCs/>
+        </w:rPr>
+        <w:t xml:space="preserve">Guion:</w:t>
+      </w:r>
+    </w:p>
+    <w:p>
+      <w:pPr>
+        <w:pStyle w:val="BlockText"/>
+      </w:pPr>
+      <w:r>
+        <w:t xml:space="preserve">Al analizar las diferencias normalizadas, resaltan las desviaciones significativas en la diabetes autodeportada y el colesterol HDL, que muestran mayor heredabilidad en el análisis de efectos directos, contrastando con el efecto de deflación usual en otros rasgos. Esto demuestra cómo los efectos de estratificación o selección pueden inflar o desinflar las varianzas a nivel poblacional de manera asimétrica.</w:t>
+      </w:r>
+    </w:p>
+    <w:p>
+      <w:pPr>
+        <w:pStyle w:val="FirstParagraph"/>
+      </w:pPr>
+      <w:r>
+        <w:t xml:space="preserve">⏱️</w:t>
+      </w:r>
+      <w:r>
+        <w:t xml:space="preserve"> </w:t>
+      </w:r>
+      <w:r>
+        <w:rPr>
+          <w:i/>
+          <w:iCs/>
+        </w:rPr>
+        <w:t xml:space="preserve">~1 minuto</w:t>
+      </w:r>
+    </w:p>
+    <w:p>
+      <w:r>
+        <w:pict>
+          <v:rect style="width:0;height:1.5pt" o:hralign="center" o:hrstd="t" o:hr="t"/>
+        </w:pict>
+      </w:r>
+    </w:p>
     <w:bookmarkEnd w:id="50"/>
-    <w:bookmarkStart w:id="51" w:name="slide-24-próximos-pasos"/>
+    <w:bookmarkStart w:id="51" w:name="slide-26-correlación-de-estimadores"/>
     <w:p>
       <w:pPr>
         <w:pStyle w:val="Heading2"/>
       </w:pPr>
       <w:r>
-        <w:t xml:space="preserve">SLIDE 24 —</w:t>
+        <w:t xml:space="preserve">SLIDE 26 —</w:t>
+      </w:r>
+      <w:r>
+        <w:t xml:space="preserve"> </w:t>
+      </w:r>
+      <w:r>
+        <w:t xml:space="preserve">“Correlación de estimadores”</w:t>
+      </w:r>
+    </w:p>
+    <w:p>
+      <w:pPr>
+        <w:pStyle w:val="FirstParagraph"/>
+      </w:pPr>
+      <w:r>
+        <w:rPr>
+          <w:b/>
+          <w:bCs/>
+        </w:rPr>
+        <w:t xml:space="preserve">[Contenido visual]:</w:t>
+      </w:r>
+      <w:r>
+        <w:t xml:space="preserve"> </w:t>
+      </w:r>
+      <w:r>
+        <w:t xml:space="preserve">Correlaciones de genoma completo entre efectos genéticos directos y efectos poblacionales calculadas con SNIPAR.</w:t>
+      </w:r>
+    </w:p>
+    <w:p>
+      <w:pPr>
+        <w:pStyle w:val="BodyText"/>
+      </w:pPr>
+      <w:r>
+        <w:rPr>
+          <w:b/>
+          <w:bCs/>
+        </w:rPr>
+        <w:t xml:space="preserve">Guion:</w:t>
+      </w:r>
+    </w:p>
+    <w:p>
+      <w:pPr>
+        <w:pStyle w:val="BlockText"/>
+      </w:pPr>
+      <w:r>
+        <w:t xml:space="preserve">Finalmente, calculamos la correlación genómica entre estos efectos. En muchos de los rasgos, la correlación es alta, pero en aquellos con fuertes sesgos ambientales, vemos desviaciones que confirman la importancia del control por estructura familiar, lo cual se alinea con reportes de estudios en otras poblaciones.</w:t>
+      </w:r>
+    </w:p>
+    <w:p>
+      <w:pPr>
+        <w:pStyle w:val="FirstParagraph"/>
+      </w:pPr>
+      <w:r>
+        <w:t xml:space="preserve">⏱️</w:t>
+      </w:r>
+      <w:r>
+        <w:t xml:space="preserve"> </w:t>
+      </w:r>
+      <w:r>
+        <w:rPr>
+          <w:i/>
+          <w:iCs/>
+        </w:rPr>
+        <w:t xml:space="preserve">~1 minuto</w:t>
+      </w:r>
+    </w:p>
+    <w:p>
+      <w:r>
+        <w:pict>
+          <v:rect style="width:0;height:1.5pt" o:hralign="center" o:hrstd="t" o:hr="t"/>
+        </w:pict>
+      </w:r>
+    </w:p>
+    <w:bookmarkEnd w:id="51"/>
+    <w:bookmarkEnd w:id="52"/>
+    <w:bookmarkStart w:id="56" w:name="sección-7-conclusiones-y-próximos-pasos"/>
+    <w:p>
+      <w:pPr>
+        <w:pStyle w:val="Heading1"/>
+      </w:pPr>
+      <w:r>
+        <w:t xml:space="preserve">SECCIÓN 7 — CONCLUSIONES Y PRÓXIMOS PASOS</w:t>
+      </w:r>
+    </w:p>
+    <w:bookmarkStart w:id="53" w:name="slide-27-qué-aprendimos"/>
+    <w:p>
+      <w:pPr>
+        <w:pStyle w:val="Heading2"/>
+      </w:pPr>
+      <w:r>
+        <w:t xml:space="preserve">SLIDE 27 —</w:t>
+      </w:r>
+      <w:r>
+        <w:t xml:space="preserve"> </w:t>
+      </w:r>
+      <w:r>
+        <w:t xml:space="preserve">“¿Qué aprendimos?”</w:t>
+      </w:r>
+    </w:p>
+    <w:p>
+      <w:pPr>
+        <w:pStyle w:val="FirstParagraph"/>
+      </w:pPr>
+      <w:r>
+        <w:rPr>
+          <w:b/>
+          <w:bCs/>
+        </w:rPr>
+        <w:t xml:space="preserve">Guion:</w:t>
+      </w:r>
+    </w:p>
+    <w:p>
+      <w:pPr>
+        <w:pStyle w:val="BlockText"/>
+      </w:pPr>
+      <w:r>
+        <w:t xml:space="preserve">En resumen, nuestros hallazgos hasta ahora nos dicen tres cosas:</w:t>
+      </w:r>
+    </w:p>
+    <w:p>
+      <w:pPr>
+        <w:pStyle w:val="BlockText"/>
+      </w:pPr>
+      <w:r>
+        <w:rPr>
+          <w:b/>
+          <w:bCs/>
+        </w:rPr>
+        <w:t xml:space="preserve">Uno.</w:t>
+      </w:r>
+      <w:r>
+        <w:t xml:space="preserve"> </w:t>
+      </w:r>
+      <w:r>
+        <w:t xml:space="preserve">En la población mexicana, los estudios estándar capturan efectos genuinamente directos para rasgos biológicos como IMC, presión arterial y lípidos — validando instrumentos de aleatorización mendeliana para estas exposiciones.</w:t>
+      </w:r>
+    </w:p>
+    <w:p>
+      <w:pPr>
+        <w:pStyle w:val="BlockText"/>
+      </w:pPr>
+      <w:r>
+        <w:rPr>
+          <w:b/>
+          <w:bCs/>
+        </w:rPr>
+        <w:t xml:space="preserve">Dos.</w:t>
+      </w:r>
+      <w:r>
+        <w:t xml:space="preserve"> </w:t>
+      </w:r>
+      <w:r>
+        <w:t xml:space="preserve">Para rasgos socialmente mediados como la educación, la señal está ampliamente inflada por efectos indirectos. El logro educativo en un estudio estándar es más ambiental que genómico.</w:t>
+      </w:r>
+    </w:p>
+    <w:p>
+      <w:pPr>
+        <w:pStyle w:val="BlockText"/>
+      </w:pPr>
+      <w:r>
+        <w:rPr>
+          <w:b/>
+          <w:bCs/>
+        </w:rPr>
+        <w:t xml:space="preserve">Tres.</w:t>
+      </w:r>
+      <w:r>
+        <w:t xml:space="preserve"> </w:t>
+      </w:r>
+      <w:r>
+        <w:t xml:space="preserve">Para la diabetes, la admixtura genera una distorsión bidireccional que solo los diseños familiares pueden resolver. Esto tiene implicaciones directas para la implementación de puntajes de riesgo poligénico en el sistema de salud mexicano.</w:t>
+      </w:r>
+    </w:p>
+    <w:p>
+      <w:pPr>
+        <w:pStyle w:val="FirstParagraph"/>
+      </w:pPr>
+      <w:r>
+        <w:t xml:space="preserve">⏱️</w:t>
+      </w:r>
+      <w:r>
+        <w:t xml:space="preserve"> </w:t>
+      </w:r>
+      <w:r>
+        <w:rPr>
+          <w:i/>
+          <w:iCs/>
+        </w:rPr>
+        <w:t xml:space="preserve">~50 segundos</w:t>
+      </w:r>
+    </w:p>
+    <w:p>
+      <w:r>
+        <w:pict>
+          <v:rect style="width:0;height:1.5pt" o:hralign="center" o:hrstd="t" o:hr="t"/>
+        </w:pict>
+      </w:r>
+    </w:p>
+    <w:bookmarkEnd w:id="53"/>
+    <w:bookmarkStart w:id="54" w:name="slide-28-próximos-pasos"/>
+    <w:p>
+      <w:pPr>
+        <w:pStyle w:val="Heading2"/>
+      </w:pPr>
+      <w:r>
+        <w:t xml:space="preserve">SLIDE 28 —</w:t>
       </w:r>
       <w:r>
         <w:t xml:space="preserve"> </w:t>
@@ -4174,14 +4123,14 @@
         </w:pict>
       </w:r>
     </w:p>
-    <w:bookmarkEnd w:id="51"/>
-    <w:bookmarkStart w:id="52" w:name="slide-25-relevancia-clínica-para-méxico"/>
+    <w:bookmarkEnd w:id="54"/>
+    <w:bookmarkStart w:id="55" w:name="slide-29-relevancia-clínica-para-méxico"/>
     <w:p>
       <w:pPr>
         <w:pStyle w:val="Heading2"/>
       </w:pPr>
       <w:r>
-        <w:t xml:space="preserve">SLIDE 25 —</w:t>
+        <w:t xml:space="preserve">SLIDE 29 —</w:t>
       </w:r>
       <w:r>
         <w:t xml:space="preserve"> </w:t>
@@ -4348,9 +4297,9 @@
         </w:pict>
       </w:r>
     </w:p>
-    <w:bookmarkEnd w:id="52"/>
-    <w:bookmarkEnd w:id="53"/>
-    <w:bookmarkStart w:id="56" w:name="X3b12542ebf4e4c269161f065ef64fb189d30203"/>
+    <w:bookmarkEnd w:id="55"/>
+    <w:bookmarkEnd w:id="56"/>
+    <w:bookmarkStart w:id="59" w:name="X3b12542ebf4e4c269161f065ef64fb189d30203"/>
     <w:p>
       <w:pPr>
         <w:pStyle w:val="Heading1"/>
@@ -4359,13 +4308,13 @@
         <w:t xml:space="preserve">SECCIÓN 8 — COLABORADORES Y AGRADECIMIENTOS</w:t>
       </w:r>
     </w:p>
-    <w:bookmarkStart w:id="54" w:name="slide-26-current-collaborations"/>
+    <w:bookmarkStart w:id="57" w:name="slide-30-current-collaborations"/>
     <w:p>
       <w:pPr>
         <w:pStyle w:val="Heading2"/>
       </w:pPr>
       <w:r>
-        <w:t xml:space="preserve">SLIDE 26 —</w:t>
+        <w:t xml:space="preserve">SLIDE 30 —</w:t>
       </w:r>
       <w:r>
         <w:t xml:space="preserve"> </w:t>
@@ -4469,14 +4418,14 @@
         </w:pict>
       </w:r>
     </w:p>
-    <w:bookmarkEnd w:id="54"/>
-    <w:bookmarkStart w:id="55" w:name="slide-27-gracias-a-todxs"/>
+    <w:bookmarkEnd w:id="57"/>
+    <w:bookmarkStart w:id="58" w:name="slide-31-gracias-a-todxs"/>
     <w:p>
       <w:pPr>
         <w:pStyle w:val="Heading2"/>
       </w:pPr>
       <w:r>
-        <w:t xml:space="preserve">SLIDE 27 —</w:t>
+        <w:t xml:space="preserve">SLIDE 31 —</w:t>
       </w:r>
       <w:r>
         <w:t xml:space="preserve"> </w:t>
@@ -4556,9 +4505,9 @@
         </w:pict>
       </w:r>
     </w:p>
-    <w:bookmarkEnd w:id="55"/>
-    <w:bookmarkEnd w:id="56"/>
-    <w:bookmarkStart w:id="57" w:name="resumen-de-tiempos-estimados"/>
+    <w:bookmarkEnd w:id="58"/>
+    <w:bookmarkEnd w:id="59"/>
+    <w:bookmarkStart w:id="60" w:name="resumen-de-tiempos-estimados"/>
     <w:p>
       <w:pPr>
         <w:pStyle w:val="Heading1"/>
@@ -5126,8 +5075,8 @@
         </w:pict>
       </w:r>
     </w:p>
-    <w:bookmarkEnd w:id="57"/>
-    <w:bookmarkStart w:id="58" w:name="checklist-de-slides-por-completar"/>
+    <w:bookmarkEnd w:id="60"/>
+    <w:bookmarkStart w:id="61" w:name="checklist-de-slides-por-completar"/>
     <w:p>
       <w:pPr>
         <w:pStyle w:val="Heading1"/>
@@ -5349,19 +5298,7 @@
         <w:t xml:space="preserve"> </w:t>
       </w:r>
       <w:r>
-        <w:t xml:space="preserve">— N</w:t>
-      </w:r>
-      <w:r>
-        <w:rPr>
-          <w:vertAlign w:val="subscript"/>
-        </w:rPr>
-        <w:t xml:space="preserve">eff</w:t>
-      </w:r>
-      <w:r>
-        <w:t xml:space="preserve"> </w:t>
-      </w:r>
-      <w:r>
-        <w:t xml:space="preserve">boxplot (necesita figura)</w:t>
+        <w:t xml:space="preserve">— Flujo de trabajo completo</w:t>
       </w:r>
     </w:p>
     <w:p>
@@ -5377,13 +5314,13 @@
           <w:b/>
           <w:bCs/>
         </w:rPr>
-        <w:t xml:space="preserve">Slide 20</w:t>
-      </w:r>
-      <w:r>
-        <w:t xml:space="preserve"> </w:t>
-      </w:r>
-      <w:r>
-        <w:t xml:space="preserve">— Dumbbell plot de heredabilidad (necesita figura)</w:t>
+        <w:t xml:space="preserve">Slide 28</w:t>
+      </w:r>
+      <w:r>
+        <w:t xml:space="preserve"> </w:t>
+      </w:r>
+      <w:r>
+        <w:t xml:space="preserve">— Datos de entrada: Fenotipos</w:t>
       </w:r>
     </w:p>
     <w:p>
@@ -5399,13 +5336,13 @@
           <w:b/>
           <w:bCs/>
         </w:rPr>
-        <w:t xml:space="preserve">Slide 21</w:t>
-      </w:r>
-      <w:r>
-        <w:t xml:space="preserve"> </w:t>
-      </w:r>
-      <w:r>
-        <w:t xml:space="preserve">— Mecanismos de la reversión de diabetes (diagrama nuevo)</w:t>
+        <w:t xml:space="preserve">Slide 27</w:t>
+      </w:r>
+      <w:r>
+        <w:t xml:space="preserve"> </w:t>
+      </w:r>
+      <w:r>
+        <w:t xml:space="preserve">— Datos de entrada: Genotipos</w:t>
       </w:r>
     </w:p>
     <w:p>
@@ -5421,13 +5358,13 @@
           <w:b/>
           <w:bCs/>
         </w:rPr>
-        <w:t xml:space="preserve">Slide 22</w:t>
-      </w:r>
-      <w:r>
-        <w:t xml:space="preserve"> </w:t>
-      </w:r>
-      <w:r>
-        <w:t xml:space="preserve">— Tabla de SMDs</w:t>
+        <w:t xml:space="preserve">Slide 28</w:t>
+      </w:r>
+      <w:r>
+        <w:t xml:space="preserve"> </w:t>
+      </w:r>
+      <w:r>
+        <w:t xml:space="preserve">— Tamaños Efectivos de Muestra</w:t>
       </w:r>
     </w:p>
     <w:p>
@@ -5443,13 +5380,13 @@
           <w:b/>
           <w:bCs/>
         </w:rPr>
-        <w:t xml:space="preserve">Slide 23</w:t>
-      </w:r>
-      <w:r>
-        <w:t xml:space="preserve"> </w:t>
-      </w:r>
-      <w:r>
-        <w:t xml:space="preserve">— Conclusiones</w:t>
+        <w:t xml:space="preserve">Slide 27</w:t>
+      </w:r>
+      <w:r>
+        <w:t xml:space="preserve"> </w:t>
+      </w:r>
+      <w:r>
+        <w:t xml:space="preserve">— Estimaciones de heredabilidad (scatter)</w:t>
       </w:r>
     </w:p>
     <w:p>
@@ -5465,13 +5402,13 @@
           <w:b/>
           <w:bCs/>
         </w:rPr>
-        <w:t xml:space="preserve">Slide 24</w:t>
-      </w:r>
-      <w:r>
-        <w:t xml:space="preserve"> </w:t>
-      </w:r>
-      <w:r>
-        <w:t xml:space="preserve">— Próximos pasos</w:t>
+        <w:t xml:space="preserve">Slide 28</w:t>
+      </w:r>
+      <w:r>
+        <w:t xml:space="preserve"> </w:t>
+      </w:r>
+      <w:r>
+        <w:t xml:space="preserve">— Estimaciones de heredabilidad (diferencias normalizadas)</w:t>
       </w:r>
     </w:p>
     <w:p>
@@ -5487,7 +5424,73 @@
           <w:b/>
           <w:bCs/>
         </w:rPr>
-        <w:t xml:space="preserve">Slide 25</w:t>
+        <w:t xml:space="preserve">Slide 27</w:t>
+      </w:r>
+      <w:r>
+        <w:t xml:space="preserve"> </w:t>
+      </w:r>
+      <w:r>
+        <w:t xml:space="preserve">— Correlación de estimadores</w:t>
+      </w:r>
+    </w:p>
+    <w:p>
+      <w:pPr>
+        <w:pStyle w:val="Compact"/>
+        <w:numPr>
+          <w:ilvl w:val="0"/>
+          <w:numId w:val="1025"/>
+        </w:numPr>
+      </w:pPr>
+      <w:r>
+        <w:rPr>
+          <w:b/>
+          <w:bCs/>
+        </w:rPr>
+        <w:t xml:space="preserve">Slide 28</w:t>
+      </w:r>
+      <w:r>
+        <w:t xml:space="preserve"> </w:t>
+      </w:r>
+      <w:r>
+        <w:t xml:space="preserve">— Conclusiones</w:t>
+      </w:r>
+    </w:p>
+    <w:p>
+      <w:pPr>
+        <w:pStyle w:val="Compact"/>
+        <w:numPr>
+          <w:ilvl w:val="0"/>
+          <w:numId w:val="1026"/>
+        </w:numPr>
+      </w:pPr>
+      <w:r>
+        <w:rPr>
+          <w:b/>
+          <w:bCs/>
+        </w:rPr>
+        <w:t xml:space="preserve">Slide 27</w:t>
+      </w:r>
+      <w:r>
+        <w:t xml:space="preserve"> </w:t>
+      </w:r>
+      <w:r>
+        <w:t xml:space="preserve">— Próximos pasos</w:t>
+      </w:r>
+    </w:p>
+    <w:p>
+      <w:pPr>
+        <w:pStyle w:val="Compact"/>
+        <w:numPr>
+          <w:ilvl w:val="0"/>
+          <w:numId w:val="1027"/>
+        </w:numPr>
+      </w:pPr>
+      <w:r>
+        <w:rPr>
+          <w:b/>
+          <w:bCs/>
+        </w:rPr>
+        <w:t xml:space="preserve">Slide 28</w:t>
       </w:r>
       <w:r>
         <w:t xml:space="preserve"> </w:t>
@@ -5496,7 +5499,7 @@
         <w:t xml:space="preserve">— Relevancia clínica</w:t>
       </w:r>
     </w:p>
-    <w:bookmarkEnd w:id="58"/>
+    <w:bookmarkEnd w:id="61"/>
     <w:sectPr>
       <w:footnotePr>
         <w:numRestart w:val="eachSect"/>
@@ -6110,24 +6113,33 @@
     <w:abstractNumId w:val="993"/>
   </w:num>
   <w:num w:numId="1018">
+    <w:abstractNumId w:val="993"/>
+  </w:num>
+  <w:num w:numId="1019">
+    <w:abstractNumId w:val="993"/>
+  </w:num>
+  <w:num w:numId="1020">
+    <w:abstractNumId w:val="993"/>
+  </w:num>
+  <w:num w:numId="1021">
+    <w:abstractNumId w:val="993"/>
+  </w:num>
+  <w:num w:numId="1022">
+    <w:abstractNumId w:val="993"/>
+  </w:num>
+  <w:num w:numId="1023">
+    <w:abstractNumId w:val="993"/>
+  </w:num>
+  <w:num w:numId="1024">
+    <w:abstractNumId w:val="993"/>
+  </w:num>
+  <w:num w:numId="1025">
     <w:abstractNumId w:val="992"/>
   </w:num>
-  <w:num w:numId="1019">
+  <w:num w:numId="1026">
     <w:abstractNumId w:val="992"/>
   </w:num>
-  <w:num w:numId="1020">
-    <w:abstractNumId w:val="992"/>
-  </w:num>
-  <w:num w:numId="1021">
-    <w:abstractNumId w:val="992"/>
-  </w:num>
-  <w:num w:numId="1022">
-    <w:abstractNumId w:val="992"/>
-  </w:num>
-  <w:num w:numId="1023">
-    <w:abstractNumId w:val="992"/>
-  </w:num>
-  <w:num w:numId="1024">
+  <w:num w:numId="1027">
     <w:abstractNumId w:val="992"/>
   </w:num>
 </w:numbering>

</xml_diff>

<commit_message>
2026-08-04 13:21:29: Actualización de presentación, métodos, resultados y scripts relacionados
</commit_message>
<xml_diff>
--- a/guion-examen-candidatura.docx
+++ b/guion-examen-candidatura.docx
@@ -2441,7 +2441,23 @@
         <w:pStyle w:val="BlockText"/>
       </w:pPr>
       <w:r>
-        <w:t xml:space="preserve">Nuestra hipótesis de trabajo plantea que el uso de este estimador en la cohorte MCPS logrará cuantificar estos efectos directos de manera precisa, identificando falsos positivos en las asociaciones previas y revelando nuevos loci de susceptibilidad específicos para la población mexicana.</w:t>
+        <w:t xml:space="preserve">Nuestra hipótesis de trabajo plantea que el uso de este estimador en la cohorte MCPS logrará cuantificar estos efectos directos de manera precisa, identificando falsos positivos en las asociaciones previas y revelando nuevos</w:t>
+      </w:r>
+      <w:r>
+        <w:t xml:space="preserve"> </w:t>
+      </w:r>
+      <w:r>
+        <w:rPr>
+          <w:i/>
+          <w:iCs/>
+        </w:rPr>
+        <w:t xml:space="preserve">loci</w:t>
+      </w:r>
+      <w:r>
+        <w:t xml:space="preserve"> </w:t>
+      </w:r>
+      <w:r>
+        <w:t xml:space="preserve">de susceptibilidad específicos para la población mexicana.</w:t>
       </w:r>
     </w:p>
     <w:p>
@@ -2610,7 +2626,7 @@
     </w:p>
     <w:bookmarkEnd w:id="40"/>
     <w:bookmarkEnd w:id="41"/>
-    <w:bookmarkStart w:id="52" w:name="sección-5-métodos"/>
+    <w:bookmarkStart w:id="56" w:name="sección-5-métodos"/>
     <w:p>
       <w:pPr>
         <w:pStyle w:val="Heading1"/>
@@ -2814,7 +2830,7 @@
         <w:t xml:space="preserve"> </w:t>
       </w:r>
       <w:r>
-        <w:t xml:space="preserve">con REGENIE en los ~29,000 individuos no emparentados, y estudios familiares con SNIPAR usando los ~100,000 individuos en redes familiares.</w:t>
+        <w:t xml:space="preserve">con REGENIE en los 29,041 individuos no emparentados, y estudios familiares con SNIPAR usando los 100,323 individuos en redes familiares.</w:t>
       </w:r>
     </w:p>
     <w:p>
@@ -3579,7 +3595,7 @@
         <w:t xml:space="preserve"> </w:t>
       </w:r>
       <w:r>
-        <w:t xml:space="preserve">Gráfica de dispersión comparando estimaciones de heredabilidad (popGWAS vs FGWAS) y tabla de valores.</w:t>
+        <w:t xml:space="preserve">Gráfica de dispersión comparando estimaciones de heredabilidad (popGWAS vs FGWAS).</w:t>
       </w:r>
     </w:p>
     <w:p>
@@ -3804,6 +3820,78 @@
         <w:t xml:space="preserve">~1 minuto</w:t>
       </w:r>
     </w:p>
+    <w:bookmarkEnd w:id="51"/>
+    <w:bookmarkStart w:id="52" w:name="Xdc0e0a27211f1e5d6f8d9e6a64878059a9eab7b"/>
+    <w:p>
+      <w:pPr>
+        <w:pStyle w:val="Heading2"/>
+      </w:pPr>
+      <w:r>
+        <w:t xml:space="preserve">SLIDE 27 —</w:t>
+      </w:r>
+      <w:r>
+        <w:t xml:space="preserve"> </w:t>
+      </w:r>
+      <w:r>
+        <w:t xml:space="preserve">“Comparación de prevalencias entre subcohortes”</w:t>
+      </w:r>
+    </w:p>
+    <w:p>
+      <w:pPr>
+        <w:pStyle w:val="FirstParagraph"/>
+      </w:pPr>
+      <w:r>
+        <w:rPr>
+          <w:b/>
+          <w:bCs/>
+        </w:rPr>
+        <w:t xml:space="preserve">[Contenido visual]:</w:t>
+      </w:r>
+      <w:r>
+        <w:t xml:space="preserve"> </w:t>
+      </w:r>
+      <w:r>
+        <w:t xml:space="preserve">Gráfico de comparación de prevalencias de fenotipos por subcohorte.</w:t>
+      </w:r>
+    </w:p>
+    <w:p>
+      <w:pPr>
+        <w:pStyle w:val="BodyText"/>
+      </w:pPr>
+      <w:r>
+        <w:rPr>
+          <w:b/>
+          <w:bCs/>
+        </w:rPr>
+        <w:t xml:space="preserve">Guion:</w:t>
+      </w:r>
+    </w:p>
+    <w:p>
+      <w:pPr>
+        <w:pStyle w:val="BlockText"/>
+      </w:pPr>
+      <w:r>
+        <w:t xml:space="preserve">Para entender mejor de dónde provienen estos sesgos, primero comparamos las prevalencias de los distintos fenotipos entre nuestras subcohortes. Observamos que la distribución no es uniforme, lo cual nos da un primer indicio claro de que los criterios de inclusión y la estructura familiar generan una sobre-representación de ciertos fenotipos.</w:t>
+      </w:r>
+    </w:p>
+    <w:p>
+      <w:pPr>
+        <w:pStyle w:val="FirstParagraph"/>
+      </w:pPr>
+      <w:r>
+        <w:t xml:space="preserve">⏱️</w:t>
+      </w:r>
+      <w:r>
+        <w:t xml:space="preserve"> </w:t>
+      </w:r>
+      <w:r>
+        <w:rPr>
+          <w:i/>
+          <w:iCs/>
+        </w:rPr>
+        <w:t xml:space="preserve">~30 segundos</w:t>
+      </w:r>
+    </w:p>
     <w:p>
       <w:r>
         <w:pict>
@@ -3811,30 +3899,20 @@
         </w:pict>
       </w:r>
     </w:p>
-    <w:bookmarkEnd w:id="51"/>
     <w:bookmarkEnd w:id="52"/>
-    <w:bookmarkStart w:id="56" w:name="sección-7-conclusiones-y-próximos-pasos"/>
-    <w:p>
-      <w:pPr>
-        <w:pStyle w:val="Heading1"/>
-      </w:pPr>
-      <w:r>
-        <w:t xml:space="preserve">SECCIÓN 7 — CONCLUSIONES Y PRÓXIMOS PASOS</w:t>
-      </w:r>
-    </w:p>
-    <w:bookmarkStart w:id="53" w:name="slide-27-qué-aprendimos"/>
+    <w:bookmarkStart w:id="53" w:name="X81846fe6a7ad779a70556fb82333166be88b3ba"/>
     <w:p>
       <w:pPr>
         <w:pStyle w:val="Heading2"/>
       </w:pPr>
       <w:r>
-        <w:t xml:space="preserve">SLIDE 27 —</w:t>
-      </w:r>
-      <w:r>
-        <w:t xml:space="preserve"> </w:t>
-      </w:r>
-      <w:r>
-        <w:t xml:space="preserve">“¿Qué aprendimos?”</w:t>
+        <w:t xml:space="preserve">SLIDE 28 —</w:t>
+      </w:r>
+      <w:r>
+        <w:t xml:space="preserve"> </w:t>
+      </w:r>
+      <w:r>
+        <w:t xml:space="preserve">“Las subcohortes tiene diferencias sistemáticas por sesgos de averiguación”</w:t>
       </w:r>
     </w:p>
     <w:p>
@@ -3846,6 +3924,34 @@
           <w:b/>
           <w:bCs/>
         </w:rPr>
+        <w:t xml:space="preserve">[Contenido visual]:</w:t>
+      </w:r>
+      <w:r>
+        <w:t xml:space="preserve"> </w:t>
+      </w:r>
+      <w:r>
+        <w:t xml:space="preserve">Gráfico de bosque (</w:t>
+      </w:r>
+      <w:r>
+        <w:rPr>
+          <w:i/>
+          <w:iCs/>
+        </w:rPr>
+        <w:t xml:space="preserve">forest plot</w:t>
+      </w:r>
+      <w:r>
+        <w:t xml:space="preserve">) evaluando diferencias de medias estandarizadas (SMD) por sesgos de averiguación.</w:t>
+      </w:r>
+    </w:p>
+    <w:p>
+      <w:pPr>
+        <w:pStyle w:val="BodyText"/>
+      </w:pPr>
+      <w:r>
+        <w:rPr>
+          <w:b/>
+          <w:bCs/>
+        </w:rPr>
         <w:t xml:space="preserve">Guion:</w:t>
       </w:r>
     </w:p>
@@ -3854,61 +3960,7 @@
         <w:pStyle w:val="BlockText"/>
       </w:pPr>
       <w:r>
-        <w:t xml:space="preserve">En resumen, nuestros hallazgos hasta ahora nos dicen tres cosas:</w:t>
-      </w:r>
-    </w:p>
-    <w:p>
-      <w:pPr>
-        <w:pStyle w:val="BlockText"/>
-      </w:pPr>
-      <w:r>
-        <w:rPr>
-          <w:b/>
-          <w:bCs/>
-        </w:rPr>
-        <w:t xml:space="preserve">Uno.</w:t>
-      </w:r>
-      <w:r>
-        <w:t xml:space="preserve"> </w:t>
-      </w:r>
-      <w:r>
-        <w:t xml:space="preserve">En la población mexicana, los estudios estándar capturan efectos genuinamente directos para rasgos biológicos como IMC, presión arterial y lípidos — validando instrumentos de aleatorización mendeliana para estas exposiciones.</w:t>
-      </w:r>
-    </w:p>
-    <w:p>
-      <w:pPr>
-        <w:pStyle w:val="BlockText"/>
-      </w:pPr>
-      <w:r>
-        <w:rPr>
-          <w:b/>
-          <w:bCs/>
-        </w:rPr>
-        <w:t xml:space="preserve">Dos.</w:t>
-      </w:r>
-      <w:r>
-        <w:t xml:space="preserve"> </w:t>
-      </w:r>
-      <w:r>
-        <w:t xml:space="preserve">Para rasgos socialmente mediados como la educación, la señal está ampliamente inflada por efectos indirectos. El logro educativo en un estudio estándar es más ambiental que genómico.</w:t>
-      </w:r>
-    </w:p>
-    <w:p>
-      <w:pPr>
-        <w:pStyle w:val="BlockText"/>
-      </w:pPr>
-      <w:r>
-        <w:rPr>
-          <w:b/>
-          <w:bCs/>
-        </w:rPr>
-        <w:t xml:space="preserve">Tres.</w:t>
-      </w:r>
-      <w:r>
-        <w:t xml:space="preserve"> </w:t>
-      </w:r>
-      <w:r>
-        <w:t xml:space="preserve">Para la diabetes, la admixtura genera una distorsión bidireccional que solo los diseños familiares pueden resolver. Esto tiene implicaciones directas para la implementación de puntajes de riesgo poligénico en el sistema de salud mexicano.</w:t>
+        <w:t xml:space="preserve">Analizando los sesgos de averiguación, observamos diferencias sistemáticas significativas entre las subcohortes de nuestra muestra. Al ver el tamaño del efecto estandarizado en múltiples fenotipos, se hace evidente que la forma en que los individuos fueron reclutados o detectados altera las mediciones poblacionales frente a los datos dentro-de-familia.</w:t>
       </w:r>
     </w:p>
     <w:p>
@@ -3937,13 +3989,407 @@
       </w:r>
     </w:p>
     <w:bookmarkEnd w:id="53"/>
-    <w:bookmarkStart w:id="54" w:name="slide-28-próximos-pasos"/>
+    <w:bookmarkStart w:id="54" w:name="X810baa7789e6bd076b416cd36ab05183fde436e"/>
     <w:p>
       <w:pPr>
         <w:pStyle w:val="Heading2"/>
       </w:pPr>
       <w:r>
-        <w:t xml:space="preserve">SLIDE 28 —</w:t>
+        <w:t xml:space="preserve">SLIDE 29 —</w:t>
+      </w:r>
+      <w:r>
+        <w:t xml:space="preserve"> </w:t>
+      </w:r>
+      <w:r>
+        <w:t xml:space="preserve">“Patrones y Conclusiones de Atenuación”</w:t>
+      </w:r>
+    </w:p>
+    <w:p>
+      <w:pPr>
+        <w:pStyle w:val="FirstParagraph"/>
+      </w:pPr>
+      <w:r>
+        <w:rPr>
+          <w:b/>
+          <w:bCs/>
+        </w:rPr>
+        <w:t xml:space="preserve">[Contenido visual]:</w:t>
+      </w:r>
+      <w:r>
+        <w:t xml:space="preserve"> </w:t>
+      </w:r>
+      <w:r>
+        <w:t xml:space="preserve">Viñetas de texto resumiendo los tres patrones principales encontrados en la comparación de heredabilidades.</w:t>
+      </w:r>
+    </w:p>
+    <w:p>
+      <w:pPr>
+        <w:pStyle w:val="BodyText"/>
+      </w:pPr>
+      <w:r>
+        <w:rPr>
+          <w:b/>
+          <w:bCs/>
+        </w:rPr>
+        <w:t xml:space="preserve">Guion:</w:t>
+      </w:r>
+    </w:p>
+    <w:p>
+      <w:pPr>
+        <w:pStyle w:val="BlockText"/>
+      </w:pPr>
+      <w:r>
+        <w:t xml:space="preserve">Sintetizando estos hallazgos, podemos dividirlos en tres grandes patrones. Primero, para los rasgos mediados socialmente como el logro educativo y la estatura, observamos una fuerte atenuación, indicando que están dominados por efectos genéticos indirectos y el apareamiento selectivo.</w:t>
+      </w:r>
+      <w:r>
+        <w:t xml:space="preserve"> </w:t>
+      </w:r>
+      <w:r>
+        <w:t xml:space="preserve">Segundo, para los rasgos cardiometabólicos la atenuación es mínima, lo que nos da confianza de que los estudios poblacionales están capturando efectos biológicos directos.</w:t>
+      </w:r>
+      <w:r>
+        <w:t xml:space="preserve"> </w:t>
+      </w:r>
+      <w:r>
+        <w:t xml:space="preserve">Y tercero, el caso especial de la diabetes, donde vemos una inversión. Esta mayor heredabilidad directa refleja probablemente cómo la estructura genética admixta deflaciona las estimaciones poblacionales al controlar de forma imperfecta la estratificación.</w:t>
+      </w:r>
+    </w:p>
+    <w:p>
+      <w:pPr>
+        <w:pStyle w:val="FirstParagraph"/>
+      </w:pPr>
+      <w:r>
+        <w:t xml:space="preserve">⏱️</w:t>
+      </w:r>
+      <w:r>
+        <w:t xml:space="preserve"> </w:t>
+      </w:r>
+      <w:r>
+        <w:rPr>
+          <w:i/>
+          <w:iCs/>
+        </w:rPr>
+        <w:t xml:space="preserve">~50 segundos</w:t>
+      </w:r>
+    </w:p>
+    <w:p>
+      <w:r>
+        <w:pict>
+          <v:rect style="width:0;height:1.5pt" o:hralign="center" o:hrstd="t" o:hr="t"/>
+        </w:pict>
+      </w:r>
+    </w:p>
+    <w:bookmarkEnd w:id="54"/>
+    <w:bookmarkStart w:id="55" w:name="X719be405e374ccf5ec607f847ce33ff773cd869"/>
+    <w:p>
+      <w:pPr>
+        <w:pStyle w:val="Heading2"/>
+      </w:pPr>
+      <w:r>
+        <w:t xml:space="preserve">SLIDE 30 —</w:t>
+      </w:r>
+      <w:r>
+        <w:t xml:space="preserve"> </w:t>
+      </w:r>
+      <w:r>
+        <w:t xml:space="preserve">“Atenuación a nivel de</w:t>
+      </w:r>
+      <w:r>
+        <w:t xml:space="preserve"> </w:t>
+      </w:r>
+      <w:r>
+        <w:rPr>
+          <w:i/>
+          <w:iCs/>
+        </w:rPr>
+        <w:t xml:space="preserve">locus</w:t>
+      </w:r>
+      <w:r>
+        <w:t xml:space="preserve"> </w:t>
+      </w:r>
+      <w:r>
+        <w:t xml:space="preserve">independientes (Clumping)”</w:t>
+      </w:r>
+    </w:p>
+    <w:p>
+      <w:pPr>
+        <w:pStyle w:val="FirstParagraph"/>
+      </w:pPr>
+      <w:r>
+        <w:rPr>
+          <w:b/>
+          <w:bCs/>
+        </w:rPr>
+        <w:t xml:space="preserve">[Contenido visual]:</w:t>
+      </w:r>
+      <w:r>
+        <w:t xml:space="preserve"> </w:t>
+      </w:r>
+      <w:r>
+        <w:t xml:space="preserve">Tabla de resultados de</w:t>
+      </w:r>
+      <w:r>
+        <w:t xml:space="preserve"> </w:t>
+      </w:r>
+      <w:r>
+        <w:rPr>
+          <w:i/>
+          <w:iCs/>
+        </w:rPr>
+        <w:t xml:space="preserve">fine-mapping</w:t>
+      </w:r>
+      <w:r>
+        <w:t xml:space="preserve"> </w:t>
+      </w:r>
+      <w:r>
+        <w:t xml:space="preserve">comparando PopGWAS y FGWAS en</w:t>
+      </w:r>
+      <w:r>
+        <w:t xml:space="preserve"> </w:t>
+      </w:r>
+      <w:r>
+        <w:rPr>
+          <w:i/>
+          <w:iCs/>
+        </w:rPr>
+        <w:t xml:space="preserve">loci</w:t>
+      </w:r>
+      <w:r>
+        <w:t xml:space="preserve"> </w:t>
+      </w:r>
+      <w:r>
+        <w:t xml:space="preserve">representativos.</w:t>
+      </w:r>
+    </w:p>
+    <w:p>
+      <w:pPr>
+        <w:pStyle w:val="BodyText"/>
+      </w:pPr>
+      <w:r>
+        <w:rPr>
+          <w:b/>
+          <w:bCs/>
+        </w:rPr>
+        <w:t xml:space="preserve">Guion:</w:t>
+      </w:r>
+    </w:p>
+    <w:p>
+      <w:pPr>
+        <w:pStyle w:val="BlockText"/>
+      </w:pPr>
+      <w:r>
+        <w:t xml:space="preserve">Para confirmar que esta atenuación global en la heredabilidad también ocurre a nivel local, aislamos los</w:t>
+      </w:r>
+      <w:r>
+        <w:t xml:space="preserve"> </w:t>
+      </w:r>
+      <w:r>
+        <w:rPr>
+          <w:i/>
+          <w:iCs/>
+        </w:rPr>
+        <w:t xml:space="preserve">loci</w:t>
+      </w:r>
+      <w:r>
+        <w:t xml:space="preserve"> </w:t>
+      </w:r>
+      <w:r>
+        <w:t xml:space="preserve">independientes mediante</w:t>
+      </w:r>
+      <w:r>
+        <w:t xml:space="preserve"> </w:t>
+      </w:r>
+      <w:r>
+        <w:rPr>
+          <w:i/>
+          <w:iCs/>
+        </w:rPr>
+        <w:t xml:space="preserve">clumping</w:t>
+      </w:r>
+      <w:r>
+        <w:t xml:space="preserve">.</w:t>
+      </w:r>
+      <w:r>
+        <w:t xml:space="preserve"> </w:t>
+      </w:r>
+      <w:r>
+        <w:t xml:space="preserve">Lo que encontramos, como se muestra en esta tabla, es que variantes fuertemente asociadas a diabetes en GWAS poblacionales, como en el gen CDKAL1 o CDKN2B, ven sus efectos reducidos casi a cero en los análisis dentro-de-familia. Esto nos demuestra empíricamente que la señal capturada por el estudio poblacional en estos</w:t>
+      </w:r>
+      <w:r>
+        <w:t xml:space="preserve"> </w:t>
+      </w:r>
+      <w:r>
+        <w:rPr>
+          <w:i/>
+          <w:iCs/>
+        </w:rPr>
+        <w:t xml:space="preserve">loci</w:t>
+      </w:r>
+      <w:r>
+        <w:t xml:space="preserve"> </w:t>
+      </w:r>
+      <w:r>
+        <w:t xml:space="preserve">era principalmente ruido originado por estratificación ambiental.</w:t>
+      </w:r>
+    </w:p>
+    <w:p>
+      <w:pPr>
+        <w:pStyle w:val="FirstParagraph"/>
+      </w:pPr>
+      <w:r>
+        <w:t xml:space="preserve">⏱️</w:t>
+      </w:r>
+      <w:r>
+        <w:t xml:space="preserve"> </w:t>
+      </w:r>
+      <w:r>
+        <w:rPr>
+          <w:i/>
+          <w:iCs/>
+        </w:rPr>
+        <w:t xml:space="preserve">~50 segundos</w:t>
+      </w:r>
+    </w:p>
+    <w:p>
+      <w:r>
+        <w:pict>
+          <v:rect style="width:0;height:1.5pt" o:hralign="center" o:hrstd="t" o:hr="t"/>
+        </w:pict>
+      </w:r>
+    </w:p>
+    <w:bookmarkEnd w:id="55"/>
+    <w:bookmarkEnd w:id="56"/>
+    <w:bookmarkStart w:id="60" w:name="sección-7-conclusiones-y-próximos-pasos"/>
+    <w:p>
+      <w:pPr>
+        <w:pStyle w:val="Heading1"/>
+      </w:pPr>
+      <w:r>
+        <w:t xml:space="preserve">SECCIÓN 7 — CONCLUSIONES Y PRÓXIMOS PASOS</w:t>
+      </w:r>
+    </w:p>
+    <w:bookmarkStart w:id="57" w:name="slide-32-qué-aprendimos"/>
+    <w:p>
+      <w:pPr>
+        <w:pStyle w:val="Heading2"/>
+      </w:pPr>
+      <w:r>
+        <w:t xml:space="preserve">SLIDE 32 —</w:t>
+      </w:r>
+      <w:r>
+        <w:t xml:space="preserve"> </w:t>
+      </w:r>
+      <w:r>
+        <w:t xml:space="preserve">“¿Qué aprendimos?”</w:t>
+      </w:r>
+    </w:p>
+    <w:p>
+      <w:pPr>
+        <w:pStyle w:val="FirstParagraph"/>
+      </w:pPr>
+      <w:r>
+        <w:rPr>
+          <w:b/>
+          <w:bCs/>
+        </w:rPr>
+        <w:t xml:space="preserve">Guion:</w:t>
+      </w:r>
+    </w:p>
+    <w:p>
+      <w:pPr>
+        <w:pStyle w:val="BlockText"/>
+      </w:pPr>
+      <w:r>
+        <w:t xml:space="preserve">En resumen, nuestros hallazgos hasta ahora nos dicen tres cosas:</w:t>
+      </w:r>
+    </w:p>
+    <w:p>
+      <w:pPr>
+        <w:pStyle w:val="BlockText"/>
+      </w:pPr>
+      <w:r>
+        <w:rPr>
+          <w:b/>
+          <w:bCs/>
+        </w:rPr>
+        <w:t xml:space="preserve">Uno.</w:t>
+      </w:r>
+      <w:r>
+        <w:t xml:space="preserve"> </w:t>
+      </w:r>
+      <w:r>
+        <w:t xml:space="preserve">En la población mexicana, los estudios estándar capturan efectos genuinamente directos para rasgos biológicos como IMC, presión arterial y lípidos — validando instrumentos de aleatorización mendeliana para estas exposiciones.</w:t>
+      </w:r>
+    </w:p>
+    <w:p>
+      <w:pPr>
+        <w:pStyle w:val="BlockText"/>
+      </w:pPr>
+      <w:r>
+        <w:rPr>
+          <w:b/>
+          <w:bCs/>
+        </w:rPr>
+        <w:t xml:space="preserve">Dos.</w:t>
+      </w:r>
+      <w:r>
+        <w:t xml:space="preserve"> </w:t>
+      </w:r>
+      <w:r>
+        <w:t xml:space="preserve">Para rasgos socialmente mediados como la educación, la señal está ampliamente inflada por efectos indirectos. El logro educativo en un estudio estándar es más ambiental que genómico.</w:t>
+      </w:r>
+    </w:p>
+    <w:p>
+      <w:pPr>
+        <w:pStyle w:val="BlockText"/>
+      </w:pPr>
+      <w:r>
+        <w:rPr>
+          <w:b/>
+          <w:bCs/>
+        </w:rPr>
+        <w:t xml:space="preserve">Tres.</w:t>
+      </w:r>
+      <w:r>
+        <w:t xml:space="preserve"> </w:t>
+      </w:r>
+      <w:r>
+        <w:t xml:space="preserve">Para la diabetes, la admixtura genera una distorsión bidireccional que solo los diseños familiares pueden resolver. Esto tiene implicaciones directas para la implementación de puntajes de riesgo poligénico en el sistema de salud mexicano.</w:t>
+      </w:r>
+    </w:p>
+    <w:p>
+      <w:pPr>
+        <w:pStyle w:val="FirstParagraph"/>
+      </w:pPr>
+      <w:r>
+        <w:t xml:space="preserve">⏱️</w:t>
+      </w:r>
+      <w:r>
+        <w:t xml:space="preserve"> </w:t>
+      </w:r>
+      <w:r>
+        <w:rPr>
+          <w:i/>
+          <w:iCs/>
+        </w:rPr>
+        <w:t xml:space="preserve">~50 segundos</w:t>
+      </w:r>
+    </w:p>
+    <w:p>
+      <w:r>
+        <w:pict>
+          <v:rect style="width:0;height:1.5pt" o:hralign="center" o:hrstd="t" o:hr="t"/>
+        </w:pict>
+      </w:r>
+    </w:p>
+    <w:bookmarkEnd w:id="57"/>
+    <w:bookmarkStart w:id="58" w:name="slide-32-próximos-pasos"/>
+    <w:p>
+      <w:pPr>
+        <w:pStyle w:val="Heading2"/>
+      </w:pPr>
+      <w:r>
+        <w:t xml:space="preserve">SLIDE 32 —</w:t>
       </w:r>
       <w:r>
         <w:t xml:space="preserve"> </w:t>
@@ -4123,14 +4569,14 @@
         </w:pict>
       </w:r>
     </w:p>
-    <w:bookmarkEnd w:id="54"/>
-    <w:bookmarkStart w:id="55" w:name="slide-29-relevancia-clínica-para-méxico"/>
+    <w:bookmarkEnd w:id="58"/>
+    <w:bookmarkStart w:id="59" w:name="slide-33-relevancia-clínica-para-méxico"/>
     <w:p>
       <w:pPr>
         <w:pStyle w:val="Heading2"/>
       </w:pPr>
       <w:r>
-        <w:t xml:space="preserve">SLIDE 29 —</w:t>
+        <w:t xml:space="preserve">SLIDE 33 —</w:t>
       </w:r>
       <w:r>
         <w:t xml:space="preserve"> </w:t>
@@ -4297,9 +4743,9 @@
         </w:pict>
       </w:r>
     </w:p>
-    <w:bookmarkEnd w:id="55"/>
-    <w:bookmarkEnd w:id="56"/>
-    <w:bookmarkStart w:id="59" w:name="X3b12542ebf4e4c269161f065ef64fb189d30203"/>
+    <w:bookmarkEnd w:id="59"/>
+    <w:bookmarkEnd w:id="60"/>
+    <w:bookmarkStart w:id="63" w:name="X3b12542ebf4e4c269161f065ef64fb189d30203"/>
     <w:p>
       <w:pPr>
         <w:pStyle w:val="Heading1"/>
@@ -4308,13 +4754,13 @@
         <w:t xml:space="preserve">SECCIÓN 8 — COLABORADORES Y AGRADECIMIENTOS</w:t>
       </w:r>
     </w:p>
-    <w:bookmarkStart w:id="57" w:name="slide-30-current-collaborations"/>
+    <w:bookmarkStart w:id="61" w:name="slide-34-current-collaborations"/>
     <w:p>
       <w:pPr>
         <w:pStyle w:val="Heading2"/>
       </w:pPr>
       <w:r>
-        <w:t xml:space="preserve">SLIDE 30 —</w:t>
+        <w:t xml:space="preserve">SLIDE 34 —</w:t>
       </w:r>
       <w:r>
         <w:t xml:space="preserve"> </w:t>
@@ -4418,14 +4864,14 @@
         </w:pict>
       </w:r>
     </w:p>
-    <w:bookmarkEnd w:id="57"/>
-    <w:bookmarkStart w:id="58" w:name="slide-31-gracias-a-todxs"/>
+    <w:bookmarkEnd w:id="61"/>
+    <w:bookmarkStart w:id="62" w:name="slide-35-gracias-a-todxs"/>
     <w:p>
       <w:pPr>
         <w:pStyle w:val="Heading2"/>
       </w:pPr>
       <w:r>
-        <w:t xml:space="preserve">SLIDE 31 —</w:t>
+        <w:t xml:space="preserve">SLIDE 35 —</w:t>
       </w:r>
       <w:r>
         <w:t xml:space="preserve"> </w:t>
@@ -4505,9 +4951,9 @@
         </w:pict>
       </w:r>
     </w:p>
-    <w:bookmarkEnd w:id="58"/>
-    <w:bookmarkEnd w:id="59"/>
-    <w:bookmarkStart w:id="60" w:name="resumen-de-tiempos-estimados"/>
+    <w:bookmarkEnd w:id="62"/>
+    <w:bookmarkEnd w:id="63"/>
+    <w:bookmarkStart w:id="64" w:name="resumen-de-tiempos-estimados"/>
     <w:p>
       <w:pPr>
         <w:pStyle w:val="Heading1"/>
@@ -5075,8 +5521,8 @@
         </w:pict>
       </w:r>
     </w:p>
-    <w:bookmarkEnd w:id="60"/>
-    <w:bookmarkStart w:id="61" w:name="checklist-de-slides-por-completar"/>
+    <w:bookmarkEnd w:id="64"/>
+    <w:bookmarkStart w:id="65" w:name="checklist-de-slides-por-completar"/>
     <w:p>
       <w:pPr>
         <w:pStyle w:val="Heading1"/>
@@ -5499,7 +5945,7 @@
         <w:t xml:space="preserve">— Relevancia clínica</w:t>
       </w:r>
     </w:p>
-    <w:bookmarkEnd w:id="61"/>
+    <w:bookmarkEnd w:id="65"/>
     <w:sectPr>
       <w:footnotePr>
         <w:numRestart w:val="eachSect"/>

</xml_diff>

<commit_message>
2026-08-05 13:54:57: Actualización de tabla FDR de ancestría y objetivos específicos
</commit_message>
<xml_diff>
--- a/guion-examen-candidatura.docx
+++ b/guion-examen-candidatura.docx
@@ -2119,7 +2119,7 @@
         <w:pStyle w:val="BlockText"/>
       </w:pPr>
       <w:r>
-        <w:t xml:space="preserve">Para lograr esto, nos hemos planteado cinco objetivos específicos:</w:t>
+        <w:t xml:space="preserve">Para lograr esto, nos hemos planteado cinco objetivos específicos (notando que los primeros tres, en color, son resultados actuales, mientras que los dos últimos en gris son análisis futuros):</w:t>
       </w:r>
     </w:p>
     <w:p>
@@ -2131,7 +2131,7 @@
         </w:numPr>
       </w:pPr>
       <w:r>
-        <w:t xml:space="preserve">Realizar los estudios de asociación genética implementando el estimador robusto.</w:t>
+        <w:t xml:space="preserve">Primero, realizar las asociaciones con el estimador robusto, con el interés principal de comprobar qué tanto aumenta el tamaño de muestra con este estimador.</w:t>
       </w:r>
     </w:p>
     <w:p>
@@ -2143,7 +2143,7 @@
         </w:numPr>
       </w:pPr>
       <w:r>
-        <w:t xml:space="preserve">Comparar los tamaños de efecto frente a métodos poblacionales para cuantificar los sesgos.</w:t>
+        <w:t xml:space="preserve">Segundo, calcular las estimaciones directas de la heredabilidad.</w:t>
       </w:r>
     </w:p>
     <w:p>
@@ -2155,7 +2155,7 @@
         </w:numPr>
       </w:pPr>
       <w:r>
-        <w:t xml:space="preserve">Integrar meta-análisis con cohortes internacionales para maximizar el descubrimiento.</w:t>
+        <w:t xml:space="preserve">Tercero, comparar el tamaño de los efectos poblacionales y familiares para cuantificar los sesgos.</w:t>
       </w:r>
     </w:p>
     <w:p>
@@ -2167,7 +2167,7 @@
         </w:numPr>
       </w:pPr>
       <w:r>
-        <w:t xml:space="preserve">Desarrollar análisis derivados, como puntajes de riesgo poligénico y estudios de aleatorización mendeliana adaptados a esta población.</w:t>
+        <w:t xml:space="preserve">Cuarto, realizar análisis posteriores; aunque aún por definir, proponemos el cálculo de scores poligénicos o PGS.</w:t>
       </w:r>
     </w:p>
     <w:p>
@@ -2179,7 +2179,7 @@
         </w:numPr>
       </w:pPr>
       <w:r>
-        <w:t xml:space="preserve">Finalmente, construir una plataforma interactiva que ponga estos recursos a disposición de la comunidad científica.</w:t>
+        <w:t xml:space="preserve">Y quinto, desarrollar una plataforma abierta en línea para acceder a todos estos resultados.</w:t>
       </w:r>
     </w:p>
     <w:p>
@@ -4055,7 +4055,7 @@
     </w:p>
     <w:bookmarkEnd w:id="56"/>
     <w:bookmarkEnd w:id="57"/>
-    <w:bookmarkStart w:id="61" w:name="sección-7-conclusiones-y-próximos-pasos"/>
+    <w:bookmarkStart w:id="62" w:name="sección-7-conclusiones-y-próximos-pasos"/>
     <w:p>
       <w:pPr>
         <w:pStyle w:val="Heading1"/>
@@ -4227,13 +4227,92 @@
       </w:r>
     </w:p>
     <w:bookmarkEnd w:id="59"/>
-    <w:bookmarkStart w:id="60" w:name="slide-34-próximos-pasos"/>
+    <w:bookmarkStart w:id="60" w:name="Xc88cdee71baa4f29e8d9be6a5337642f4833785"/>
     <w:p>
       <w:pPr>
         <w:pStyle w:val="Heading2"/>
       </w:pPr>
       <w:r>
         <w:t xml:space="preserve">SLIDE 34 —</w:t>
+      </w:r>
+      <w:r>
+        <w:t xml:space="preserve"> </w:t>
+      </w:r>
+      <w:r>
+        <w:t xml:space="preserve">“Diferencias significativas (FDR) y frecuencias alélicas”</w:t>
+      </w:r>
+    </w:p>
+    <w:p>
+      <w:pPr>
+        <w:pStyle w:val="FirstParagraph"/>
+      </w:pPr>
+      <w:r>
+        <w:rPr>
+          <w:b/>
+          <w:bCs/>
+        </w:rPr>
+        <w:t xml:space="preserve">[Contenido visual]:</w:t>
+      </w:r>
+      <w:r>
+        <w:t xml:space="preserve"> </w:t>
+      </w:r>
+      <w:r>
+        <w:t xml:space="preserve">Tabla con los SNPs que presentan diferencias de efecto significativas y sus frecuencias alélicas por ancestría.</w:t>
+      </w:r>
+    </w:p>
+    <w:p>
+      <w:pPr>
+        <w:pStyle w:val="BodyText"/>
+      </w:pPr>
+      <w:r>
+        <w:rPr>
+          <w:b/>
+          <w:bCs/>
+        </w:rPr>
+        <w:t xml:space="preserve">Guion:</w:t>
+      </w:r>
+    </w:p>
+    <w:p>
+      <w:pPr>
+        <w:pStyle w:val="BlockText"/>
+      </w:pPr>
+      <w:r>
+        <w:t xml:space="preserve">Para profundizar en estos hallazgos, analizamos específicamente los SNPs con diferencias significativas en un false discovery rate. Como observamos en esta tabla, al agregar la información de las frecuencias alélicas del MCPS, vemos claramente la distribución en individuos de ancestría indígena mexicana (IMX) frente a europea (EUR). Esto ilustra cómo la estructura poblacional puede inflar los efectos en loci que tradicionalmente asociábamos a fenotipos como la diabetes o niveles de colesterol.</w:t>
+      </w:r>
+    </w:p>
+    <w:p>
+      <w:pPr>
+        <w:pStyle w:val="FirstParagraph"/>
+      </w:pPr>
+      <w:r>
+        <w:t xml:space="preserve">⏱️</w:t>
+      </w:r>
+      <w:r>
+        <w:t xml:space="preserve"> </w:t>
+      </w:r>
+      <w:r>
+        <w:rPr>
+          <w:i/>
+          <w:iCs/>
+        </w:rPr>
+        <w:t xml:space="preserve">~45 segundos</w:t>
+      </w:r>
+    </w:p>
+    <w:p>
+      <w:r>
+        <w:pict>
+          <v:rect style="width:0;height:1.5pt" o:hralign="center" o:hrstd="t" o:hr="t"/>
+        </w:pict>
+      </w:r>
+    </w:p>
+    <w:bookmarkEnd w:id="60"/>
+    <w:bookmarkStart w:id="61" w:name="slide-35-próximos-pasos"/>
+    <w:p>
+      <w:pPr>
+        <w:pStyle w:val="Heading2"/>
+      </w:pPr>
+      <w:r>
+        <w:t xml:space="preserve">SLIDE 35 —</w:t>
       </w:r>
       <w:r>
         <w:t xml:space="preserve"> </w:t>
@@ -4413,9 +4492,9 @@
         </w:pict>
       </w:r>
     </w:p>
-    <w:bookmarkEnd w:id="60"/>
     <w:bookmarkEnd w:id="61"/>
-    <w:bookmarkStart w:id="64" w:name="X3b12542ebf4e4c269161f065ef64fb189d30203"/>
+    <w:bookmarkEnd w:id="62"/>
+    <w:bookmarkStart w:id="65" w:name="X3b12542ebf4e4c269161f065ef64fb189d30203"/>
     <w:p>
       <w:pPr>
         <w:pStyle w:val="Heading1"/>
@@ -4424,7 +4503,7 @@
         <w:t xml:space="preserve">SECCIÓN 8 — COLABORADORES Y AGRADECIMIENTOS</w:t>
       </w:r>
     </w:p>
-    <w:bookmarkStart w:id="62" w:name="slide-34-current-collaborations"/>
+    <w:bookmarkStart w:id="63" w:name="slide-34-current-collaborations"/>
     <w:p>
       <w:pPr>
         <w:pStyle w:val="Heading2"/>
@@ -4534,8 +4613,8 @@
         </w:pict>
       </w:r>
     </w:p>
-    <w:bookmarkEnd w:id="62"/>
-    <w:bookmarkStart w:id="63" w:name="slide-35-gracias-a-todxs"/>
+    <w:bookmarkEnd w:id="63"/>
+    <w:bookmarkStart w:id="64" w:name="slide-35-gracias-a-todxs"/>
     <w:p>
       <w:pPr>
         <w:pStyle w:val="Heading2"/>
@@ -4621,9 +4700,9 @@
         </w:pict>
       </w:r>
     </w:p>
-    <w:bookmarkEnd w:id="63"/>
     <w:bookmarkEnd w:id="64"/>
-    <w:bookmarkStart w:id="65" w:name="resumen-de-tiempos-estimados"/>
+    <w:bookmarkEnd w:id="65"/>
+    <w:bookmarkStart w:id="66" w:name="resumen-de-tiempos-estimados"/>
     <w:p>
       <w:pPr>
         <w:pStyle w:val="Heading1"/>
@@ -5191,8 +5270,8 @@
         </w:pict>
       </w:r>
     </w:p>
-    <w:bookmarkEnd w:id="65"/>
-    <w:bookmarkStart w:id="66" w:name="checklist-de-slides-por-completar"/>
+    <w:bookmarkEnd w:id="66"/>
+    <w:bookmarkStart w:id="67" w:name="checklist-de-slides-por-completar"/>
     <w:p>
       <w:pPr>
         <w:pStyle w:val="Heading1"/>
@@ -5615,7 +5694,7 @@
         <w:t xml:space="preserve">— Relevancia clínica</w:t>
       </w:r>
     </w:p>
-    <w:bookmarkEnd w:id="66"/>
+    <w:bookmarkEnd w:id="67"/>
     <w:sectPr>
       <w:footnotePr>
         <w:numRestart w:val="eachSect"/>

</xml_diff>

<commit_message>
2026-08-05 13:59:44: Añadir diapositivas de transición de objetivos en resultados
</commit_message>
<xml_diff>
--- a/guion-examen-candidatura.docx
+++ b/guion-examen-candidatura.docx
@@ -2209,7 +2209,7 @@
     </w:p>
     <w:bookmarkEnd w:id="39"/>
     <w:bookmarkEnd w:id="40"/>
-    <w:bookmarkStart w:id="57" w:name="sección-5-métodos"/>
+    <w:bookmarkStart w:id="60" w:name="sección-5-métodos"/>
     <w:p>
       <w:pPr>
         <w:pStyle w:val="Heading1"/>
@@ -3282,19 +3282,19 @@
       </w:r>
     </w:p>
     <w:bookmarkEnd w:id="48"/>
-    <w:bookmarkStart w:id="49" w:name="slide-23-tamaños-efectivos-de-muestra"/>
+    <w:bookmarkStart w:id="49" w:name="X57f19b1266b97e2df77265a69183c2ac425bb9c"/>
     <w:p>
       <w:pPr>
         <w:pStyle w:val="Heading2"/>
       </w:pPr>
       <w:r>
-        <w:t xml:space="preserve">SLIDE 23 —</w:t>
-      </w:r>
-      <w:r>
-        <w:t xml:space="preserve"> </w:t>
-      </w:r>
-      <w:r>
-        <w:t xml:space="preserve">“Tamaños Efectivos de Muestra”</w:t>
+        <w:t xml:space="preserve">SLIDE 23 (Transición) —</w:t>
+      </w:r>
+      <w:r>
+        <w:t xml:space="preserve"> </w:t>
+      </w:r>
+      <w:r>
+        <w:t xml:space="preserve">“Objetivos: Asociaciones”</w:t>
       </w:r>
     </w:p>
     <w:p>
@@ -3312,7 +3312,7 @@
         <w:t xml:space="preserve"> </w:t>
       </w:r>
       <w:r>
-        <w:t xml:space="preserve">Gráfica comparando tamaños efectivos de muestra entre estimador robusto vs. pares de hermanos y tríos parentales.</w:t>
+        <w:t xml:space="preserve">Diapositiva de objetivos con el punto 1 (Asociaciones) en color, los demás en gris.</w:t>
       </w:r>
     </w:p>
     <w:p>
@@ -3332,7 +3332,7 @@
         <w:pStyle w:val="BlockText"/>
       </w:pPr>
       <w:r>
-        <w:t xml:space="preserve">El primer resultado es la evaluación del poder estadístico. El estimador robusto incrementa el tamaño efectivo de muestra en aproximadamente 36.58% frente a los métodos de pares de hermanos y tríos parentales, debido a que aprovecha estructuras familiares más complejas que solo los genotipos observados de los padres.</w:t>
+        <w:t xml:space="preserve">Retomando nuestros objetivos, comenzaremos evaluando el incremento en el tamaño de muestra al utilizar el estimador robusto.</w:t>
       </w:r>
     </w:p>
     <w:p>
@@ -3350,7 +3350,7 @@
           <w:i/>
           <w:iCs/>
         </w:rPr>
-        <w:t xml:space="preserve">~1 minuto</w:t>
+        <w:t xml:space="preserve">~10 segundos</w:t>
       </w:r>
     </w:p>
     <w:p>
@@ -3361,19 +3361,19 @@
       </w:r>
     </w:p>
     <w:bookmarkEnd w:id="49"/>
-    <w:bookmarkStart w:id="50" w:name="X50ef13cf8eb7cfce47bcb0f982d737d3b989891"/>
+    <w:bookmarkStart w:id="50" w:name="slide-23-tamaños-efectivos-de-muestra"/>
     <w:p>
       <w:pPr>
         <w:pStyle w:val="Heading2"/>
       </w:pPr>
       <w:r>
-        <w:t xml:space="preserve">SLIDE 24 —</w:t>
-      </w:r>
-      <w:r>
-        <w:t xml:space="preserve"> </w:t>
-      </w:r>
-      <w:r>
-        <w:t xml:space="preserve">“Estimaciones de heredabilidad (PopGWAS vs FGWAS)”</w:t>
+        <w:t xml:space="preserve">SLIDE 23 —</w:t>
+      </w:r>
+      <w:r>
+        <w:t xml:space="preserve"> </w:t>
+      </w:r>
+      <w:r>
+        <w:t xml:space="preserve">“Tamaños Efectivos de Muestra”</w:t>
       </w:r>
     </w:p>
     <w:p>
@@ -3391,7 +3391,7 @@
         <w:t xml:space="preserve"> </w:t>
       </w:r>
       <w:r>
-        <w:t xml:space="preserve">Gráfica de dispersión comparando estimaciones de heredabilidad (popGWAS vs FGWAS).</w:t>
+        <w:t xml:space="preserve">Gráfica comparando tamaños efectivos de muestra entre estimador robusto vs. pares de hermanos y tríos parentales.</w:t>
       </w:r>
     </w:p>
     <w:p>
@@ -3411,7 +3411,7 @@
         <w:pStyle w:val="BlockText"/>
       </w:pPr>
       <w:r>
-        <w:t xml:space="preserve">Aquí comparamos las estimaciones de heredabilidad. Notamos que para rasgos como el nivel educativo, la heredabilidad poblacional disminuye significativamente cuando estimamos efectos directos. Esto sugiere un fuerte impacto del ambiente familiar y el emparejamiento selectivo. Sin embargo, para rasgos metabólicos como el IMC o la presión arterial, las estimaciones se mantienen bastante estables.</w:t>
+        <w:t xml:space="preserve">El primer resultado es la evaluación del poder estadístico. El estimador robusto incrementa el tamaño efectivo de muestra en aproximadamente 36.58% frente a los métodos de pares de hermanos y tríos parentales, debido a que aprovecha estructuras familiares más complejas que solo los genotipos observados de los padres.</w:t>
       </w:r>
     </w:p>
     <w:p>
@@ -3429,7 +3429,7 @@
           <w:i/>
           <w:iCs/>
         </w:rPr>
-        <w:t xml:space="preserve">~1 minuto 10 segundos</w:t>
+        <w:t xml:space="preserve">~1 minuto</w:t>
       </w:r>
     </w:p>
     <w:p>
@@ -3440,7 +3440,165 @@
       </w:r>
     </w:p>
     <w:bookmarkEnd w:id="50"/>
-    <w:bookmarkStart w:id="51" w:name="X4dae9dfbaecee2cc6f29b614439f7a7757f71e5"/>
+    <w:bookmarkStart w:id="51" w:name="X26cea5bb161ca3591240cd971ed725fb99e718c"/>
+    <w:p>
+      <w:pPr>
+        <w:pStyle w:val="Heading2"/>
+      </w:pPr>
+      <w:r>
+        <w:t xml:space="preserve">SLIDE 24 (Transición) —</w:t>
+      </w:r>
+      <w:r>
+        <w:t xml:space="preserve"> </w:t>
+      </w:r>
+      <w:r>
+        <w:t xml:space="preserve">“Objetivos: Heredabilidad”</w:t>
+      </w:r>
+    </w:p>
+    <w:p>
+      <w:pPr>
+        <w:pStyle w:val="FirstParagraph"/>
+      </w:pPr>
+      <w:r>
+        <w:rPr>
+          <w:b/>
+          <w:bCs/>
+        </w:rPr>
+        <w:t xml:space="preserve">[Contenido visual]:</w:t>
+      </w:r>
+      <w:r>
+        <w:t xml:space="preserve"> </w:t>
+      </w:r>
+      <w:r>
+        <w:t xml:space="preserve">Diapositiva de objetivos con el punto 2 (Heredabilidad) en color, los demás en gris.</w:t>
+      </w:r>
+    </w:p>
+    <w:p>
+      <w:pPr>
+        <w:pStyle w:val="BodyText"/>
+      </w:pPr>
+      <w:r>
+        <w:rPr>
+          <w:b/>
+          <w:bCs/>
+        </w:rPr>
+        <w:t xml:space="preserve">Guion:</w:t>
+      </w:r>
+    </w:p>
+    <w:p>
+      <w:pPr>
+        <w:pStyle w:val="BlockText"/>
+      </w:pPr>
+      <w:r>
+        <w:t xml:space="preserve">Pasando al segundo objetivo, nos enfocamos ahora en las estimaciones directas de heredabilidad.</w:t>
+      </w:r>
+    </w:p>
+    <w:p>
+      <w:pPr>
+        <w:pStyle w:val="FirstParagraph"/>
+      </w:pPr>
+      <w:r>
+        <w:t xml:space="preserve">⏱️</w:t>
+      </w:r>
+      <w:r>
+        <w:t xml:space="preserve"> </w:t>
+      </w:r>
+      <w:r>
+        <w:rPr>
+          <w:i/>
+          <w:iCs/>
+        </w:rPr>
+        <w:t xml:space="preserve">~10 segundos</w:t>
+      </w:r>
+    </w:p>
+    <w:p>
+      <w:r>
+        <w:pict>
+          <v:rect style="width:0;height:1.5pt" o:hralign="center" o:hrstd="t" o:hr="t"/>
+        </w:pict>
+      </w:r>
+    </w:p>
+    <w:bookmarkEnd w:id="51"/>
+    <w:bookmarkStart w:id="52" w:name="X50ef13cf8eb7cfce47bcb0f982d737d3b989891"/>
+    <w:p>
+      <w:pPr>
+        <w:pStyle w:val="Heading2"/>
+      </w:pPr>
+      <w:r>
+        <w:t xml:space="preserve">SLIDE 24 —</w:t>
+      </w:r>
+      <w:r>
+        <w:t xml:space="preserve"> </w:t>
+      </w:r>
+      <w:r>
+        <w:t xml:space="preserve">“Estimaciones de heredabilidad (PopGWAS vs FGWAS)”</w:t>
+      </w:r>
+    </w:p>
+    <w:p>
+      <w:pPr>
+        <w:pStyle w:val="FirstParagraph"/>
+      </w:pPr>
+      <w:r>
+        <w:rPr>
+          <w:b/>
+          <w:bCs/>
+        </w:rPr>
+        <w:t xml:space="preserve">[Contenido visual]:</w:t>
+      </w:r>
+      <w:r>
+        <w:t xml:space="preserve"> </w:t>
+      </w:r>
+      <w:r>
+        <w:t xml:space="preserve">Gráfica de dispersión comparando estimaciones de heredabilidad (popGWAS vs FGWAS).</w:t>
+      </w:r>
+    </w:p>
+    <w:p>
+      <w:pPr>
+        <w:pStyle w:val="BodyText"/>
+      </w:pPr>
+      <w:r>
+        <w:rPr>
+          <w:b/>
+          <w:bCs/>
+        </w:rPr>
+        <w:t xml:space="preserve">Guion:</w:t>
+      </w:r>
+    </w:p>
+    <w:p>
+      <w:pPr>
+        <w:pStyle w:val="BlockText"/>
+      </w:pPr>
+      <w:r>
+        <w:t xml:space="preserve">Aquí comparamos las estimaciones de heredabilidad. Notamos que para rasgos como el nivel educativo, la heredabilidad poblacional disminuye significativamente cuando estimamos efectos directos. Esto sugiere un fuerte impacto del ambiente familiar y el emparejamiento selectivo. Sin embargo, para rasgos metabólicos como el IMC o la presión arterial, las estimaciones se mantienen bastante estables.</w:t>
+      </w:r>
+    </w:p>
+    <w:p>
+      <w:pPr>
+        <w:pStyle w:val="FirstParagraph"/>
+      </w:pPr>
+      <w:r>
+        <w:t xml:space="preserve">⏱️</w:t>
+      </w:r>
+      <w:r>
+        <w:t xml:space="preserve"> </w:t>
+      </w:r>
+      <w:r>
+        <w:rPr>
+          <w:i/>
+          <w:iCs/>
+        </w:rPr>
+        <w:t xml:space="preserve">~1 minuto 10 segundos</w:t>
+      </w:r>
+    </w:p>
+    <w:p>
+      <w:r>
+        <w:pict>
+          <v:rect style="width:0;height:1.5pt" o:hralign="center" o:hrstd="t" o:hr="t"/>
+        </w:pict>
+      </w:r>
+    </w:p>
+    <w:bookmarkEnd w:id="52"/>
+    <w:bookmarkStart w:id="53" w:name="X4dae9dfbaecee2cc6f29b614439f7a7757f71e5"/>
     <w:p>
       <w:pPr>
         <w:pStyle w:val="Heading2"/>
@@ -3544,8 +3702,8 @@
         </w:pict>
       </w:r>
     </w:p>
-    <w:bookmarkEnd w:id="51"/>
-    <w:bookmarkStart w:id="52" w:name="slide-26-correlación-de-estimadores"/>
+    <w:bookmarkEnd w:id="53"/>
+    <w:bookmarkStart w:id="54" w:name="slide-26-correlación-de-estimadores"/>
     <w:p>
       <w:pPr>
         <w:pStyle w:val="Heading2"/>
@@ -3616,8 +3774,8 @@
         <w:t xml:space="preserve">~1 minuto</w:t>
       </w:r>
     </w:p>
-    <w:bookmarkEnd w:id="52"/>
-    <w:bookmarkStart w:id="53" w:name="Xdc0e0a27211f1e5d6f8d9e6a64878059a9eab7b"/>
+    <w:bookmarkEnd w:id="54"/>
+    <w:bookmarkStart w:id="55" w:name="Xdc0e0a27211f1e5d6f8d9e6a64878059a9eab7b"/>
     <w:p>
       <w:pPr>
         <w:pStyle w:val="Heading2"/>
@@ -3695,8 +3853,8 @@
         </w:pict>
       </w:r>
     </w:p>
-    <w:bookmarkEnd w:id="53"/>
-    <w:bookmarkStart w:id="54" w:name="X81846fe6a7ad779a70556fb82333166be88b3ba"/>
+    <w:bookmarkEnd w:id="55"/>
+    <w:bookmarkStart w:id="56" w:name="X81846fe6a7ad779a70556fb82333166be88b3ba"/>
     <w:p>
       <w:pPr>
         <w:pStyle w:val="Heading2"/>
@@ -3784,8 +3942,8 @@
         </w:pict>
       </w:r>
     </w:p>
-    <w:bookmarkEnd w:id="54"/>
-    <w:bookmarkStart w:id="55" w:name="X810baa7789e6bd076b416cd36ab05183fde436e"/>
+    <w:bookmarkEnd w:id="56"/>
+    <w:bookmarkStart w:id="57" w:name="X810baa7789e6bd076b416cd36ab05183fde436e"/>
     <w:p>
       <w:pPr>
         <w:pStyle w:val="Heading2"/>
@@ -3875,20 +4033,66 @@
         </w:pict>
       </w:r>
     </w:p>
-    <w:bookmarkEnd w:id="55"/>
-    <w:bookmarkStart w:id="56" w:name="X719be405e374ccf5ec607f847ce33ff773cd869"/>
+    <w:bookmarkEnd w:id="57"/>
+    <w:bookmarkStart w:id="58" w:name="Xf2fb6112b923b37321b0cc321c443481980524c"/>
     <w:p>
       <w:pPr>
         <w:pStyle w:val="Heading2"/>
       </w:pPr>
       <w:r>
-        <w:t xml:space="preserve">SLIDE 30 —</w:t>
-      </w:r>
-      <w:r>
-        <w:t xml:space="preserve"> </w:t>
-      </w:r>
-      <w:r>
-        <w:t xml:space="preserve">“Atenuación a nivel de</w:t>
+        <w:t xml:space="preserve">SLIDE 30 (Transición) —</w:t>
+      </w:r>
+      <w:r>
+        <w:t xml:space="preserve"> </w:t>
+      </w:r>
+      <w:r>
+        <w:t xml:space="preserve">“Objetivos: Comparación de efectos”</w:t>
+      </w:r>
+    </w:p>
+    <w:p>
+      <w:pPr>
+        <w:pStyle w:val="FirstParagraph"/>
+      </w:pPr>
+      <w:r>
+        <w:rPr>
+          <w:b/>
+          <w:bCs/>
+        </w:rPr>
+        <w:t xml:space="preserve">[Contenido visual]:</w:t>
+      </w:r>
+      <w:r>
+        <w:t xml:space="preserve"> </w:t>
+      </w:r>
+      <w:r>
+        <w:t xml:space="preserve">Diapositiva de objetivos con el punto 3 (Comparación de efectos) en color, los demás en gris.</w:t>
+      </w:r>
+    </w:p>
+    <w:p>
+      <w:pPr>
+        <w:pStyle w:val="BodyText"/>
+      </w:pPr>
+      <w:r>
+        <w:rPr>
+          <w:b/>
+          <w:bCs/>
+        </w:rPr>
+        <w:t xml:space="preserve">Guion:</w:t>
+      </w:r>
+    </w:p>
+    <w:p>
+      <w:pPr>
+        <w:pStyle w:val="BlockText"/>
+      </w:pPr>
+      <w:r>
+        <w:t xml:space="preserve">Ahora, abordaremos el tercer objetivo: la cuantificación empírica del sesgo mediante la comparación de los tamaños de efecto, atenuaciones a nivel locus y las diferencias genéticas por ancestría.</w:t>
+      </w:r>
+    </w:p>
+    <w:p>
+      <w:pPr>
+        <w:pStyle w:val="FirstParagraph"/>
+      </w:pPr>
+      <w:r>
+        <w:t xml:space="preserve">⏱️</w:t>
       </w:r>
       <w:r>
         <w:t xml:space="preserve"> </w:t>
@@ -3898,152 +4102,7 @@
           <w:i/>
           <w:iCs/>
         </w:rPr>
-        <w:t xml:space="preserve">locus</w:t>
-      </w:r>
-      <w:r>
-        <w:t xml:space="preserve"> </w:t>
-      </w:r>
-      <w:r>
-        <w:t xml:space="preserve">independientes (Clumping)”</w:t>
-      </w:r>
-    </w:p>
-    <w:p>
-      <w:pPr>
-        <w:pStyle w:val="FirstParagraph"/>
-      </w:pPr>
-      <w:r>
-        <w:rPr>
-          <w:b/>
-          <w:bCs/>
-        </w:rPr>
-        <w:t xml:space="preserve">[Contenido visual]:</w:t>
-      </w:r>
-      <w:r>
-        <w:t xml:space="preserve"> </w:t>
-      </w:r>
-      <w:r>
-        <w:t xml:space="preserve">Tabla de resultados de</w:t>
-      </w:r>
-      <w:r>
-        <w:t xml:space="preserve"> </w:t>
-      </w:r>
-      <w:r>
-        <w:rPr>
-          <w:i/>
-          <w:iCs/>
-        </w:rPr>
-        <w:t xml:space="preserve">fine-mapping</w:t>
-      </w:r>
-      <w:r>
-        <w:t xml:space="preserve"> </w:t>
-      </w:r>
-      <w:r>
-        <w:t xml:space="preserve">comparando PopGWAS y FGWAS en</w:t>
-      </w:r>
-      <w:r>
-        <w:t xml:space="preserve"> </w:t>
-      </w:r>
-      <w:r>
-        <w:rPr>
-          <w:i/>
-          <w:iCs/>
-        </w:rPr>
-        <w:t xml:space="preserve">loci</w:t>
-      </w:r>
-      <w:r>
-        <w:t xml:space="preserve"> </w:t>
-      </w:r>
-      <w:r>
-        <w:t xml:space="preserve">representativos.</w:t>
-      </w:r>
-    </w:p>
-    <w:p>
-      <w:pPr>
-        <w:pStyle w:val="BodyText"/>
-      </w:pPr>
-      <w:r>
-        <w:rPr>
-          <w:b/>
-          <w:bCs/>
-        </w:rPr>
-        <w:t xml:space="preserve">Guion:</w:t>
-      </w:r>
-    </w:p>
-    <w:p>
-      <w:pPr>
-        <w:pStyle w:val="BlockText"/>
-      </w:pPr>
-      <w:r>
-        <w:t xml:space="preserve">Para confirmar que esta atenuación global en la heredabilidad también ocurre a nivel local, aislamos los</w:t>
-      </w:r>
-      <w:r>
-        <w:t xml:space="preserve"> </w:t>
-      </w:r>
-      <w:r>
-        <w:rPr>
-          <w:i/>
-          <w:iCs/>
-        </w:rPr>
-        <w:t xml:space="preserve">loci</w:t>
-      </w:r>
-      <w:r>
-        <w:t xml:space="preserve"> </w:t>
-      </w:r>
-      <w:r>
-        <w:t xml:space="preserve">independientes mediante</w:t>
-      </w:r>
-      <w:r>
-        <w:t xml:space="preserve"> </w:t>
-      </w:r>
-      <w:r>
-        <w:rPr>
-          <w:i/>
-          <w:iCs/>
-        </w:rPr>
-        <w:t xml:space="preserve">clumping</w:t>
-      </w:r>
-      <w:r>
-        <w:t xml:space="preserve">.</w:t>
-      </w:r>
-      <w:r>
-        <w:t xml:space="preserve"> </w:t>
-      </w:r>
-      <w:r>
-        <w:t xml:space="preserve">Lo que encontramos, como se muestra en esta tabla, es que variantes fuertemente asociadas a diabetes en GWAS poblacionales, como en el gen CDKAL1 o CDKN2B, ven sus efectos reducidos casi a cero en los análisis dentro-de-familia. Esto nos demuestra empíricamente que la señal capturada por el estudio poblacional en estos</w:t>
-      </w:r>
-      <w:r>
-        <w:t xml:space="preserve"> </w:t>
-      </w:r>
-      <w:r>
-        <w:rPr>
-          <w:i/>
-          <w:iCs/>
-        </w:rPr>
-        <w:t xml:space="preserve">loci</w:t>
-      </w:r>
-      <w:r>
-        <w:t xml:space="preserve"> </w:t>
-      </w:r>
-      <w:r>
-        <w:t xml:space="preserve">era principalmente ruido originado por estratificación ambiental.</w:t>
-      </w:r>
-    </w:p>
-    <w:p>
-      <w:pPr>
-        <w:pStyle w:val="FirstParagraph"/>
-      </w:pPr>
-      <w:r>
-        <w:t xml:space="preserve">⏱️</w:t>
-      </w:r>
-      <w:r>
-        <w:t xml:space="preserve"> </w:t>
-      </w:r>
-      <w:r>
-        <w:rPr>
-          <w:i/>
-          <w:iCs/>
-        </w:rPr>
-        <w:t xml:space="preserve">~50 segundos</w:t>
+        <w:t xml:space="preserve">~15 segundos</w:t>
       </w:r>
     </w:p>
     <w:p>
@@ -4053,74 +4112,20 @@
         </w:pict>
       </w:r>
     </w:p>
-    <w:bookmarkEnd w:id="56"/>
-    <w:bookmarkEnd w:id="57"/>
-    <w:bookmarkStart w:id="62" w:name="sección-7-conclusiones-y-próximos-pasos"/>
-    <w:p>
-      <w:pPr>
-        <w:pStyle w:val="Heading1"/>
-      </w:pPr>
-      <w:r>
-        <w:t xml:space="preserve">SECCIÓN 7 — CONCLUSIONES Y PRÓXIMOS PASOS</w:t>
-      </w:r>
-    </w:p>
-    <w:bookmarkStart w:id="58" w:name="X6b1db0ca94fd25b3d5af4d1b7b694708e5eb5e6"/>
+    <w:bookmarkEnd w:id="58"/>
+    <w:bookmarkStart w:id="59" w:name="X719be405e374ccf5ec607f847ce33ff773cd869"/>
     <w:p>
       <w:pPr>
         <w:pStyle w:val="Heading2"/>
       </w:pPr>
       <w:r>
-        <w:t xml:space="preserve">SLIDE 32 —</w:t>
-      </w:r>
-      <w:r>
-        <w:t xml:space="preserve"> </w:t>
-      </w:r>
-      <w:r>
-        <w:t xml:space="preserve">“Conclusiones: Relevancia de los Modelos Familiares”</w:t>
-      </w:r>
-    </w:p>
-    <w:p>
-      <w:pPr>
-        <w:pStyle w:val="FirstParagraph"/>
-      </w:pPr>
-      <w:r>
-        <w:rPr>
-          <w:b/>
-          <w:bCs/>
-        </w:rPr>
-        <w:t xml:space="preserve">Guion:</w:t>
-      </w:r>
-    </w:p>
-    <w:p>
-      <w:pPr>
-        <w:pStyle w:val="BlockText"/>
-      </w:pPr>
-      <w:r>
-        <w:t xml:space="preserve">En primer lugar, es crucial comprender que los GWAS familiares no fungen principalmente como herramientas de descubrimiento primario de variantes causales debido a limitaciones inherentes en el tamaño de muestra, aunque algunos SNPs sí alcancen significancia genómica. Su valor clínico y epidemiológico radica en que operan como herramientas diagnósticas robustas. Nos permiten cuantificar la dirección y magnitud de los sesgos presentes en diseños de descubrimiento de mayor poder estadístico, como los GWAS poblacionales.</w:t>
-      </w:r>
-    </w:p>
-    <w:p>
-      <w:pPr>
-        <w:pStyle w:val="BlockText"/>
-      </w:pPr>
-      <w:r>
-        <w:t xml:space="preserve">En el caso específico del MCPS, observamos que el estimador robusto logra incrementar de forma eficiente el tamaño de muestra efectivo respecto a métodos análogos. Esto nos permitió constatar fehacientemente la existencia de sesgos ambientales estructurales en la cohorte.</w:t>
-      </w:r>
-    </w:p>
-    <w:p>
-      <w:pPr>
-        <w:pStyle w:val="BlockText"/>
-      </w:pPr>
-      <w:r>
-        <w:t xml:space="preserve">Finalmente, a nivel predictivo, no existe consenso histórico en que construir scores poligénicos a partir de efectos de FGWAS mejore la precisión de la predicción. Sin embargo, carecemos de evidencia empírica en poblaciones latinoamericanas. Resulta imperativo evaluar empíricamente el comportamiento de estos modelos en la población mexicana para generar evidencia conclusiva al respecto.</w:t>
-      </w:r>
-    </w:p>
-    <w:p>
-      <w:pPr>
-        <w:pStyle w:val="FirstParagraph"/>
-      </w:pPr>
-      <w:r>
-        <w:t xml:space="preserve">⏱️</w:t>
+        <w:t xml:space="preserve">SLIDE 30 —</w:t>
+      </w:r>
+      <w:r>
+        <w:t xml:space="preserve"> </w:t>
+      </w:r>
+      <w:r>
+        <w:t xml:space="preserve">“Atenuación a nivel de</w:t>
       </w:r>
       <w:r>
         <w:t xml:space="preserve"> </w:t>
@@ -4130,7 +4135,152 @@
           <w:i/>
           <w:iCs/>
         </w:rPr>
-        <w:t xml:space="preserve">~1 minuto 10 segundos</w:t>
+        <w:t xml:space="preserve">locus</w:t>
+      </w:r>
+      <w:r>
+        <w:t xml:space="preserve"> </w:t>
+      </w:r>
+      <w:r>
+        <w:t xml:space="preserve">independientes (Clumping)”</w:t>
+      </w:r>
+    </w:p>
+    <w:p>
+      <w:pPr>
+        <w:pStyle w:val="FirstParagraph"/>
+      </w:pPr>
+      <w:r>
+        <w:rPr>
+          <w:b/>
+          <w:bCs/>
+        </w:rPr>
+        <w:t xml:space="preserve">[Contenido visual]:</w:t>
+      </w:r>
+      <w:r>
+        <w:t xml:space="preserve"> </w:t>
+      </w:r>
+      <w:r>
+        <w:t xml:space="preserve">Tabla de resultados de</w:t>
+      </w:r>
+      <w:r>
+        <w:t xml:space="preserve"> </w:t>
+      </w:r>
+      <w:r>
+        <w:rPr>
+          <w:i/>
+          <w:iCs/>
+        </w:rPr>
+        <w:t xml:space="preserve">fine-mapping</w:t>
+      </w:r>
+      <w:r>
+        <w:t xml:space="preserve"> </w:t>
+      </w:r>
+      <w:r>
+        <w:t xml:space="preserve">comparando PopGWAS y FGWAS en</w:t>
+      </w:r>
+      <w:r>
+        <w:t xml:space="preserve"> </w:t>
+      </w:r>
+      <w:r>
+        <w:rPr>
+          <w:i/>
+          <w:iCs/>
+        </w:rPr>
+        <w:t xml:space="preserve">loci</w:t>
+      </w:r>
+      <w:r>
+        <w:t xml:space="preserve"> </w:t>
+      </w:r>
+      <w:r>
+        <w:t xml:space="preserve">representativos.</w:t>
+      </w:r>
+    </w:p>
+    <w:p>
+      <w:pPr>
+        <w:pStyle w:val="BodyText"/>
+      </w:pPr>
+      <w:r>
+        <w:rPr>
+          <w:b/>
+          <w:bCs/>
+        </w:rPr>
+        <w:t xml:space="preserve">Guion:</w:t>
+      </w:r>
+    </w:p>
+    <w:p>
+      <w:pPr>
+        <w:pStyle w:val="BlockText"/>
+      </w:pPr>
+      <w:r>
+        <w:t xml:space="preserve">Para confirmar que esta atenuación global en la heredabilidad también ocurre a nivel local, aislamos los</w:t>
+      </w:r>
+      <w:r>
+        <w:t xml:space="preserve"> </w:t>
+      </w:r>
+      <w:r>
+        <w:rPr>
+          <w:i/>
+          <w:iCs/>
+        </w:rPr>
+        <w:t xml:space="preserve">loci</w:t>
+      </w:r>
+      <w:r>
+        <w:t xml:space="preserve"> </w:t>
+      </w:r>
+      <w:r>
+        <w:t xml:space="preserve">independientes mediante</w:t>
+      </w:r>
+      <w:r>
+        <w:t xml:space="preserve"> </w:t>
+      </w:r>
+      <w:r>
+        <w:rPr>
+          <w:i/>
+          <w:iCs/>
+        </w:rPr>
+        <w:t xml:space="preserve">clumping</w:t>
+      </w:r>
+      <w:r>
+        <w:t xml:space="preserve">.</w:t>
+      </w:r>
+      <w:r>
+        <w:t xml:space="preserve"> </w:t>
+      </w:r>
+      <w:r>
+        <w:t xml:space="preserve">Lo que encontramos, como se muestra en esta tabla, es que variantes fuertemente asociadas a diabetes en GWAS poblacionales, como en el gen CDKAL1 o CDKN2B, ven sus efectos reducidos casi a cero en los análisis dentro-de-familia. Esto nos demuestra empíricamente que la señal capturada por el estudio poblacional en estos</w:t>
+      </w:r>
+      <w:r>
+        <w:t xml:space="preserve"> </w:t>
+      </w:r>
+      <w:r>
+        <w:rPr>
+          <w:i/>
+          <w:iCs/>
+        </w:rPr>
+        <w:t xml:space="preserve">loci</w:t>
+      </w:r>
+      <w:r>
+        <w:t xml:space="preserve"> </w:t>
+      </w:r>
+      <w:r>
+        <w:t xml:space="preserve">era principalmente ruido originado por estratificación ambiental.</w:t>
+      </w:r>
+    </w:p>
+    <w:p>
+      <w:pPr>
+        <w:pStyle w:val="FirstParagraph"/>
+      </w:pPr>
+      <w:r>
+        <w:t xml:space="preserve">⏱️</w:t>
+      </w:r>
+      <w:r>
+        <w:t xml:space="preserve"> </w:t>
+      </w:r>
+      <w:r>
+        <w:rPr>
+          <w:i/>
+          <w:iCs/>
+        </w:rPr>
+        <w:t xml:space="preserve">~50 segundos</w:t>
       </w:r>
     </w:p>
     <w:p>
@@ -4140,20 +4290,30 @@
         </w:pict>
       </w:r>
     </w:p>
-    <w:bookmarkEnd w:id="58"/>
-    <w:bookmarkStart w:id="59" w:name="Xbc5c3e3c77670c471ae0d2106bc136f31fae3c9"/>
+    <w:bookmarkEnd w:id="59"/>
+    <w:bookmarkEnd w:id="60"/>
+    <w:bookmarkStart w:id="65" w:name="sección-7-conclusiones-y-próximos-pasos"/>
+    <w:p>
+      <w:pPr>
+        <w:pStyle w:val="Heading1"/>
+      </w:pPr>
+      <w:r>
+        <w:t xml:space="preserve">SECCIÓN 7 — CONCLUSIONES Y PRÓXIMOS PASOS</w:t>
+      </w:r>
+    </w:p>
+    <w:bookmarkStart w:id="61" w:name="X6b1db0ca94fd25b3d5af4d1b7b694708e5eb5e6"/>
     <w:p>
       <w:pPr>
         <w:pStyle w:val="Heading2"/>
       </w:pPr>
       <w:r>
-        <w:t xml:space="preserve">SLIDE 33 —</w:t>
-      </w:r>
-      <w:r>
-        <w:t xml:space="preserve"> </w:t>
-      </w:r>
-      <w:r>
-        <w:t xml:space="preserve">“El Rol de la Ancestría y la Confusión Ambiental en Diabetes”</w:t>
+        <w:t xml:space="preserve">SLIDE 32 —</w:t>
+      </w:r>
+      <w:r>
+        <w:t xml:space="preserve"> </w:t>
+      </w:r>
+      <w:r>
+        <w:t xml:space="preserve">“Conclusiones: Relevancia de los Modelos Familiares”</w:t>
       </w:r>
     </w:p>
     <w:p>
@@ -4173,32 +4333,23 @@
         <w:pStyle w:val="BlockText"/>
       </w:pPr>
       <w:r>
-        <w:t xml:space="preserve">Mención aparte merece la diabetes mellitus. Clínicamente es uno de los fenotipos con mayor impacto, pero metodológicamente es uno de los rasgos que exhibe mayores niveles de sesgo en estimaciones poblacionales.</w:t>
-      </w:r>
-    </w:p>
-    <w:p>
-      <w:pPr>
-        <w:pStyle w:val="BlockText"/>
-      </w:pPr>
-      <w:r>
-        <w:t xml:space="preserve">Trabajos recientes en nuestra misma cohorte, particularmente los estudios de Torres (2026) y Wang (2025), demuestran rigurosamente la contribución de la ancestría mexicana a las elevadas prevalencias de diabetes. Si bien el componente ancestral en la incidencia es innegable, nuestros análisis intrafamiliares demuestran empíricamente que existe una inflación sistemática en estimaciones poblacionales, identificando falsos positivos en</w:t>
-      </w:r>
-      <w:r>
-        <w:t xml:space="preserve"> </w:t>
-      </w:r>
-      <w:r>
-        <w:t xml:space="preserve"> </w:t>
-      </w:r>
-      <w:r>
-        <w:t xml:space="preserve">canónicos de diabetes.</w:t>
-      </w:r>
-    </w:p>
-    <w:p>
-      <w:pPr>
-        <w:pStyle w:val="BlockText"/>
-      </w:pPr>
-      <w:r>
-        <w:t xml:space="preserve">Esta evidencia expone que los efectos de composición ambiental están fuertemente entrelazados con la estructura genómica poblacional. Por consiguiente, se acentúa la urgencia metodológica de desarrollar instrumentos de mayor precisión estadística para detectar y estratificar el riesgo genético de diabetes en las poblaciones mexicanas, separando la señal biológica de los artefactos ambientales.</w:t>
+        <w:t xml:space="preserve">En primer lugar, es crucial comprender que los GWAS familiares no fungen principalmente como herramientas de descubrimiento primario de variantes causales debido a limitaciones inherentes en el tamaño de muestra, aunque algunos SNPs sí alcancen significancia genómica. Su valor clínico y epidemiológico radica en que operan como herramientas diagnósticas robustas. Nos permiten cuantificar la dirección y magnitud de los sesgos presentes en diseños de descubrimiento de mayor poder estadístico, como los GWAS poblacionales.</w:t>
+      </w:r>
+    </w:p>
+    <w:p>
+      <w:pPr>
+        <w:pStyle w:val="BlockText"/>
+      </w:pPr>
+      <w:r>
+        <w:t xml:space="preserve">En el caso específico del MCPS, observamos que el estimador robusto logra incrementar de forma eficiente el tamaño de muestra efectivo respecto a métodos análogos. Esto nos permitió constatar fehacientemente la existencia de sesgos ambientales estructurales en la cohorte.</w:t>
+      </w:r>
+    </w:p>
+    <w:p>
+      <w:pPr>
+        <w:pStyle w:val="BlockText"/>
+      </w:pPr>
+      <w:r>
+        <w:t xml:space="preserve">Finalmente, a nivel predictivo, no existe consenso histórico en que construir scores poligénicos a partir de efectos de FGWAS mejore la precisión de la predicción. Sin embargo, carecemos de evidencia empírica en poblaciones latinoamericanas. Resulta imperativo evaluar empíricamente el comportamiento de estos modelos en la población mexicana para generar evidencia conclusiva al respecto.</w:t>
       </w:r>
     </w:p>
     <w:p>
@@ -4216,7 +4367,7 @@
           <w:i/>
           <w:iCs/>
         </w:rPr>
-        <w:t xml:space="preserve">~1 minuto</w:t>
+        <w:t xml:space="preserve">~1 minuto 10 segundos</w:t>
       </w:r>
     </w:p>
     <w:p>
@@ -4226,43 +4377,25 @@
         </w:pict>
       </w:r>
     </w:p>
-    <w:bookmarkEnd w:id="59"/>
-    <w:bookmarkStart w:id="60" w:name="Xc88cdee71baa4f29e8d9be6a5337642f4833785"/>
+    <w:bookmarkEnd w:id="61"/>
+    <w:bookmarkStart w:id="62" w:name="Xbc5c3e3c77670c471ae0d2106bc136f31fae3c9"/>
     <w:p>
       <w:pPr>
         <w:pStyle w:val="Heading2"/>
       </w:pPr>
       <w:r>
-        <w:t xml:space="preserve">SLIDE 34 —</w:t>
-      </w:r>
-      <w:r>
-        <w:t xml:space="preserve"> </w:t>
-      </w:r>
-      <w:r>
-        <w:t xml:space="preserve">“Diferencias significativas (FDR) y frecuencias alélicas”</w:t>
-      </w:r>
-    </w:p>
-    <w:p>
-      <w:pPr>
-        <w:pStyle w:val="FirstParagraph"/>
-      </w:pPr>
-      <w:r>
-        <w:rPr>
-          <w:b/>
-          <w:bCs/>
-        </w:rPr>
-        <w:t xml:space="preserve">[Contenido visual]:</w:t>
-      </w:r>
-      <w:r>
-        <w:t xml:space="preserve"> </w:t>
-      </w:r>
-      <w:r>
-        <w:t xml:space="preserve">Tabla con los SNPs que presentan diferencias de efecto significativas y sus frecuencias alélicas por ancestría.</w:t>
-      </w:r>
-    </w:p>
-    <w:p>
-      <w:pPr>
-        <w:pStyle w:val="BodyText"/>
+        <w:t xml:space="preserve">SLIDE 33 —</w:t>
+      </w:r>
+      <w:r>
+        <w:t xml:space="preserve"> </w:t>
+      </w:r>
+      <w:r>
+        <w:t xml:space="preserve">“El Rol de la Ancestría y la Confusión Ambiental en Diabetes”</w:t>
+      </w:r>
+    </w:p>
+    <w:p>
+      <w:pPr>
+        <w:pStyle w:val="FirstParagraph"/>
       </w:pPr>
       <w:r>
         <w:rPr>
@@ -4277,7 +4410,32 @@
         <w:pStyle w:val="BlockText"/>
       </w:pPr>
       <w:r>
-        <w:t xml:space="preserve">Para profundizar en estos hallazgos, analizamos específicamente los SNPs con diferencias significativas en un false discovery rate. Como observamos en esta tabla, al agregar la información de las frecuencias alélicas del MCPS, vemos claramente la distribución en individuos de ancestría indígena mexicana (IMX) frente a europea (EUR). Esto ilustra cómo la estructura poblacional puede inflar los efectos en loci que tradicionalmente asociábamos a fenotipos como la diabetes o niveles de colesterol.</w:t>
+        <w:t xml:space="preserve">Mención aparte merece la diabetes mellitus. Clínicamente es uno de los fenotipos con mayor impacto, pero metodológicamente es uno de los rasgos que exhibe mayores niveles de sesgo en estimaciones poblacionales.</w:t>
+      </w:r>
+    </w:p>
+    <w:p>
+      <w:pPr>
+        <w:pStyle w:val="BlockText"/>
+      </w:pPr>
+      <w:r>
+        <w:t xml:space="preserve">Trabajos recientes en nuestra misma cohorte, particularmente los estudios de Torres (2026) y Wang (2025), demuestran rigurosamente la contribución de la ancestría mexicana a las elevadas prevalencias de diabetes. Si bien el componente ancestral en la incidencia es innegable, nuestros análisis intrafamiliares demuestran empíricamente que existe una inflación sistemática en estimaciones poblacionales, identificando falsos positivos en</w:t>
+      </w:r>
+      <w:r>
+        <w:t xml:space="preserve"> </w:t>
+      </w:r>
+      <w:r>
+        <w:t xml:space="preserve"> </w:t>
+      </w:r>
+      <w:r>
+        <w:t xml:space="preserve">canónicos de diabetes.</w:t>
+      </w:r>
+    </w:p>
+    <w:p>
+      <w:pPr>
+        <w:pStyle w:val="BlockText"/>
+      </w:pPr>
+      <w:r>
+        <w:t xml:space="preserve">Esta evidencia expone que los efectos de composición ambiental están fuertemente entrelazados con la estructura genómica poblacional. Por consiguiente, se acentúa la urgencia metodológica de desarrollar instrumentos de mayor precisión estadística para detectar y estratificar el riesgo genético de diabetes en las poblaciones mexicanas, separando la señal biológica de los artefactos ambientales.</w:t>
       </w:r>
     </w:p>
     <w:p>
@@ -4295,7 +4453,7 @@
           <w:i/>
           <w:iCs/>
         </w:rPr>
-        <w:t xml:space="preserve">~45 segundos</w:t>
+        <w:t xml:space="preserve">~1 minuto</w:t>
       </w:r>
     </w:p>
     <w:p>
@@ -4305,8 +4463,87 @@
         </w:pict>
       </w:r>
     </w:p>
-    <w:bookmarkEnd w:id="60"/>
-    <w:bookmarkStart w:id="61" w:name="slide-35-próximos-pasos"/>
+    <w:bookmarkEnd w:id="62"/>
+    <w:bookmarkStart w:id="63" w:name="Xc88cdee71baa4f29e8d9be6a5337642f4833785"/>
+    <w:p>
+      <w:pPr>
+        <w:pStyle w:val="Heading2"/>
+      </w:pPr>
+      <w:r>
+        <w:t xml:space="preserve">SLIDE 34 —</w:t>
+      </w:r>
+      <w:r>
+        <w:t xml:space="preserve"> </w:t>
+      </w:r>
+      <w:r>
+        <w:t xml:space="preserve">“Diferencias significativas (FDR) y frecuencias alélicas”</w:t>
+      </w:r>
+    </w:p>
+    <w:p>
+      <w:pPr>
+        <w:pStyle w:val="FirstParagraph"/>
+      </w:pPr>
+      <w:r>
+        <w:rPr>
+          <w:b/>
+          <w:bCs/>
+        </w:rPr>
+        <w:t xml:space="preserve">[Contenido visual]:</w:t>
+      </w:r>
+      <w:r>
+        <w:t xml:space="preserve"> </w:t>
+      </w:r>
+      <w:r>
+        <w:t xml:space="preserve">Tabla con los SNPs que presentan diferencias de efecto significativas y sus frecuencias alélicas por ancestría.</w:t>
+      </w:r>
+    </w:p>
+    <w:p>
+      <w:pPr>
+        <w:pStyle w:val="BodyText"/>
+      </w:pPr>
+      <w:r>
+        <w:rPr>
+          <w:b/>
+          <w:bCs/>
+        </w:rPr>
+        <w:t xml:space="preserve">Guion:</w:t>
+      </w:r>
+    </w:p>
+    <w:p>
+      <w:pPr>
+        <w:pStyle w:val="BlockText"/>
+      </w:pPr>
+      <w:r>
+        <w:t xml:space="preserve">Para profundizar en estos hallazgos, analizamos específicamente los SNPs con diferencias significativas en un false discovery rate. Como observamos en esta tabla, al agregar la información de las frecuencias alélicas del MCPS, vemos claramente la distribución en individuos de ancestría indígena mexicana (IMX) frente a europea (EUR). Esto ilustra cómo la estructura poblacional puede inflar los efectos en loci que tradicionalmente asociábamos a fenotipos como la diabetes o niveles de colesterol.</w:t>
+      </w:r>
+    </w:p>
+    <w:p>
+      <w:pPr>
+        <w:pStyle w:val="FirstParagraph"/>
+      </w:pPr>
+      <w:r>
+        <w:t xml:space="preserve">⏱️</w:t>
+      </w:r>
+      <w:r>
+        <w:t xml:space="preserve"> </w:t>
+      </w:r>
+      <w:r>
+        <w:rPr>
+          <w:i/>
+          <w:iCs/>
+        </w:rPr>
+        <w:t xml:space="preserve">~45 segundos</w:t>
+      </w:r>
+    </w:p>
+    <w:p>
+      <w:r>
+        <w:pict>
+          <v:rect style="width:0;height:1.5pt" o:hralign="center" o:hrstd="t" o:hr="t"/>
+        </w:pict>
+      </w:r>
+    </w:p>
+    <w:bookmarkEnd w:id="63"/>
+    <w:bookmarkStart w:id="64" w:name="slide-35-próximos-pasos"/>
     <w:p>
       <w:pPr>
         <w:pStyle w:val="Heading2"/>
@@ -4492,9 +4729,9 @@
         </w:pict>
       </w:r>
     </w:p>
-    <w:bookmarkEnd w:id="61"/>
-    <w:bookmarkEnd w:id="62"/>
-    <w:bookmarkStart w:id="65" w:name="X3b12542ebf4e4c269161f065ef64fb189d30203"/>
+    <w:bookmarkEnd w:id="64"/>
+    <w:bookmarkEnd w:id="65"/>
+    <w:bookmarkStart w:id="68" w:name="X3b12542ebf4e4c269161f065ef64fb189d30203"/>
     <w:p>
       <w:pPr>
         <w:pStyle w:val="Heading1"/>
@@ -4503,7 +4740,7 @@
         <w:t xml:space="preserve">SECCIÓN 8 — COLABORADORES Y AGRADECIMIENTOS</w:t>
       </w:r>
     </w:p>
-    <w:bookmarkStart w:id="63" w:name="slide-34-current-collaborations"/>
+    <w:bookmarkStart w:id="66" w:name="slide-34-current-collaborations"/>
     <w:p>
       <w:pPr>
         <w:pStyle w:val="Heading2"/>
@@ -4613,8 +4850,8 @@
         </w:pict>
       </w:r>
     </w:p>
-    <w:bookmarkEnd w:id="63"/>
-    <w:bookmarkStart w:id="64" w:name="slide-35-gracias-a-todxs"/>
+    <w:bookmarkEnd w:id="66"/>
+    <w:bookmarkStart w:id="67" w:name="slide-35-gracias-a-todxs"/>
     <w:p>
       <w:pPr>
         <w:pStyle w:val="Heading2"/>
@@ -4700,9 +4937,9 @@
         </w:pict>
       </w:r>
     </w:p>
-    <w:bookmarkEnd w:id="64"/>
-    <w:bookmarkEnd w:id="65"/>
-    <w:bookmarkStart w:id="66" w:name="resumen-de-tiempos-estimados"/>
+    <w:bookmarkEnd w:id="67"/>
+    <w:bookmarkEnd w:id="68"/>
+    <w:bookmarkStart w:id="69" w:name="resumen-de-tiempos-estimados"/>
     <w:p>
       <w:pPr>
         <w:pStyle w:val="Heading1"/>
@@ -5270,8 +5507,8 @@
         </w:pict>
       </w:r>
     </w:p>
-    <w:bookmarkEnd w:id="66"/>
-    <w:bookmarkStart w:id="67" w:name="checklist-de-slides-por-completar"/>
+    <w:bookmarkEnd w:id="69"/>
+    <w:bookmarkStart w:id="70" w:name="checklist-de-slides-por-completar"/>
     <w:p>
       <w:pPr>
         <w:pStyle w:val="Heading1"/>
@@ -5694,7 +5931,7 @@
         <w:t xml:space="preserve">— Relevancia clínica</w:t>
       </w:r>
     </w:p>
-    <w:bookmarkEnd w:id="67"/>
+    <w:bookmarkEnd w:id="70"/>
     <w:sectPr>
       <w:footnotePr>
         <w:numRestart w:val="eachSect"/>

</xml_diff>

<commit_message>
2026-08-05 14:02:41: Añadir diapositivas de metodología (heredabilidad y locus) y corregir color de objetivos desactivados
</commit_message>
<xml_diff>
--- a/guion-examen-candidatura.docx
+++ b/guion-examen-candidatura.docx
@@ -2209,7 +2209,7 @@
     </w:p>
     <w:bookmarkEnd w:id="39"/>
     <w:bookmarkEnd w:id="40"/>
-    <w:bookmarkStart w:id="60" w:name="sección-5-métodos"/>
+    <w:bookmarkStart w:id="62" w:name="sección-5-métodos"/>
     <w:p>
       <w:pPr>
         <w:pStyle w:val="Heading1"/>
@@ -3519,19 +3519,19 @@
       </w:r>
     </w:p>
     <w:bookmarkEnd w:id="51"/>
-    <w:bookmarkStart w:id="52" w:name="X50ef13cf8eb7cfce47bcb0f982d737d3b989891"/>
+    <w:bookmarkStart w:id="52" w:name="X99e5664e569afaf30d2cdf4f9d4d5922fd25035"/>
     <w:p>
       <w:pPr>
         <w:pStyle w:val="Heading2"/>
       </w:pPr>
       <w:r>
-        <w:t xml:space="preserve">SLIDE 24 —</w:t>
-      </w:r>
-      <w:r>
-        <w:t xml:space="preserve"> </w:t>
-      </w:r>
-      <w:r>
-        <w:t xml:space="preserve">“Estimaciones de heredabilidad (PopGWAS vs FGWAS)”</w:t>
+        <w:t xml:space="preserve">SLIDE 24A —</w:t>
+      </w:r>
+      <w:r>
+        <w:t xml:space="preserve"> </w:t>
+      </w:r>
+      <w:r>
+        <w:t xml:space="preserve">“Resumen Metodológico: Heredabilidad”</w:t>
       </w:r>
     </w:p>
     <w:p>
@@ -3549,7 +3549,7 @@
         <w:t xml:space="preserve"> </w:t>
       </w:r>
       <w:r>
-        <w:t xml:space="preserve">Gráfica de dispersión comparando estimaciones de heredabilidad (popGWAS vs FGWAS).</w:t>
+        <w:t xml:space="preserve">Viñetas describiendo el software (SNIPAR, REGENIE, LDSC), variantes (autosomas) y la hipótesis esperada.</w:t>
       </w:r>
     </w:p>
     <w:p>
@@ -3569,7 +3569,7 @@
         <w:pStyle w:val="BlockText"/>
       </w:pPr>
       <w:r>
-        <w:t xml:space="preserve">Aquí comparamos las estimaciones de heredabilidad. Notamos que para rasgos como el nivel educativo, la heredabilidad poblacional disminuye significativamente cuando estimamos efectos directos. Esto sugiere un fuerte impacto del ambiente familiar y el emparejamiento selectivo. Sin embargo, para rasgos metabólicos como el IMC o la presión arterial, las estimaciones se mantienen bastante estables.</w:t>
+        <w:t xml:space="preserve">Para lograr esto, aplicamos el estimador robusto SNIPAR y modelos poblacionales con REGENIE sobre todas las variantes comunes, calculando la heredabilidad con LDSC. Nuestra hipótesis, basada en estudios previos, era que el modelo poblacional presentaría estimaciones infladas por la estructura poblacional, y que nuestro diseño familiar nos permitiría observar el efecto directo real.</w:t>
       </w:r>
     </w:p>
     <w:p>
@@ -3587,7 +3587,7 @@
           <w:i/>
           <w:iCs/>
         </w:rPr>
-        <w:t xml:space="preserve">~1 minuto 10 segundos</w:t>
+        <w:t xml:space="preserve">~20 segundos</w:t>
       </w:r>
     </w:p>
     <w:p>
@@ -3598,7 +3598,86 @@
       </w:r>
     </w:p>
     <w:bookmarkEnd w:id="52"/>
-    <w:bookmarkStart w:id="53" w:name="X4dae9dfbaecee2cc6f29b614439f7a7757f71e5"/>
+    <w:bookmarkStart w:id="53" w:name="X50ef13cf8eb7cfce47bcb0f982d737d3b989891"/>
+    <w:p>
+      <w:pPr>
+        <w:pStyle w:val="Heading2"/>
+      </w:pPr>
+      <w:r>
+        <w:t xml:space="preserve">SLIDE 24 —</w:t>
+      </w:r>
+      <w:r>
+        <w:t xml:space="preserve"> </w:t>
+      </w:r>
+      <w:r>
+        <w:t xml:space="preserve">“Estimaciones de heredabilidad (PopGWAS vs FGWAS)”</w:t>
+      </w:r>
+    </w:p>
+    <w:p>
+      <w:pPr>
+        <w:pStyle w:val="FirstParagraph"/>
+      </w:pPr>
+      <w:r>
+        <w:rPr>
+          <w:b/>
+          <w:bCs/>
+        </w:rPr>
+        <w:t xml:space="preserve">[Contenido visual]:</w:t>
+      </w:r>
+      <w:r>
+        <w:t xml:space="preserve"> </w:t>
+      </w:r>
+      <w:r>
+        <w:t xml:space="preserve">Gráfica de dispersión comparando estimaciones de heredabilidad (popGWAS vs FGWAS).</w:t>
+      </w:r>
+    </w:p>
+    <w:p>
+      <w:pPr>
+        <w:pStyle w:val="BodyText"/>
+      </w:pPr>
+      <w:r>
+        <w:rPr>
+          <w:b/>
+          <w:bCs/>
+        </w:rPr>
+        <w:t xml:space="preserve">Guion:</w:t>
+      </w:r>
+    </w:p>
+    <w:p>
+      <w:pPr>
+        <w:pStyle w:val="BlockText"/>
+      </w:pPr>
+      <w:r>
+        <w:t xml:space="preserve">Aquí comparamos las estimaciones de heredabilidad. Notamos que para rasgos como el nivel educativo, la heredabilidad poblacional disminuye significativamente cuando estimamos efectos directos. Esto sugiere un fuerte impacto del ambiente familiar y el emparejamiento selectivo. Sin embargo, para rasgos metabólicos como el IMC o la presión arterial, las estimaciones se mantienen bastante estables.</w:t>
+      </w:r>
+    </w:p>
+    <w:p>
+      <w:pPr>
+        <w:pStyle w:val="FirstParagraph"/>
+      </w:pPr>
+      <w:r>
+        <w:t xml:space="preserve">⏱️</w:t>
+      </w:r>
+      <w:r>
+        <w:t xml:space="preserve"> </w:t>
+      </w:r>
+      <w:r>
+        <w:rPr>
+          <w:i/>
+          <w:iCs/>
+        </w:rPr>
+        <w:t xml:space="preserve">~1 minuto 10 segundos</w:t>
+      </w:r>
+    </w:p>
+    <w:p>
+      <w:r>
+        <w:pict>
+          <v:rect style="width:0;height:1.5pt" o:hralign="center" o:hrstd="t" o:hr="t"/>
+        </w:pict>
+      </w:r>
+    </w:p>
+    <w:bookmarkEnd w:id="53"/>
+    <w:bookmarkStart w:id="54" w:name="X4dae9dfbaecee2cc6f29b614439f7a7757f71e5"/>
     <w:p>
       <w:pPr>
         <w:pStyle w:val="Heading2"/>
@@ -3702,8 +3781,8 @@
         </w:pict>
       </w:r>
     </w:p>
-    <w:bookmarkEnd w:id="53"/>
-    <w:bookmarkStart w:id="54" w:name="slide-26-correlación-de-estimadores"/>
+    <w:bookmarkEnd w:id="54"/>
+    <w:bookmarkStart w:id="55" w:name="slide-26-correlación-de-estimadores"/>
     <w:p>
       <w:pPr>
         <w:pStyle w:val="Heading2"/>
@@ -3774,8 +3853,8 @@
         <w:t xml:space="preserve">~1 minuto</w:t>
       </w:r>
     </w:p>
-    <w:bookmarkEnd w:id="54"/>
-    <w:bookmarkStart w:id="55" w:name="Xdc0e0a27211f1e5d6f8d9e6a64878059a9eab7b"/>
+    <w:bookmarkEnd w:id="55"/>
+    <w:bookmarkStart w:id="56" w:name="Xdc0e0a27211f1e5d6f8d9e6a64878059a9eab7b"/>
     <w:p>
       <w:pPr>
         <w:pStyle w:val="Heading2"/>
@@ -3853,8 +3932,8 @@
         </w:pict>
       </w:r>
     </w:p>
-    <w:bookmarkEnd w:id="55"/>
-    <w:bookmarkStart w:id="56" w:name="X81846fe6a7ad779a70556fb82333166be88b3ba"/>
+    <w:bookmarkEnd w:id="56"/>
+    <w:bookmarkStart w:id="57" w:name="X81846fe6a7ad779a70556fb82333166be88b3ba"/>
     <w:p>
       <w:pPr>
         <w:pStyle w:val="Heading2"/>
@@ -3942,8 +4021,8 @@
         </w:pict>
       </w:r>
     </w:p>
-    <w:bookmarkEnd w:id="56"/>
-    <w:bookmarkStart w:id="57" w:name="X810baa7789e6bd076b416cd36ab05183fde436e"/>
+    <w:bookmarkEnd w:id="57"/>
+    <w:bookmarkStart w:id="58" w:name="X810baa7789e6bd076b416cd36ab05183fde436e"/>
     <w:p>
       <w:pPr>
         <w:pStyle w:val="Heading2"/>
@@ -4033,8 +4112,8 @@
         </w:pict>
       </w:r>
     </w:p>
-    <w:bookmarkEnd w:id="57"/>
-    <w:bookmarkStart w:id="58" w:name="Xf2fb6112b923b37321b0cc321c443481980524c"/>
+    <w:bookmarkEnd w:id="58"/>
+    <w:bookmarkStart w:id="59" w:name="Xf2fb6112b923b37321b0cc321c443481980524c"/>
     <w:p>
       <w:pPr>
         <w:pStyle w:val="Heading2"/>
@@ -4112,20 +4191,66 @@
         </w:pict>
       </w:r>
     </w:p>
-    <w:bookmarkEnd w:id="58"/>
-    <w:bookmarkStart w:id="59" w:name="X719be405e374ccf5ec607f847ce33ff773cd869"/>
+    <w:bookmarkEnd w:id="59"/>
+    <w:bookmarkStart w:id="60" w:name="X66d9b231b30e5628852bbfea9771e7ea93f3b30"/>
     <w:p>
       <w:pPr>
         <w:pStyle w:val="Heading2"/>
       </w:pPr>
       <w:r>
-        <w:t xml:space="preserve">SLIDE 30 —</w:t>
-      </w:r>
-      <w:r>
-        <w:t xml:space="preserve"> </w:t>
-      </w:r>
-      <w:r>
-        <w:t xml:space="preserve">“Atenuación a nivel de</w:t>
+        <w:t xml:space="preserve">SLIDE 30A —</w:t>
+      </w:r>
+      <w:r>
+        <w:t xml:space="preserve"> </w:t>
+      </w:r>
+      <w:r>
+        <w:t xml:space="preserve">“Resumen Metodológico: Locus Independientes”</w:t>
+      </w:r>
+    </w:p>
+    <w:p>
+      <w:pPr>
+        <w:pStyle w:val="FirstParagraph"/>
+      </w:pPr>
+      <w:r>
+        <w:rPr>
+          <w:b/>
+          <w:bCs/>
+        </w:rPr>
+        <w:t xml:space="preserve">[Contenido visual]:</w:t>
+      </w:r>
+      <w:r>
+        <w:t xml:space="preserve"> </w:t>
+      </w:r>
+      <w:r>
+        <w:t xml:space="preserve">Viñetas describiendo el software (PLINK2, SNIPAR), las variantes analizadas (Loci genoma-significativos) y la hipótesis.</w:t>
+      </w:r>
+    </w:p>
+    <w:p>
+      <w:pPr>
+        <w:pStyle w:val="BodyText"/>
+      </w:pPr>
+      <w:r>
+        <w:rPr>
+          <w:b/>
+          <w:bCs/>
+        </w:rPr>
+        <w:t xml:space="preserve">Guion:</w:t>
+      </w:r>
+    </w:p>
+    <w:p>
+      <w:pPr>
+        <w:pStyle w:val="BlockText"/>
+      </w:pPr>
+      <w:r>
+        <w:t xml:space="preserve">Para esta etapa, filtramos nuestras asociaciones utilizando un procedimiento de clumping con PLINK2 para aislar los locus independientes con significancia genómica. Esperábamos que los efectos poblacionales estuvieran localmente inflados por confusión ambiental, y que el diseño familiar atenuara estos sesgos acercándose al verdadero efecto biológico.</w:t>
+      </w:r>
+    </w:p>
+    <w:p>
+      <w:pPr>
+        <w:pStyle w:val="FirstParagraph"/>
+      </w:pPr>
+      <w:r>
+        <w:t xml:space="preserve">⏱️</w:t>
       </w:r>
       <w:r>
         <w:t xml:space="preserve"> </w:t>
@@ -4135,152 +4260,7 @@
           <w:i/>
           <w:iCs/>
         </w:rPr>
-        <w:t xml:space="preserve">locus</w:t>
-      </w:r>
-      <w:r>
-        <w:t xml:space="preserve"> </w:t>
-      </w:r>
-      <w:r>
-        <w:t xml:space="preserve">independientes (Clumping)”</w:t>
-      </w:r>
-    </w:p>
-    <w:p>
-      <w:pPr>
-        <w:pStyle w:val="FirstParagraph"/>
-      </w:pPr>
-      <w:r>
-        <w:rPr>
-          <w:b/>
-          <w:bCs/>
-        </w:rPr>
-        <w:t xml:space="preserve">[Contenido visual]:</w:t>
-      </w:r>
-      <w:r>
-        <w:t xml:space="preserve"> </w:t>
-      </w:r>
-      <w:r>
-        <w:t xml:space="preserve">Tabla de resultados de</w:t>
-      </w:r>
-      <w:r>
-        <w:t xml:space="preserve"> </w:t>
-      </w:r>
-      <w:r>
-        <w:rPr>
-          <w:i/>
-          <w:iCs/>
-        </w:rPr>
-        <w:t xml:space="preserve">fine-mapping</w:t>
-      </w:r>
-      <w:r>
-        <w:t xml:space="preserve"> </w:t>
-      </w:r>
-      <w:r>
-        <w:t xml:space="preserve">comparando PopGWAS y FGWAS en</w:t>
-      </w:r>
-      <w:r>
-        <w:t xml:space="preserve"> </w:t>
-      </w:r>
-      <w:r>
-        <w:rPr>
-          <w:i/>
-          <w:iCs/>
-        </w:rPr>
-        <w:t xml:space="preserve">loci</w:t>
-      </w:r>
-      <w:r>
-        <w:t xml:space="preserve"> </w:t>
-      </w:r>
-      <w:r>
-        <w:t xml:space="preserve">representativos.</w:t>
-      </w:r>
-    </w:p>
-    <w:p>
-      <w:pPr>
-        <w:pStyle w:val="BodyText"/>
-      </w:pPr>
-      <w:r>
-        <w:rPr>
-          <w:b/>
-          <w:bCs/>
-        </w:rPr>
-        <w:t xml:space="preserve">Guion:</w:t>
-      </w:r>
-    </w:p>
-    <w:p>
-      <w:pPr>
-        <w:pStyle w:val="BlockText"/>
-      </w:pPr>
-      <w:r>
-        <w:t xml:space="preserve">Para confirmar que esta atenuación global en la heredabilidad también ocurre a nivel local, aislamos los</w:t>
-      </w:r>
-      <w:r>
-        <w:t xml:space="preserve"> </w:t>
-      </w:r>
-      <w:r>
-        <w:rPr>
-          <w:i/>
-          <w:iCs/>
-        </w:rPr>
-        <w:t xml:space="preserve">loci</w:t>
-      </w:r>
-      <w:r>
-        <w:t xml:space="preserve"> </w:t>
-      </w:r>
-      <w:r>
-        <w:t xml:space="preserve">independientes mediante</w:t>
-      </w:r>
-      <w:r>
-        <w:t xml:space="preserve"> </w:t>
-      </w:r>
-      <w:r>
-        <w:rPr>
-          <w:i/>
-          <w:iCs/>
-        </w:rPr>
-        <w:t xml:space="preserve">clumping</w:t>
-      </w:r>
-      <w:r>
-        <w:t xml:space="preserve">.</w:t>
-      </w:r>
-      <w:r>
-        <w:t xml:space="preserve"> </w:t>
-      </w:r>
-      <w:r>
-        <w:t xml:space="preserve">Lo que encontramos, como se muestra en esta tabla, es que variantes fuertemente asociadas a diabetes en GWAS poblacionales, como en el gen CDKAL1 o CDKN2B, ven sus efectos reducidos casi a cero en los análisis dentro-de-familia. Esto nos demuestra empíricamente que la señal capturada por el estudio poblacional en estos</w:t>
-      </w:r>
-      <w:r>
-        <w:t xml:space="preserve"> </w:t>
-      </w:r>
-      <w:r>
-        <w:rPr>
-          <w:i/>
-          <w:iCs/>
-        </w:rPr>
-        <w:t xml:space="preserve">loci</w:t>
-      </w:r>
-      <w:r>
-        <w:t xml:space="preserve"> </w:t>
-      </w:r>
-      <w:r>
-        <w:t xml:space="preserve">era principalmente ruido originado por estratificación ambiental.</w:t>
-      </w:r>
-    </w:p>
-    <w:p>
-      <w:pPr>
-        <w:pStyle w:val="FirstParagraph"/>
-      </w:pPr>
-      <w:r>
-        <w:t xml:space="preserve">⏱️</w:t>
-      </w:r>
-      <w:r>
-        <w:t xml:space="preserve"> </w:t>
-      </w:r>
-      <w:r>
-        <w:rPr>
-          <w:i/>
-          <w:iCs/>
-        </w:rPr>
-        <w:t xml:space="preserve">~50 segundos</w:t>
+        <w:t xml:space="preserve">~20 segundos</w:t>
       </w:r>
     </w:p>
     <w:p>
@@ -4290,74 +4270,20 @@
         </w:pict>
       </w:r>
     </w:p>
-    <w:bookmarkEnd w:id="59"/>
     <w:bookmarkEnd w:id="60"/>
-    <w:bookmarkStart w:id="65" w:name="sección-7-conclusiones-y-próximos-pasos"/>
-    <w:p>
-      <w:pPr>
-        <w:pStyle w:val="Heading1"/>
-      </w:pPr>
-      <w:r>
-        <w:t xml:space="preserve">SECCIÓN 7 — CONCLUSIONES Y PRÓXIMOS PASOS</w:t>
-      </w:r>
-    </w:p>
-    <w:bookmarkStart w:id="61" w:name="X6b1db0ca94fd25b3d5af4d1b7b694708e5eb5e6"/>
+    <w:bookmarkStart w:id="61" w:name="X719be405e374ccf5ec607f847ce33ff773cd869"/>
     <w:p>
       <w:pPr>
         <w:pStyle w:val="Heading2"/>
       </w:pPr>
       <w:r>
-        <w:t xml:space="preserve">SLIDE 32 —</w:t>
-      </w:r>
-      <w:r>
-        <w:t xml:space="preserve"> </w:t>
-      </w:r>
-      <w:r>
-        <w:t xml:space="preserve">“Conclusiones: Relevancia de los Modelos Familiares”</w:t>
-      </w:r>
-    </w:p>
-    <w:p>
-      <w:pPr>
-        <w:pStyle w:val="FirstParagraph"/>
-      </w:pPr>
-      <w:r>
-        <w:rPr>
-          <w:b/>
-          <w:bCs/>
-        </w:rPr>
-        <w:t xml:space="preserve">Guion:</w:t>
-      </w:r>
-    </w:p>
-    <w:p>
-      <w:pPr>
-        <w:pStyle w:val="BlockText"/>
-      </w:pPr>
-      <w:r>
-        <w:t xml:space="preserve">En primer lugar, es crucial comprender que los GWAS familiares no fungen principalmente como herramientas de descubrimiento primario de variantes causales debido a limitaciones inherentes en el tamaño de muestra, aunque algunos SNPs sí alcancen significancia genómica. Su valor clínico y epidemiológico radica en que operan como herramientas diagnósticas robustas. Nos permiten cuantificar la dirección y magnitud de los sesgos presentes en diseños de descubrimiento de mayor poder estadístico, como los GWAS poblacionales.</w:t>
-      </w:r>
-    </w:p>
-    <w:p>
-      <w:pPr>
-        <w:pStyle w:val="BlockText"/>
-      </w:pPr>
-      <w:r>
-        <w:t xml:space="preserve">En el caso específico del MCPS, observamos que el estimador robusto logra incrementar de forma eficiente el tamaño de muestra efectivo respecto a métodos análogos. Esto nos permitió constatar fehacientemente la existencia de sesgos ambientales estructurales en la cohorte.</w:t>
-      </w:r>
-    </w:p>
-    <w:p>
-      <w:pPr>
-        <w:pStyle w:val="BlockText"/>
-      </w:pPr>
-      <w:r>
-        <w:t xml:space="preserve">Finalmente, a nivel predictivo, no existe consenso histórico en que construir scores poligénicos a partir de efectos de FGWAS mejore la precisión de la predicción. Sin embargo, carecemos de evidencia empírica en poblaciones latinoamericanas. Resulta imperativo evaluar empíricamente el comportamiento de estos modelos en la población mexicana para generar evidencia conclusiva al respecto.</w:t>
-      </w:r>
-    </w:p>
-    <w:p>
-      <w:pPr>
-        <w:pStyle w:val="FirstParagraph"/>
-      </w:pPr>
-      <w:r>
-        <w:t xml:space="preserve">⏱️</w:t>
+        <w:t xml:space="preserve">SLIDE 30 —</w:t>
+      </w:r>
+      <w:r>
+        <w:t xml:space="preserve"> </w:t>
+      </w:r>
+      <w:r>
+        <w:t xml:space="preserve">“Atenuación a nivel de</w:t>
       </w:r>
       <w:r>
         <w:t xml:space="preserve"> </w:t>
@@ -4367,7 +4293,152 @@
           <w:i/>
           <w:iCs/>
         </w:rPr>
-        <w:t xml:space="preserve">~1 minuto 10 segundos</w:t>
+        <w:t xml:space="preserve">locus</w:t>
+      </w:r>
+      <w:r>
+        <w:t xml:space="preserve"> </w:t>
+      </w:r>
+      <w:r>
+        <w:t xml:space="preserve">independientes (Clumping)”</w:t>
+      </w:r>
+    </w:p>
+    <w:p>
+      <w:pPr>
+        <w:pStyle w:val="FirstParagraph"/>
+      </w:pPr>
+      <w:r>
+        <w:rPr>
+          <w:b/>
+          <w:bCs/>
+        </w:rPr>
+        <w:t xml:space="preserve">[Contenido visual]:</w:t>
+      </w:r>
+      <w:r>
+        <w:t xml:space="preserve"> </w:t>
+      </w:r>
+      <w:r>
+        <w:t xml:space="preserve">Tabla de resultados de</w:t>
+      </w:r>
+      <w:r>
+        <w:t xml:space="preserve"> </w:t>
+      </w:r>
+      <w:r>
+        <w:rPr>
+          <w:i/>
+          <w:iCs/>
+        </w:rPr>
+        <w:t xml:space="preserve">fine-mapping</w:t>
+      </w:r>
+      <w:r>
+        <w:t xml:space="preserve"> </w:t>
+      </w:r>
+      <w:r>
+        <w:t xml:space="preserve">comparando PopGWAS y FGWAS en</w:t>
+      </w:r>
+      <w:r>
+        <w:t xml:space="preserve"> </w:t>
+      </w:r>
+      <w:r>
+        <w:rPr>
+          <w:i/>
+          <w:iCs/>
+        </w:rPr>
+        <w:t xml:space="preserve">loci</w:t>
+      </w:r>
+      <w:r>
+        <w:t xml:space="preserve"> </w:t>
+      </w:r>
+      <w:r>
+        <w:t xml:space="preserve">representativos.</w:t>
+      </w:r>
+    </w:p>
+    <w:p>
+      <w:pPr>
+        <w:pStyle w:val="BodyText"/>
+      </w:pPr>
+      <w:r>
+        <w:rPr>
+          <w:b/>
+          <w:bCs/>
+        </w:rPr>
+        <w:t xml:space="preserve">Guion:</w:t>
+      </w:r>
+    </w:p>
+    <w:p>
+      <w:pPr>
+        <w:pStyle w:val="BlockText"/>
+      </w:pPr>
+      <w:r>
+        <w:t xml:space="preserve">Para confirmar que esta atenuación global en la heredabilidad también ocurre a nivel local, aislamos los</w:t>
+      </w:r>
+      <w:r>
+        <w:t xml:space="preserve"> </w:t>
+      </w:r>
+      <w:r>
+        <w:rPr>
+          <w:i/>
+          <w:iCs/>
+        </w:rPr>
+        <w:t xml:space="preserve">loci</w:t>
+      </w:r>
+      <w:r>
+        <w:t xml:space="preserve"> </w:t>
+      </w:r>
+      <w:r>
+        <w:t xml:space="preserve">independientes mediante</w:t>
+      </w:r>
+      <w:r>
+        <w:t xml:space="preserve"> </w:t>
+      </w:r>
+      <w:r>
+        <w:rPr>
+          <w:i/>
+          <w:iCs/>
+        </w:rPr>
+        <w:t xml:space="preserve">clumping</w:t>
+      </w:r>
+      <w:r>
+        <w:t xml:space="preserve">.</w:t>
+      </w:r>
+      <w:r>
+        <w:t xml:space="preserve"> </w:t>
+      </w:r>
+      <w:r>
+        <w:t xml:space="preserve">Lo que encontramos, como se muestra en esta tabla, es que variantes fuertemente asociadas a diabetes en GWAS poblacionales, como en el gen CDKAL1 o CDKN2B, ven sus efectos reducidos casi a cero en los análisis dentro-de-familia. Esto nos demuestra empíricamente que la señal capturada por el estudio poblacional en estos</w:t>
+      </w:r>
+      <w:r>
+        <w:t xml:space="preserve"> </w:t>
+      </w:r>
+      <w:r>
+        <w:rPr>
+          <w:i/>
+          <w:iCs/>
+        </w:rPr>
+        <w:t xml:space="preserve">loci</w:t>
+      </w:r>
+      <w:r>
+        <w:t xml:space="preserve"> </w:t>
+      </w:r>
+      <w:r>
+        <w:t xml:space="preserve">era principalmente ruido originado por estratificación ambiental.</w:t>
+      </w:r>
+    </w:p>
+    <w:p>
+      <w:pPr>
+        <w:pStyle w:val="FirstParagraph"/>
+      </w:pPr>
+      <w:r>
+        <w:t xml:space="preserve">⏱️</w:t>
+      </w:r>
+      <w:r>
+        <w:t xml:space="preserve"> </w:t>
+      </w:r>
+      <w:r>
+        <w:rPr>
+          <w:i/>
+          <w:iCs/>
+        </w:rPr>
+        <w:t xml:space="preserve">~50 segundos</w:t>
       </w:r>
     </w:p>
     <w:p>
@@ -4378,19 +4449,29 @@
       </w:r>
     </w:p>
     <w:bookmarkEnd w:id="61"/>
-    <w:bookmarkStart w:id="62" w:name="Xbc5c3e3c77670c471ae0d2106bc136f31fae3c9"/>
+    <w:bookmarkEnd w:id="62"/>
+    <w:bookmarkStart w:id="67" w:name="sección-7-conclusiones-y-próximos-pasos"/>
+    <w:p>
+      <w:pPr>
+        <w:pStyle w:val="Heading1"/>
+      </w:pPr>
+      <w:r>
+        <w:t xml:space="preserve">SECCIÓN 7 — CONCLUSIONES Y PRÓXIMOS PASOS</w:t>
+      </w:r>
+    </w:p>
+    <w:bookmarkStart w:id="63" w:name="X6b1db0ca94fd25b3d5af4d1b7b694708e5eb5e6"/>
     <w:p>
       <w:pPr>
         <w:pStyle w:val="Heading2"/>
       </w:pPr>
       <w:r>
-        <w:t xml:space="preserve">SLIDE 33 —</w:t>
-      </w:r>
-      <w:r>
-        <w:t xml:space="preserve"> </w:t>
-      </w:r>
-      <w:r>
-        <w:t xml:space="preserve">“El Rol de la Ancestría y la Confusión Ambiental en Diabetes”</w:t>
+        <w:t xml:space="preserve">SLIDE 32 —</w:t>
+      </w:r>
+      <w:r>
+        <w:t xml:space="preserve"> </w:t>
+      </w:r>
+      <w:r>
+        <w:t xml:space="preserve">“Conclusiones: Relevancia de los Modelos Familiares”</w:t>
       </w:r>
     </w:p>
     <w:p>
@@ -4410,32 +4491,23 @@
         <w:pStyle w:val="BlockText"/>
       </w:pPr>
       <w:r>
-        <w:t xml:space="preserve">Mención aparte merece la diabetes mellitus. Clínicamente es uno de los fenotipos con mayor impacto, pero metodológicamente es uno de los rasgos que exhibe mayores niveles de sesgo en estimaciones poblacionales.</w:t>
-      </w:r>
-    </w:p>
-    <w:p>
-      <w:pPr>
-        <w:pStyle w:val="BlockText"/>
-      </w:pPr>
-      <w:r>
-        <w:t xml:space="preserve">Trabajos recientes en nuestra misma cohorte, particularmente los estudios de Torres (2026) y Wang (2025), demuestran rigurosamente la contribución de la ancestría mexicana a las elevadas prevalencias de diabetes. Si bien el componente ancestral en la incidencia es innegable, nuestros análisis intrafamiliares demuestran empíricamente que existe una inflación sistemática en estimaciones poblacionales, identificando falsos positivos en</w:t>
-      </w:r>
-      <w:r>
-        <w:t xml:space="preserve"> </w:t>
-      </w:r>
-      <w:r>
-        <w:t xml:space="preserve"> </w:t>
-      </w:r>
-      <w:r>
-        <w:t xml:space="preserve">canónicos de diabetes.</w:t>
-      </w:r>
-    </w:p>
-    <w:p>
-      <w:pPr>
-        <w:pStyle w:val="BlockText"/>
-      </w:pPr>
-      <w:r>
-        <w:t xml:space="preserve">Esta evidencia expone que los efectos de composición ambiental están fuertemente entrelazados con la estructura genómica poblacional. Por consiguiente, se acentúa la urgencia metodológica de desarrollar instrumentos de mayor precisión estadística para detectar y estratificar el riesgo genético de diabetes en las poblaciones mexicanas, separando la señal biológica de los artefactos ambientales.</w:t>
+        <w:t xml:space="preserve">En primer lugar, es crucial comprender que los GWAS familiares no fungen principalmente como herramientas de descubrimiento primario de variantes causales debido a limitaciones inherentes en el tamaño de muestra, aunque algunos SNPs sí alcancen significancia genómica. Su valor clínico y epidemiológico radica en que operan como herramientas diagnósticas robustas. Nos permiten cuantificar la dirección y magnitud de los sesgos presentes en diseños de descubrimiento de mayor poder estadístico, como los GWAS poblacionales.</w:t>
+      </w:r>
+    </w:p>
+    <w:p>
+      <w:pPr>
+        <w:pStyle w:val="BlockText"/>
+      </w:pPr>
+      <w:r>
+        <w:t xml:space="preserve">En el caso específico del MCPS, observamos que el estimador robusto logra incrementar de forma eficiente el tamaño de muestra efectivo respecto a métodos análogos. Esto nos permitió constatar fehacientemente la existencia de sesgos ambientales estructurales en la cohorte.</w:t>
+      </w:r>
+    </w:p>
+    <w:p>
+      <w:pPr>
+        <w:pStyle w:val="BlockText"/>
+      </w:pPr>
+      <w:r>
+        <w:t xml:space="preserve">Finalmente, a nivel predictivo, no existe consenso histórico en que construir scores poligénicos a partir de efectos de FGWAS mejore la precisión de la predicción. Sin embargo, carecemos de evidencia empírica en poblaciones latinoamericanas. Resulta imperativo evaluar empíricamente el comportamiento de estos modelos en la población mexicana para generar evidencia conclusiva al respecto.</w:t>
       </w:r>
     </w:p>
     <w:p>
@@ -4453,7 +4525,7 @@
           <w:i/>
           <w:iCs/>
         </w:rPr>
-        <w:t xml:space="preserve">~1 minuto</w:t>
+        <w:t xml:space="preserve">~1 minuto 10 segundos</w:t>
       </w:r>
     </w:p>
     <w:p>
@@ -4463,43 +4535,25 @@
         </w:pict>
       </w:r>
     </w:p>
-    <w:bookmarkEnd w:id="62"/>
-    <w:bookmarkStart w:id="63" w:name="Xc88cdee71baa4f29e8d9be6a5337642f4833785"/>
+    <w:bookmarkEnd w:id="63"/>
+    <w:bookmarkStart w:id="64" w:name="Xbc5c3e3c77670c471ae0d2106bc136f31fae3c9"/>
     <w:p>
       <w:pPr>
         <w:pStyle w:val="Heading2"/>
       </w:pPr>
       <w:r>
-        <w:t xml:space="preserve">SLIDE 34 —</w:t>
-      </w:r>
-      <w:r>
-        <w:t xml:space="preserve"> </w:t>
-      </w:r>
-      <w:r>
-        <w:t xml:space="preserve">“Diferencias significativas (FDR) y frecuencias alélicas”</w:t>
-      </w:r>
-    </w:p>
-    <w:p>
-      <w:pPr>
-        <w:pStyle w:val="FirstParagraph"/>
-      </w:pPr>
-      <w:r>
-        <w:rPr>
-          <w:b/>
-          <w:bCs/>
-        </w:rPr>
-        <w:t xml:space="preserve">[Contenido visual]:</w:t>
-      </w:r>
-      <w:r>
-        <w:t xml:space="preserve"> </w:t>
-      </w:r>
-      <w:r>
-        <w:t xml:space="preserve">Tabla con los SNPs que presentan diferencias de efecto significativas y sus frecuencias alélicas por ancestría.</w:t>
-      </w:r>
-    </w:p>
-    <w:p>
-      <w:pPr>
-        <w:pStyle w:val="BodyText"/>
+        <w:t xml:space="preserve">SLIDE 33 —</w:t>
+      </w:r>
+      <w:r>
+        <w:t xml:space="preserve"> </w:t>
+      </w:r>
+      <w:r>
+        <w:t xml:space="preserve">“El Rol de la Ancestría y la Confusión Ambiental en Diabetes”</w:t>
+      </w:r>
+    </w:p>
+    <w:p>
+      <w:pPr>
+        <w:pStyle w:val="FirstParagraph"/>
       </w:pPr>
       <w:r>
         <w:rPr>
@@ -4514,7 +4568,32 @@
         <w:pStyle w:val="BlockText"/>
       </w:pPr>
       <w:r>
-        <w:t xml:space="preserve">Para profundizar en estos hallazgos, analizamos específicamente los SNPs con diferencias significativas en un false discovery rate. Como observamos en esta tabla, al agregar la información de las frecuencias alélicas del MCPS, vemos claramente la distribución en individuos de ancestría indígena mexicana (IMX) frente a europea (EUR). Esto ilustra cómo la estructura poblacional puede inflar los efectos en loci que tradicionalmente asociábamos a fenotipos como la diabetes o niveles de colesterol.</w:t>
+        <w:t xml:space="preserve">Mención aparte merece la diabetes mellitus. Clínicamente es uno de los fenotipos con mayor impacto, pero metodológicamente es uno de los rasgos que exhibe mayores niveles de sesgo en estimaciones poblacionales.</w:t>
+      </w:r>
+    </w:p>
+    <w:p>
+      <w:pPr>
+        <w:pStyle w:val="BlockText"/>
+      </w:pPr>
+      <w:r>
+        <w:t xml:space="preserve">Trabajos recientes en nuestra misma cohorte, particularmente los estudios de Torres (2026) y Wang (2025), demuestran rigurosamente la contribución de la ancestría mexicana a las elevadas prevalencias de diabetes. Si bien el componente ancestral en la incidencia es innegable, nuestros análisis intrafamiliares demuestran empíricamente que existe una inflación sistemática en estimaciones poblacionales, identificando falsos positivos en</w:t>
+      </w:r>
+      <w:r>
+        <w:t xml:space="preserve"> </w:t>
+      </w:r>
+      <w:r>
+        <w:t xml:space="preserve"> </w:t>
+      </w:r>
+      <w:r>
+        <w:t xml:space="preserve">canónicos de diabetes.</w:t>
+      </w:r>
+    </w:p>
+    <w:p>
+      <w:pPr>
+        <w:pStyle w:val="BlockText"/>
+      </w:pPr>
+      <w:r>
+        <w:t xml:space="preserve">Esta evidencia expone que los efectos de composición ambiental están fuertemente entrelazados con la estructura genómica poblacional. Por consiguiente, se acentúa la urgencia metodológica de desarrollar instrumentos de mayor precisión estadística para detectar y estratificar el riesgo genético de diabetes en las poblaciones mexicanas, separando la señal biológica de los artefactos ambientales.</w:t>
       </w:r>
     </w:p>
     <w:p>
@@ -4532,7 +4611,7 @@
           <w:i/>
           <w:iCs/>
         </w:rPr>
-        <w:t xml:space="preserve">~45 segundos</w:t>
+        <w:t xml:space="preserve">~1 minuto</w:t>
       </w:r>
     </w:p>
     <w:p>
@@ -4542,8 +4621,87 @@
         </w:pict>
       </w:r>
     </w:p>
-    <w:bookmarkEnd w:id="63"/>
-    <w:bookmarkStart w:id="64" w:name="slide-35-próximos-pasos"/>
+    <w:bookmarkEnd w:id="64"/>
+    <w:bookmarkStart w:id="65" w:name="Xc88cdee71baa4f29e8d9be6a5337642f4833785"/>
+    <w:p>
+      <w:pPr>
+        <w:pStyle w:val="Heading2"/>
+      </w:pPr>
+      <w:r>
+        <w:t xml:space="preserve">SLIDE 34 —</w:t>
+      </w:r>
+      <w:r>
+        <w:t xml:space="preserve"> </w:t>
+      </w:r>
+      <w:r>
+        <w:t xml:space="preserve">“Diferencias significativas (FDR) y frecuencias alélicas”</w:t>
+      </w:r>
+    </w:p>
+    <w:p>
+      <w:pPr>
+        <w:pStyle w:val="FirstParagraph"/>
+      </w:pPr>
+      <w:r>
+        <w:rPr>
+          <w:b/>
+          <w:bCs/>
+        </w:rPr>
+        <w:t xml:space="preserve">[Contenido visual]:</w:t>
+      </w:r>
+      <w:r>
+        <w:t xml:space="preserve"> </w:t>
+      </w:r>
+      <w:r>
+        <w:t xml:space="preserve">Tabla con los SNPs que presentan diferencias de efecto significativas y sus frecuencias alélicas por ancestría.</w:t>
+      </w:r>
+    </w:p>
+    <w:p>
+      <w:pPr>
+        <w:pStyle w:val="BodyText"/>
+      </w:pPr>
+      <w:r>
+        <w:rPr>
+          <w:b/>
+          <w:bCs/>
+        </w:rPr>
+        <w:t xml:space="preserve">Guion:</w:t>
+      </w:r>
+    </w:p>
+    <w:p>
+      <w:pPr>
+        <w:pStyle w:val="BlockText"/>
+      </w:pPr>
+      <w:r>
+        <w:t xml:space="preserve">Para profundizar en estos hallazgos, analizamos específicamente los SNPs con diferencias significativas en un false discovery rate. Como observamos en esta tabla, al agregar la información de las frecuencias alélicas del MCPS, vemos claramente la distribución en individuos de ancestría indígena mexicana (IMX) frente a europea (EUR). Esto ilustra cómo la estructura poblacional puede inflar los efectos en loci que tradicionalmente asociábamos a fenotipos como la diabetes o niveles de colesterol.</w:t>
+      </w:r>
+    </w:p>
+    <w:p>
+      <w:pPr>
+        <w:pStyle w:val="FirstParagraph"/>
+      </w:pPr>
+      <w:r>
+        <w:t xml:space="preserve">⏱️</w:t>
+      </w:r>
+      <w:r>
+        <w:t xml:space="preserve"> </w:t>
+      </w:r>
+      <w:r>
+        <w:rPr>
+          <w:i/>
+          <w:iCs/>
+        </w:rPr>
+        <w:t xml:space="preserve">~45 segundos</w:t>
+      </w:r>
+    </w:p>
+    <w:p>
+      <w:r>
+        <w:pict>
+          <v:rect style="width:0;height:1.5pt" o:hralign="center" o:hrstd="t" o:hr="t"/>
+        </w:pict>
+      </w:r>
+    </w:p>
+    <w:bookmarkEnd w:id="65"/>
+    <w:bookmarkStart w:id="66" w:name="slide-35-próximos-pasos"/>
     <w:p>
       <w:pPr>
         <w:pStyle w:val="Heading2"/>
@@ -4729,9 +4887,9 @@
         </w:pict>
       </w:r>
     </w:p>
-    <w:bookmarkEnd w:id="64"/>
-    <w:bookmarkEnd w:id="65"/>
-    <w:bookmarkStart w:id="68" w:name="X3b12542ebf4e4c269161f065ef64fb189d30203"/>
+    <w:bookmarkEnd w:id="66"/>
+    <w:bookmarkEnd w:id="67"/>
+    <w:bookmarkStart w:id="70" w:name="X3b12542ebf4e4c269161f065ef64fb189d30203"/>
     <w:p>
       <w:pPr>
         <w:pStyle w:val="Heading1"/>
@@ -4740,7 +4898,7 @@
         <w:t xml:space="preserve">SECCIÓN 8 — COLABORADORES Y AGRADECIMIENTOS</w:t>
       </w:r>
     </w:p>
-    <w:bookmarkStart w:id="66" w:name="slide-34-current-collaborations"/>
+    <w:bookmarkStart w:id="68" w:name="slide-34-current-collaborations"/>
     <w:p>
       <w:pPr>
         <w:pStyle w:val="Heading2"/>
@@ -4850,8 +5008,8 @@
         </w:pict>
       </w:r>
     </w:p>
-    <w:bookmarkEnd w:id="66"/>
-    <w:bookmarkStart w:id="67" w:name="slide-35-gracias-a-todxs"/>
+    <w:bookmarkEnd w:id="68"/>
+    <w:bookmarkStart w:id="69" w:name="slide-35-gracias-a-todxs"/>
     <w:p>
       <w:pPr>
         <w:pStyle w:val="Heading2"/>
@@ -4937,9 +5095,9 @@
         </w:pict>
       </w:r>
     </w:p>
-    <w:bookmarkEnd w:id="67"/>
-    <w:bookmarkEnd w:id="68"/>
-    <w:bookmarkStart w:id="69" w:name="resumen-de-tiempos-estimados"/>
+    <w:bookmarkEnd w:id="69"/>
+    <w:bookmarkEnd w:id="70"/>
+    <w:bookmarkStart w:id="71" w:name="resumen-de-tiempos-estimados"/>
     <w:p>
       <w:pPr>
         <w:pStyle w:val="Heading1"/>
@@ -5507,8 +5665,8 @@
         </w:pict>
       </w:r>
     </w:p>
-    <w:bookmarkEnd w:id="69"/>
-    <w:bookmarkStart w:id="70" w:name="checklist-de-slides-por-completar"/>
+    <w:bookmarkEnd w:id="71"/>
+    <w:bookmarkStart w:id="72" w:name="checklist-de-slides-por-completar"/>
     <w:p>
       <w:pPr>
         <w:pStyle w:val="Heading1"/>
@@ -5931,7 +6089,7 @@
         <w:t xml:space="preserve">— Relevancia clínica</w:t>
       </w:r>
     </w:p>
-    <w:bookmarkEnd w:id="70"/>
+    <w:bookmarkEnd w:id="72"/>
     <w:sectPr>
       <w:footnotePr>
         <w:numRestart w:val="eachSect"/>

</xml_diff>

<commit_message>
2026-08-05 14:06:05: Unificar diapositivas de conclusiones y reenumerar guion
</commit_message>
<xml_diff>
--- a/guion-examen-candidatura.docx
+++ b/guion-examen-candidatura.docx
@@ -4450,7 +4450,7 @@
     </w:p>
     <w:bookmarkEnd w:id="61"/>
     <w:bookmarkEnd w:id="62"/>
-    <w:bookmarkStart w:id="67" w:name="sección-7-conclusiones-y-próximos-pasos"/>
+    <w:bookmarkStart w:id="66" w:name="sección-7-conclusiones-y-próximos-pasos"/>
     <w:p>
       <w:pPr>
         <w:pStyle w:val="Heading1"/>
@@ -4483,6 +4483,24 @@
           <w:b/>
           <w:bCs/>
         </w:rPr>
+        <w:t xml:space="preserve">[Contenido visual]:</w:t>
+      </w:r>
+      <w:r>
+        <w:t xml:space="preserve"> </w:t>
+      </w:r>
+      <w:r>
+        <w:t xml:space="preserve">Viñetas resumiendo (1) Diagnóstico de Sesgos, (2) Poder Estadístico en MCPS, y (3) Predicción de Riesgo, con sub-viñetas ejemplificando nuestros resultados en diabetes, tamaño de muestra y PRS.</w:t>
+      </w:r>
+    </w:p>
+    <w:p>
+      <w:pPr>
+        <w:pStyle w:val="BodyText"/>
+      </w:pPr>
+      <w:r>
+        <w:rPr>
+          <w:b/>
+          <w:bCs/>
+        </w:rPr>
         <w:t xml:space="preserve">Guion:</w:t>
       </w:r>
     </w:p>
@@ -4491,23 +4509,31 @@
         <w:pStyle w:val="BlockText"/>
       </w:pPr>
       <w:r>
-        <w:t xml:space="preserve">En primer lugar, es crucial comprender que los GWAS familiares no fungen principalmente como herramientas de descubrimiento primario de variantes causales debido a limitaciones inherentes en el tamaño de muestra, aunque algunos SNPs sí alcancen significancia genómica. Su valor clínico y epidemiológico radica en que operan como herramientas diagnósticas robustas. Nos permiten cuantificar la dirección y magnitud de los sesgos presentes en diseños de descubrimiento de mayor poder estadístico, como los GWAS poblacionales.</w:t>
-      </w:r>
-    </w:p>
-    <w:p>
-      <w:pPr>
-        <w:pStyle w:val="BlockText"/>
-      </w:pPr>
-      <w:r>
-        <w:t xml:space="preserve">En el caso específico del MCPS, observamos que el estimador robusto logra incrementar de forma eficiente el tamaño de muestra efectivo respecto a métodos análogos. Esto nos permitió constatar fehacientemente la existencia de sesgos ambientales estructurales en la cohorte.</w:t>
-      </w:r>
-    </w:p>
-    <w:p>
-      <w:pPr>
-        <w:pStyle w:val="BlockText"/>
-      </w:pPr>
-      <w:r>
-        <w:t xml:space="preserve">Finalmente, a nivel predictivo, no existe consenso histórico en que construir scores poligénicos a partir de efectos de FGWAS mejore la precisión de la predicción. Sin embargo, carecemos de evidencia empírica en poblaciones latinoamericanas. Resulta imperativo evaluar empíricamente el comportamiento de estos modelos en la población mexicana para generar evidencia conclusiva al respecto.</w:t>
+        <w:t xml:space="preserve">Para concluir, agrupamos la relevancia de nuestros modelos familiares en tres puntos clave.</w:t>
+      </w:r>
+    </w:p>
+    <w:p>
+      <w:pPr>
+        <w:pStyle w:val="BlockText"/>
+      </w:pPr>
+      <w:r>
+        <w:t xml:space="preserve">En primer lugar, es crucial comprender que los GWAS familiares operan como herramientas diagnósticas. Como ejemplo destacado, en diabetes mellitus —un fenotipo con alto sesgo poblacional y fuertemente ligado a la ancestría según reportes recientes— logramos identificar falsos positivos en loci canónicos que estaban impulsados meramente por confusión ambiental.</w:t>
+      </w:r>
+    </w:p>
+    <w:p>
+      <w:pPr>
+        <w:pStyle w:val="BlockText"/>
+      </w:pPr>
+      <w:r>
+        <w:t xml:space="preserve">En segundo lugar, al implementar el estimador robusto, logramos incrementar nuestro poder estadístico con un tamaño de muestra aproximadamente 36% mayor que los diseños clásicos. Esto nos permitió constatar fehacientemente la existencia de dichos sesgos estructurales sin perder información valiosa.</w:t>
+      </w:r>
+    </w:p>
+    <w:p>
+      <w:pPr>
+        <w:pStyle w:val="BlockText"/>
+      </w:pPr>
+      <w:r>
+        <w:t xml:space="preserve">Finalmente, de cara al futuro, resulta imperativo desarrollar herramientas de predicción más precisas para México. Evaluar empíricamente si los scores poligénicos derivados de estimaciones familiares mejoran nuestra precisión predictiva es el siguiente gran paso para consolidar esta evidencia.</w:t>
       </w:r>
     </w:p>
     <w:p>
@@ -4525,7 +4551,7 @@
           <w:i/>
           <w:iCs/>
         </w:rPr>
-        <w:t xml:space="preserve">~1 minuto 10 segundos</w:t>
+        <w:t xml:space="preserve">~1 minuto 45 segundos</w:t>
       </w:r>
     </w:p>
     <w:p>
@@ -4536,7 +4562,7 @@
       </w:r>
     </w:p>
     <w:bookmarkEnd w:id="63"/>
-    <w:bookmarkStart w:id="64" w:name="Xbc5c3e3c77670c471ae0d2106bc136f31fae3c9"/>
+    <w:bookmarkStart w:id="64" w:name="Xa637efa289a6e9b7275e419c3dae2b0a477a301"/>
     <w:p>
       <w:pPr>
         <w:pStyle w:val="Heading2"/>
@@ -4548,12 +4574,30 @@
         <w:t xml:space="preserve"> </w:t>
       </w:r>
       <w:r>
-        <w:t xml:space="preserve">“El Rol de la Ancestría y la Confusión Ambiental en Diabetes”</w:t>
-      </w:r>
-    </w:p>
-    <w:p>
-      <w:pPr>
-        <w:pStyle w:val="FirstParagraph"/>
+        <w:t xml:space="preserve">“Diferencias significativas (FDR) y frecuencias alélicas”</w:t>
+      </w:r>
+    </w:p>
+    <w:p>
+      <w:pPr>
+        <w:pStyle w:val="FirstParagraph"/>
+      </w:pPr>
+      <w:r>
+        <w:rPr>
+          <w:b/>
+          <w:bCs/>
+        </w:rPr>
+        <w:t xml:space="preserve">[Contenido visual]:</w:t>
+      </w:r>
+      <w:r>
+        <w:t xml:space="preserve"> </w:t>
+      </w:r>
+      <w:r>
+        <w:t xml:space="preserve">Tabla con los SNPs que presentan diferencias de efecto significativas y sus frecuencias alélicas por ancestría.</w:t>
+      </w:r>
+    </w:p>
+    <w:p>
+      <w:pPr>
+        <w:pStyle w:val="BodyText"/>
       </w:pPr>
       <w:r>
         <w:rPr>
@@ -4568,32 +4612,7 @@
         <w:pStyle w:val="BlockText"/>
       </w:pPr>
       <w:r>
-        <w:t xml:space="preserve">Mención aparte merece la diabetes mellitus. Clínicamente es uno de los fenotipos con mayor impacto, pero metodológicamente es uno de los rasgos que exhibe mayores niveles de sesgo en estimaciones poblacionales.</w:t>
-      </w:r>
-    </w:p>
-    <w:p>
-      <w:pPr>
-        <w:pStyle w:val="BlockText"/>
-      </w:pPr>
-      <w:r>
-        <w:t xml:space="preserve">Trabajos recientes en nuestra misma cohorte, particularmente los estudios de Torres (2026) y Wang (2025), demuestran rigurosamente la contribución de la ancestría mexicana a las elevadas prevalencias de diabetes. Si bien el componente ancestral en la incidencia es innegable, nuestros análisis intrafamiliares demuestran empíricamente que existe una inflación sistemática en estimaciones poblacionales, identificando falsos positivos en</w:t>
-      </w:r>
-      <w:r>
-        <w:t xml:space="preserve"> </w:t>
-      </w:r>
-      <w:r>
-        <w:t xml:space="preserve"> </w:t>
-      </w:r>
-      <w:r>
-        <w:t xml:space="preserve">canónicos de diabetes.</w:t>
-      </w:r>
-    </w:p>
-    <w:p>
-      <w:pPr>
-        <w:pStyle w:val="BlockText"/>
-      </w:pPr>
-      <w:r>
-        <w:t xml:space="preserve">Esta evidencia expone que los efectos de composición ambiental están fuertemente entrelazados con la estructura genómica poblacional. Por consiguiente, se acentúa la urgencia metodológica de desarrollar instrumentos de mayor precisión estadística para detectar y estratificar el riesgo genético de diabetes en las poblaciones mexicanas, separando la señal biológica de los artefactos ambientales.</w:t>
+        <w:t xml:space="preserve">Para profundizar en estos hallazgos, analizamos específicamente los SNPs con diferencias significativas en un false discovery rate. Como observamos en esta tabla, al agregar la información de las frecuencias alélicas del MCPS, vemos claramente la distribución en individuos de ancestría indígena mexicana (IMX) frente a europea (EUR). Esto ilustra cómo la estructura poblacional puede inflar los efectos en loci que tradicionalmente asociábamos a fenotipos como la diabetes o niveles de colesterol.</w:t>
       </w:r>
     </w:p>
     <w:p>
@@ -4611,7 +4630,7 @@
           <w:i/>
           <w:iCs/>
         </w:rPr>
-        <w:t xml:space="preserve">~1 minuto</w:t>
+        <w:t xml:space="preserve">~45 segundos</w:t>
       </w:r>
     </w:p>
     <w:p>
@@ -4622,92 +4641,13 @@
       </w:r>
     </w:p>
     <w:bookmarkEnd w:id="64"/>
-    <w:bookmarkStart w:id="65" w:name="Xc88cdee71baa4f29e8d9be6a5337642f4833785"/>
+    <w:bookmarkStart w:id="65" w:name="slide-34-próximos-pasos"/>
     <w:p>
       <w:pPr>
         <w:pStyle w:val="Heading2"/>
       </w:pPr>
       <w:r>
         <w:t xml:space="preserve">SLIDE 34 —</w:t>
-      </w:r>
-      <w:r>
-        <w:t xml:space="preserve"> </w:t>
-      </w:r>
-      <w:r>
-        <w:t xml:space="preserve">“Diferencias significativas (FDR) y frecuencias alélicas”</w:t>
-      </w:r>
-    </w:p>
-    <w:p>
-      <w:pPr>
-        <w:pStyle w:val="FirstParagraph"/>
-      </w:pPr>
-      <w:r>
-        <w:rPr>
-          <w:b/>
-          <w:bCs/>
-        </w:rPr>
-        <w:t xml:space="preserve">[Contenido visual]:</w:t>
-      </w:r>
-      <w:r>
-        <w:t xml:space="preserve"> </w:t>
-      </w:r>
-      <w:r>
-        <w:t xml:space="preserve">Tabla con los SNPs que presentan diferencias de efecto significativas y sus frecuencias alélicas por ancestría.</w:t>
-      </w:r>
-    </w:p>
-    <w:p>
-      <w:pPr>
-        <w:pStyle w:val="BodyText"/>
-      </w:pPr>
-      <w:r>
-        <w:rPr>
-          <w:b/>
-          <w:bCs/>
-        </w:rPr>
-        <w:t xml:space="preserve">Guion:</w:t>
-      </w:r>
-    </w:p>
-    <w:p>
-      <w:pPr>
-        <w:pStyle w:val="BlockText"/>
-      </w:pPr>
-      <w:r>
-        <w:t xml:space="preserve">Para profundizar en estos hallazgos, analizamos específicamente los SNPs con diferencias significativas en un false discovery rate. Como observamos en esta tabla, al agregar la información de las frecuencias alélicas del MCPS, vemos claramente la distribución en individuos de ancestría indígena mexicana (IMX) frente a europea (EUR). Esto ilustra cómo la estructura poblacional puede inflar los efectos en loci que tradicionalmente asociábamos a fenotipos como la diabetes o niveles de colesterol.</w:t>
-      </w:r>
-    </w:p>
-    <w:p>
-      <w:pPr>
-        <w:pStyle w:val="FirstParagraph"/>
-      </w:pPr>
-      <w:r>
-        <w:t xml:space="preserve">⏱️</w:t>
-      </w:r>
-      <w:r>
-        <w:t xml:space="preserve"> </w:t>
-      </w:r>
-      <w:r>
-        <w:rPr>
-          <w:i/>
-          <w:iCs/>
-        </w:rPr>
-        <w:t xml:space="preserve">~45 segundos</w:t>
-      </w:r>
-    </w:p>
-    <w:p>
-      <w:r>
-        <w:pict>
-          <v:rect style="width:0;height:1.5pt" o:hralign="center" o:hrstd="t" o:hr="t"/>
-        </w:pict>
-      </w:r>
-    </w:p>
-    <w:bookmarkEnd w:id="65"/>
-    <w:bookmarkStart w:id="66" w:name="slide-35-próximos-pasos"/>
-    <w:p>
-      <w:pPr>
-        <w:pStyle w:val="Heading2"/>
-      </w:pPr>
-      <w:r>
-        <w:t xml:space="preserve">SLIDE 35 —</w:t>
       </w:r>
       <w:r>
         <w:t xml:space="preserve"> </w:t>
@@ -4887,9 +4827,9 @@
         </w:pict>
       </w:r>
     </w:p>
+    <w:bookmarkEnd w:id="65"/>
     <w:bookmarkEnd w:id="66"/>
-    <w:bookmarkEnd w:id="67"/>
-    <w:bookmarkStart w:id="70" w:name="X3b12542ebf4e4c269161f065ef64fb189d30203"/>
+    <w:bookmarkStart w:id="69" w:name="X3b12542ebf4e4c269161f065ef64fb189d30203"/>
     <w:p>
       <w:pPr>
         <w:pStyle w:val="Heading1"/>
@@ -4898,13 +4838,13 @@
         <w:t xml:space="preserve">SECCIÓN 8 — COLABORADORES Y AGRADECIMIENTOS</w:t>
       </w:r>
     </w:p>
-    <w:bookmarkStart w:id="68" w:name="slide-34-current-collaborations"/>
+    <w:bookmarkStart w:id="67" w:name="slide-35-current-collaborations"/>
     <w:p>
       <w:pPr>
         <w:pStyle w:val="Heading2"/>
       </w:pPr>
       <w:r>
-        <w:t xml:space="preserve">SLIDE 34 —</w:t>
+        <w:t xml:space="preserve">SLIDE 35 —</w:t>
       </w:r>
       <w:r>
         <w:t xml:space="preserve"> </w:t>
@@ -5008,14 +4948,14 @@
         </w:pict>
       </w:r>
     </w:p>
-    <w:bookmarkEnd w:id="68"/>
-    <w:bookmarkStart w:id="69" w:name="slide-35-gracias-a-todxs"/>
+    <w:bookmarkEnd w:id="67"/>
+    <w:bookmarkStart w:id="68" w:name="slide-36-gracias-a-todxs"/>
     <w:p>
       <w:pPr>
         <w:pStyle w:val="Heading2"/>
       </w:pPr>
       <w:r>
-        <w:t xml:space="preserve">SLIDE 35 —</w:t>
+        <w:t xml:space="preserve">SLIDE 36 —</w:t>
       </w:r>
       <w:r>
         <w:t xml:space="preserve"> </w:t>
@@ -5095,9 +5035,9 @@
         </w:pict>
       </w:r>
     </w:p>
+    <w:bookmarkEnd w:id="68"/>
     <w:bookmarkEnd w:id="69"/>
-    <w:bookmarkEnd w:id="70"/>
-    <w:bookmarkStart w:id="71" w:name="resumen-de-tiempos-estimados"/>
+    <w:bookmarkStart w:id="70" w:name="resumen-de-tiempos-estimados"/>
     <w:p>
       <w:pPr>
         <w:pStyle w:val="Heading1"/>
@@ -5665,8 +5605,8 @@
         </w:pict>
       </w:r>
     </w:p>
-    <w:bookmarkEnd w:id="71"/>
-    <w:bookmarkStart w:id="72" w:name="checklist-de-slides-por-completar"/>
+    <w:bookmarkEnd w:id="70"/>
+    <w:bookmarkStart w:id="71" w:name="checklist-de-slides-por-completar"/>
     <w:p>
       <w:pPr>
         <w:pStyle w:val="Heading1"/>
@@ -6089,7 +6029,7 @@
         <w:t xml:space="preserve">— Relevancia clínica</w:t>
       </w:r>
     </w:p>
-    <w:bookmarkEnd w:id="72"/>
+    <w:bookmarkEnd w:id="71"/>
     <w:sectPr>
       <w:footnotePr>
         <w:numRestart w:val="eachSect"/>

</xml_diff>

<commit_message>
2026-08-05 14:19:18: Restaurar y separar diapositivas de conclusiones a viñetas con ejemplos y reordenar el guion
</commit_message>
<xml_diff>
--- a/guion-examen-candidatura.docx
+++ b/guion-examen-candidatura.docx
@@ -4450,7 +4450,7 @@
     </w:p>
     <w:bookmarkEnd w:id="61"/>
     <w:bookmarkEnd w:id="62"/>
-    <w:bookmarkStart w:id="66" w:name="sección-7-conclusiones-y-próximos-pasos"/>
+    <w:bookmarkStart w:id="67" w:name="sección-7-conclusiones-y-próximos-pasos"/>
     <w:p>
       <w:pPr>
         <w:pStyle w:val="Heading1"/>
@@ -4459,19 +4459,19 @@
         <w:t xml:space="preserve">SECCIÓN 7 — CONCLUSIONES Y PRÓXIMOS PASOS</w:t>
       </w:r>
     </w:p>
-    <w:bookmarkStart w:id="63" w:name="X6b1db0ca94fd25b3d5af4d1b7b694708e5eb5e6"/>
+    <w:bookmarkStart w:id="63" w:name="X60a00895dc6bd69e9dcc7e296fe191f3249379c"/>
     <w:p>
       <w:pPr>
         <w:pStyle w:val="Heading2"/>
       </w:pPr>
       <w:r>
-        <w:t xml:space="preserve">SLIDE 32 —</w:t>
-      </w:r>
-      <w:r>
-        <w:t xml:space="preserve"> </w:t>
-      </w:r>
-      <w:r>
-        <w:t xml:space="preserve">“Conclusiones: Relevancia de los Modelos Familiares”</w:t>
+        <w:t xml:space="preserve">SLIDE 31 —</w:t>
+      </w:r>
+      <w:r>
+        <w:t xml:space="preserve"> </w:t>
+      </w:r>
+      <w:r>
+        <w:t xml:space="preserve">“Diferencias significativas (FDR) y frecuencias alélicas”</w:t>
       </w:r>
     </w:p>
     <w:p>
@@ -4489,7 +4489,7 @@
         <w:t xml:space="preserve"> </w:t>
       </w:r>
       <w:r>
-        <w:t xml:space="preserve">Viñetas resumiendo (1) Diagnóstico de Sesgos, (2) Poder Estadístico en MCPS, y (3) Predicción de Riesgo, con sub-viñetas ejemplificando nuestros resultados en diabetes, tamaño de muestra y PRS.</w:t>
+        <w:t xml:space="preserve">Tabla con los SNPs que presentan diferencias de efecto significativas y sus frecuencias alélicas por ancestría.</w:t>
       </w:r>
     </w:p>
     <w:p>
@@ -4509,39 +4509,7 @@
         <w:pStyle w:val="BlockText"/>
       </w:pPr>
       <w:r>
-        <w:t xml:space="preserve">Para concluir, agrupamos la relevancia de nuestros modelos familiares en tres puntos clave.</w:t>
-      </w:r>
-    </w:p>
-    <w:p>
-      <w:pPr>
-        <w:pStyle w:val="BlockText"/>
-      </w:pPr>
-      <w:r>
-        <w:t xml:space="preserve">En primer lugar, es crucial comprender que los GWAS familiares operan como herramientas diagnósticas. Como ejemplo destacado, en diabetes mellitus —un fenotipo con alto sesgo poblacional y fuertemente ligado a la ancestría según reportes recientes— logramos identificar falsos positivos en loci canónicos que estaban impulsados meramente por confusión ambiental.</w:t>
-      </w:r>
-    </w:p>
-    <w:p>
-      <w:pPr>
-        <w:pStyle w:val="BlockText"/>
-      </w:pPr>
-      <w:r>
-        <w:t xml:space="preserve">En segundo lugar, al implementar el estimador robusto, logramos incrementar nuestro poder estadístico con un tamaño de muestra aproximadamente 36% mayor que los diseños clásicos. Esto nos permitió constatar fehacientemente la existencia de dichos sesgos estructurales sin perder información valiosa.</w:t>
-      </w:r>
-    </w:p>
-    <w:p>
-      <w:pPr>
-        <w:pStyle w:val="BlockText"/>
-      </w:pPr>
-      <w:r>
-        <w:t xml:space="preserve">Finalmente, de cara al futuro, resulta imperativo desarrollar herramientas de predicción más precisas para México. Evaluar empíricamente si los scores poligénicos derivados de estimaciones familiares mejoran nuestra precisión predictiva es el siguiente gran paso para consolidar esta evidencia.</w:t>
-      </w:r>
-    </w:p>
-    <w:p>
-      <w:pPr>
-        <w:pStyle w:val="FirstParagraph"/>
-      </w:pPr>
-      <w:r>
-        <w:t xml:space="preserve">⏱️</w:t>
+        <w:t xml:space="preserve">Para profundizar en estos hallazgos, analizamos específicamente los SNPs con diferencias significativas bajo un</w:t>
       </w:r>
       <w:r>
         <w:t xml:space="preserve"> </w:t>
@@ -4551,7 +4519,28 @@
           <w:i/>
           <w:iCs/>
         </w:rPr>
-        <w:t xml:space="preserve">~1 minuto 45 segundos</w:t>
+        <w:t xml:space="preserve">false discovery rate</w:t>
+      </w:r>
+      <w:r>
+        <w:t xml:space="preserve">. Como observamos en esta tabla al comparar los GWAS poblacionales y familiares, al agregar la información de las frecuencias alélicas del MCPS vemos claramente la distribución en individuos de ancestría indígena mexicana (IMX) frente a europea (EUR). Esto ilustra cómo la estructura poblacional puede inflar los efectos en loci que tradicionalmente asociábamos a fenotipos como la diabetes o niveles de colesterol.</w:t>
+      </w:r>
+    </w:p>
+    <w:p>
+      <w:pPr>
+        <w:pStyle w:val="FirstParagraph"/>
+      </w:pPr>
+      <w:r>
+        <w:t xml:space="preserve">⏱️</w:t>
+      </w:r>
+      <w:r>
+        <w:t xml:space="preserve"> </w:t>
+      </w:r>
+      <w:r>
+        <w:rPr>
+          <w:i/>
+          <w:iCs/>
+        </w:rPr>
+        <w:t xml:space="preserve">~45 segundos</w:t>
       </w:r>
     </w:p>
     <w:p>
@@ -4562,19 +4551,19 @@
       </w:r>
     </w:p>
     <w:bookmarkEnd w:id="63"/>
-    <w:bookmarkStart w:id="64" w:name="Xa637efa289a6e9b7275e419c3dae2b0a477a301"/>
+    <w:bookmarkStart w:id="64" w:name="X6b1db0ca94fd25b3d5af4d1b7b694708e5eb5e6"/>
     <w:p>
       <w:pPr>
         <w:pStyle w:val="Heading2"/>
       </w:pPr>
       <w:r>
-        <w:t xml:space="preserve">SLIDE 33 —</w:t>
-      </w:r>
-      <w:r>
-        <w:t xml:space="preserve"> </w:t>
-      </w:r>
-      <w:r>
-        <w:t xml:space="preserve">“Diferencias significativas (FDR) y frecuencias alélicas”</w:t>
+        <w:t xml:space="preserve">SLIDE 32 —</w:t>
+      </w:r>
+      <w:r>
+        <w:t xml:space="preserve"> </w:t>
+      </w:r>
+      <w:r>
+        <w:t xml:space="preserve">“Conclusiones: Relevancia de los Modelos Familiares”</w:t>
       </w:r>
     </w:p>
     <w:p>
@@ -4592,7 +4581,7 @@
         <w:t xml:space="preserve"> </w:t>
       </w:r>
       <w:r>
-        <w:t xml:space="preserve">Tabla con los SNPs que presentan diferencias de efecto significativas y sus frecuencias alélicas por ancestría.</w:t>
+        <w:t xml:space="preserve">Viñetas resumiendo (1) Diagnóstico de Sesgos, (2) Poder Estadístico en MCPS, y (3) Predicción de Riesgo.</w:t>
       </w:r>
     </w:p>
     <w:p>
@@ -4612,7 +4601,31 @@
         <w:pStyle w:val="BlockText"/>
       </w:pPr>
       <w:r>
-        <w:t xml:space="preserve">Para profundizar en estos hallazgos, analizamos específicamente los SNPs con diferencias significativas en un false discovery rate. Como observamos en esta tabla, al agregar la información de las frecuencias alélicas del MCPS, vemos claramente la distribución en individuos de ancestría indígena mexicana (IMX) frente a europea (EUR). Esto ilustra cómo la estructura poblacional puede inflar los efectos en loci que tradicionalmente asociábamos a fenotipos como la diabetes o niveles de colesterol.</w:t>
+        <w:t xml:space="preserve">Para concluir, agrupamos la relevancia de nuestros modelos familiares en tres puntos clave.</w:t>
+      </w:r>
+    </w:p>
+    <w:p>
+      <w:pPr>
+        <w:pStyle w:val="BlockText"/>
+      </w:pPr>
+      <w:r>
+        <w:t xml:space="preserve">En primer lugar, los GWAS familiares operan primordialmente como herramientas diagnósticas, permitiéndonos determinar la dirección y magnitud de los sesgos presentes en diseños de descubrimiento de mayor poder estadístico.</w:t>
+      </w:r>
+    </w:p>
+    <w:p>
+      <w:pPr>
+        <w:pStyle w:val="BlockText"/>
+      </w:pPr>
+      <w:r>
+        <w:t xml:space="preserve">En segundo lugar, al implementar el estimador robusto, logramos incrementar nuestro poder estadístico con un tamaño de muestra eficientemente mayor. Esto nos permitió constatar fehacientemente la existencia de sesgos ambientales en la cohorte sin perder el rigor metodológico.</w:t>
+      </w:r>
+    </w:p>
+    <w:p>
+      <w:pPr>
+        <w:pStyle w:val="BlockText"/>
+      </w:pPr>
+      <w:r>
+        <w:t xml:space="preserve">Finalmente, a nivel predictivo, carecemos de evidencia empírica robusta en poblaciones latinoamericanas, por lo que evaluar si estos modelos familiares mejoran la predicción de scores poligénicos en México será nuestro próximo paso crítico para consolidar la evidencia.</w:t>
       </w:r>
     </w:p>
     <w:p>
@@ -4630,7 +4643,7 @@
           <w:i/>
           <w:iCs/>
         </w:rPr>
-        <w:t xml:space="preserve">~45 segundos</w:t>
+        <w:t xml:space="preserve">~1 minuto 10 segundos</w:t>
       </w:r>
     </w:p>
     <w:p>
@@ -4641,7 +4654,120 @@
       </w:r>
     </w:p>
     <w:bookmarkEnd w:id="64"/>
-    <w:bookmarkStart w:id="65" w:name="slide-34-próximos-pasos"/>
+    <w:bookmarkStart w:id="65" w:name="Xdcb3609934bb91c4ef2702692f8f5fccc83990f"/>
+    <w:p>
+      <w:pPr>
+        <w:pStyle w:val="Heading2"/>
+      </w:pPr>
+      <w:r>
+        <w:t xml:space="preserve">SLIDE 33 —</w:t>
+      </w:r>
+      <w:r>
+        <w:t xml:space="preserve"> </w:t>
+      </w:r>
+      <w:r>
+        <w:t xml:space="preserve">“Ancestría y Confusión Ambiental en Diabetes”</w:t>
+      </w:r>
+    </w:p>
+    <w:p>
+      <w:pPr>
+        <w:pStyle w:val="FirstParagraph"/>
+      </w:pPr>
+      <w:r>
+        <w:rPr>
+          <w:b/>
+          <w:bCs/>
+        </w:rPr>
+        <w:t xml:space="preserve">[Contenido visual]:</w:t>
+      </w:r>
+      <w:r>
+        <w:t xml:space="preserve"> </w:t>
+      </w:r>
+      <w:r>
+        <w:t xml:space="preserve">Viñetas enfocadas en diabetes y ancestría, con una sub-viñeta enfatizando el ejemplo de falsos positivos en</w:t>
+      </w:r>
+      <w:r>
+        <w:t xml:space="preserve"> </w:t>
+      </w:r>
+      <w:r>
+        <w:t xml:space="preserve"> </w:t>
+      </w:r>
+      <w:r>
+        <w:t xml:space="preserve">canónicos como CDKAL1 y CDKN2B vistos en los resultados.</w:t>
+      </w:r>
+    </w:p>
+    <w:p>
+      <w:pPr>
+        <w:pStyle w:val="BodyText"/>
+      </w:pPr>
+      <w:r>
+        <w:rPr>
+          <w:b/>
+          <w:bCs/>
+        </w:rPr>
+        <w:t xml:space="preserve">Guion:</w:t>
+      </w:r>
+    </w:p>
+    <w:p>
+      <w:pPr>
+        <w:pStyle w:val="BlockText"/>
+      </w:pPr>
+      <w:r>
+        <w:t xml:space="preserve">Mención especial merece la diabetes mellitus. Clínicamente es uno de los fenotipos de mayor impacto, pero metodológicamente es un rasgo con altísimos niveles de sesgo poblacional.</w:t>
+      </w:r>
+    </w:p>
+    <w:p>
+      <w:pPr>
+        <w:pStyle w:val="BlockText"/>
+      </w:pPr>
+      <w:r>
+        <w:t xml:space="preserve">Estudios recientes en nuestra cohorte demuestran la fuerte contribución de la ancestría mexicana a la prevalencia de diabetes. Sin embargo, tal como vimos en el recordatorio de nuestros resultados (para genes como CDKAL1, CDKN2B y CDC123), los estimadores intrafamiliares identifican atenuaciones masivas que confirman la presencia de falsos positivos en</w:t>
+      </w:r>
+      <w:r>
+        <w:t xml:space="preserve"> </w:t>
+      </w:r>
+      <w:r>
+        <w:t xml:space="preserve"> </w:t>
+      </w:r>
+      <w:r>
+        <w:t xml:space="preserve">canónicos.</w:t>
+      </w:r>
+    </w:p>
+    <w:p>
+      <w:pPr>
+        <w:pStyle w:val="BlockText"/>
+      </w:pPr>
+      <w:r>
+        <w:t xml:space="preserve">Esta evidencia subraya que los efectos de composición ambiental están fuertemente ligados a la estructura poblacional, acentuando la urgencia metodológica de desarrollar herramientas genómicas de mayor precisión adaptadas a nuestro país.</w:t>
+      </w:r>
+    </w:p>
+    <w:p>
+      <w:pPr>
+        <w:pStyle w:val="FirstParagraph"/>
+      </w:pPr>
+      <w:r>
+        <w:t xml:space="preserve">⏱️</w:t>
+      </w:r>
+      <w:r>
+        <w:t xml:space="preserve"> </w:t>
+      </w:r>
+      <w:r>
+        <w:rPr>
+          <w:i/>
+          <w:iCs/>
+        </w:rPr>
+        <w:t xml:space="preserve">~1 minuto</w:t>
+      </w:r>
+    </w:p>
+    <w:p>
+      <w:r>
+        <w:pict>
+          <v:rect style="width:0;height:1.5pt" o:hralign="center" o:hrstd="t" o:hr="t"/>
+        </w:pict>
+      </w:r>
+    </w:p>
+    <w:bookmarkEnd w:id="65"/>
+    <w:bookmarkStart w:id="66" w:name="slide-34-próximos-pasos"/>
     <w:p>
       <w:pPr>
         <w:pStyle w:val="Heading2"/>
@@ -4827,9 +4953,9 @@
         </w:pict>
       </w:r>
     </w:p>
-    <w:bookmarkEnd w:id="65"/>
     <w:bookmarkEnd w:id="66"/>
-    <w:bookmarkStart w:id="69" w:name="X3b12542ebf4e4c269161f065ef64fb189d30203"/>
+    <w:bookmarkEnd w:id="67"/>
+    <w:bookmarkStart w:id="70" w:name="X3b12542ebf4e4c269161f065ef64fb189d30203"/>
     <w:p>
       <w:pPr>
         <w:pStyle w:val="Heading1"/>
@@ -4838,7 +4964,7 @@
         <w:t xml:space="preserve">SECCIÓN 8 — COLABORADORES Y AGRADECIMIENTOS</w:t>
       </w:r>
     </w:p>
-    <w:bookmarkStart w:id="67" w:name="slide-35-current-collaborations"/>
+    <w:bookmarkStart w:id="68" w:name="slide-35-current-collaborations"/>
     <w:p>
       <w:pPr>
         <w:pStyle w:val="Heading2"/>
@@ -4948,8 +5074,8 @@
         </w:pict>
       </w:r>
     </w:p>
-    <w:bookmarkEnd w:id="67"/>
-    <w:bookmarkStart w:id="68" w:name="slide-36-gracias-a-todxs"/>
+    <w:bookmarkEnd w:id="68"/>
+    <w:bookmarkStart w:id="69" w:name="slide-36-gracias-a-todxs"/>
     <w:p>
       <w:pPr>
         <w:pStyle w:val="Heading2"/>
@@ -5035,9 +5161,9 @@
         </w:pict>
       </w:r>
     </w:p>
-    <w:bookmarkEnd w:id="68"/>
     <w:bookmarkEnd w:id="69"/>
-    <w:bookmarkStart w:id="70" w:name="resumen-de-tiempos-estimados"/>
+    <w:bookmarkEnd w:id="70"/>
+    <w:bookmarkStart w:id="71" w:name="resumen-de-tiempos-estimados"/>
     <w:p>
       <w:pPr>
         <w:pStyle w:val="Heading1"/>
@@ -5605,8 +5731,8 @@
         </w:pict>
       </w:r>
     </w:p>
-    <w:bookmarkEnd w:id="70"/>
-    <w:bookmarkStart w:id="71" w:name="checklist-de-slides-por-completar"/>
+    <w:bookmarkEnd w:id="71"/>
+    <w:bookmarkStart w:id="72" w:name="checklist-de-slides-por-completar"/>
     <w:p>
       <w:pPr>
         <w:pStyle w:val="Heading1"/>
@@ -6029,7 +6155,7 @@
         <w:t xml:space="preserve">— Relevancia clínica</w:t>
       </w:r>
     </w:p>
-    <w:bookmarkEnd w:id="71"/>
+    <w:bookmarkEnd w:id="72"/>
     <w:sectPr>
       <w:footnotePr>
         <w:numRestart w:val="eachSect"/>

</xml_diff>